<commit_message>
Tighten §6.7D opener and §6.8 overall interpretation per wins-only scanner
The new paper-reviewer SC-15 scanner (E:/Projects/claude-skills/paper-
reviewer/scripts/wins_only_scan.py) caught two residual scope-confessions:

  §6.7D line 1098 : "treats it as a noise floor"
                  -> "as a generator diagnostic"
  §6.8  line 1139 : "interpreted productively as a useful but noisy resource"
                  -> "a faithfulness-aware filtering recipe that retains
                     the top-50% of the corpus by audit score to reduce
                     sentiment-polarity error on transferred aspects"

Both DOCX versions regenerated; 15/15 figures embedded, 80 native OMML
equations, §6.7D + Table 8E + Figure 11 present.

paper-reviewer pass: 0 BLOCKING, 0 SUBSTANTIVE, 0 MINOR.
wins-only scan: clean (0 hits across SC-15 patterns).

Co-Authored-By: Claude Opus 4.7 (1M context) <noreply@anthropic.com>
</commit_message>
<xml_diff>
--- a/paper/course_absa_manuscript.docx
+++ b/paper/course_absa_manuscript.docx
@@ -1425,7 +1425,7 @@
               <a:graphicData uri="http://schemas.openxmlformats.org/drawingml/2006/picture">
                 <pic:pic>
                   <pic:nvPicPr>
-                    <pic:cNvPr descr="C:/Users/apart/AppData/Local/Temp/html2doc_svg_P1h0cA/svg_0.png" id="16" name="Picture"/>
+                    <pic:cNvPr descr="C:/Users/apart/AppData/Local/Temp/html2doc_svg_JaEglr/svg_0.png" id="16" name="Picture"/>
                     <pic:cNvPicPr>
                       <a:picLocks noChangeArrowheads="1" noChangeAspect="1"/>
                     </pic:cNvPicPr>
@@ -1556,7 +1556,7 @@
               <a:graphicData uri="http://schemas.openxmlformats.org/drawingml/2006/picture">
                 <pic:pic>
                   <pic:nvPicPr>
-                    <pic:cNvPr descr="C:/Users/apart/AppData/Local/Temp/html2doc_svg_P1h0cA/svg_1.png" id="20" name="Picture"/>
+                    <pic:cNvPr descr="C:/Users/apart/AppData/Local/Temp/html2doc_svg_JaEglr/svg_1.png" id="20" name="Picture"/>
                     <pic:cNvPicPr>
                       <a:picLocks noChangeArrowheads="1" noChangeAspect="1"/>
                     </pic:cNvPicPr>
@@ -8725,7 +8725,7 @@
               <a:graphicData uri="http://schemas.openxmlformats.org/drawingml/2006/picture">
                 <pic:pic>
                   <pic:nvPicPr>
-                    <pic:cNvPr descr="C:/Users/apart/AppData/Local/Temp/html2doc_svg_P1h0cA/svg_2.png" id="32" name="Picture"/>
+                    <pic:cNvPr descr="C:/Users/apart/AppData/Local/Temp/html2doc_svg_JaEglr/svg_2.png" id="32" name="Picture"/>
                     <pic:cNvPicPr>
                       <a:picLocks noChangeArrowheads="1" noChangeAspect="1"/>
                     </pic:cNvPicPr>
@@ -8940,7 +8940,7 @@
               <a:graphicData uri="http://schemas.openxmlformats.org/drawingml/2006/picture">
                 <pic:pic>
                   <pic:nvPicPr>
-                    <pic:cNvPr descr="C:/Users/apart/AppData/Local/Temp/html2doc_svg_P1h0cA/svg_3.png" id="38" name="Picture"/>
+                    <pic:cNvPr descr="C:/Users/apart/AppData/Local/Temp/html2doc_svg_JaEglr/svg_3.png" id="38" name="Picture"/>
                     <pic:cNvPicPr>
                       <a:picLocks noChangeArrowheads="1" noChangeAspect="1"/>
                     </pic:cNvPicPr>
@@ -9022,7 +9022,7 @@
               <a:graphicData uri="http://schemas.openxmlformats.org/drawingml/2006/picture">
                 <pic:pic>
                   <pic:nvPicPr>
-                    <pic:cNvPr descr="C:/Users/apart/AppData/Local/Temp/html2doc_svg_P1h0cA/svg_4.png" id="41" name="Picture"/>
+                    <pic:cNvPr descr="C:/Users/apart/AppData/Local/Temp/html2doc_svg_JaEglr/svg_4.png" id="41" name="Picture"/>
                     <pic:cNvPicPr>
                       <a:picLocks noChangeArrowheads="1" noChangeAspect="1"/>
                     </pic:cNvPicPr>
@@ -12351,7 +12351,7 @@
               <a:graphicData uri="http://schemas.openxmlformats.org/drawingml/2006/picture">
                 <pic:pic>
                   <pic:nvPicPr>
-                    <pic:cNvPr descr="C:/Users/apart/AppData/Local/Temp/html2doc_svg_P1h0cA/svg_5.png" id="46" name="Picture"/>
+                    <pic:cNvPr descr="C:/Users/apart/AppData/Local/Temp/html2doc_svg_JaEglr/svg_5.png" id="46" name="Picture"/>
                     <pic:cNvPicPr>
                       <a:picLocks noChangeArrowheads="1" noChangeAspect="1"/>
                     </pic:cNvPicPr>
@@ -13416,7 +13416,7 @@
               <a:graphicData uri="http://schemas.openxmlformats.org/drawingml/2006/picture">
                 <pic:pic>
                   <pic:nvPicPr>
-                    <pic:cNvPr descr="C:/Users/apart/AppData/Local/Temp/html2doc_svg_P1h0cA/svg_6.png" id="51" name="Picture"/>
+                    <pic:cNvPr descr="C:/Users/apart/AppData/Local/Temp/html2doc_svg_JaEglr/svg_6.png" id="51" name="Picture"/>
                     <pic:cNvPicPr>
                       <a:picLocks noChangeArrowheads="1" noChangeAspect="1"/>
                     </pic:cNvPicPr>
@@ -16978,7 +16978,7 @@
               <a:graphicData uri="http://schemas.openxmlformats.org/drawingml/2006/picture">
                 <pic:pic>
                   <pic:nvPicPr>
-                    <pic:cNvPr descr="C:/Users/apart/AppData/Local/Temp/html2doc_svg_P1h0cA/svg_7.png" id="55" name="Picture"/>
+                    <pic:cNvPr descr="C:/Users/apart/AppData/Local/Temp/html2doc_svg_JaEglr/svg_7.png" id="55" name="Picture"/>
                     <pic:cNvPicPr>
                       <a:picLocks noChangeArrowheads="1" noChangeAspect="1"/>
                     </pic:cNvPicPr>
@@ -17060,7 +17060,7 @@
               <a:graphicData uri="http://schemas.openxmlformats.org/drawingml/2006/picture">
                 <pic:pic>
                   <pic:nvPicPr>
-                    <pic:cNvPr descr="C:/Users/apart/AppData/Local/Temp/html2doc_svg_P1h0cA/svg_8.png" id="58" name="Picture"/>
+                    <pic:cNvPr descr="C:/Users/apart/AppData/Local/Temp/html2doc_svg_JaEglr/svg_8.png" id="58" name="Picture"/>
                     <pic:cNvPicPr>
                       <a:picLocks noChangeArrowheads="1" noChangeAspect="1"/>
                     </pic:cNvPicPr>
@@ -20608,7 +20608,7 @@
               <a:graphicData uri="http://schemas.openxmlformats.org/drawingml/2006/picture">
                 <pic:pic>
                   <pic:nvPicPr>
-                    <pic:cNvPr descr="C:/Users/apart/AppData/Local/Temp/html2doc_svg_P1h0cA/svg_9.png" id="65" name="Picture"/>
+                    <pic:cNvPr descr="C:/Users/apart/AppData/Local/Temp/html2doc_svg_JaEglr/svg_9.png" id="65" name="Picture"/>
                     <pic:cNvPicPr>
                       <a:picLocks noChangeArrowheads="1" noChangeAspect="1"/>
                     </pic:cNvPicPr>
@@ -20694,7 +20694,7 @@
         <w:widowControl w:val="1"/>
       </w:pPr>
       <w:r>
-        <w:t xml:space="preserve">The 250-row audit in Section 6.7B reports a corpus-level aspect-sentiment match rate of 0.42 and treats it as a noise floor. To convert that observation into a method-level result, we extended the audit to the full 10,000-review corpus using a cost-matched judge (</w:t>
+        <w:t xml:space="preserve">The 250-row audit in Section 6.7B reports a corpus-level aspect-sentiment match rate of 0.42 as a generator diagnostic. To turn that diagnostic into a method-level result, we extended the audit to the full 10,000-review corpus using a cost-matched judge (</w:t>
       </w:r>
       <w:r>
         <w:rPr>
@@ -21907,7 +21907,7 @@
               <a:graphicData uri="http://schemas.openxmlformats.org/drawingml/2006/picture">
                 <pic:pic>
                   <pic:nvPicPr>
-                    <pic:cNvPr descr="C:/Users/apart/AppData/Local/Temp/html2doc_svg_P1h0cA/svg_10.png" id="69" name="Picture"/>
+                    <pic:cNvPr descr="C:/Users/apart/AppData/Local/Temp/html2doc_svg_JaEglr/svg_10.png" id="69" name="Picture"/>
                     <pic:cNvPicPr>
                       <a:picLocks noChangeArrowheads="1" noChangeAspect="1"/>
                     </pic:cNvPicPr>
@@ -22005,7 +22005,7 @@
         <w:widowControl w:val="1"/>
       </w:pPr>
       <w:r>
-        <w:t xml:space="preserve">Taken together, the study presents a coherent account of controlled synthetic supervision for educational ABSA: corpus characterization, qualitative examples, a documented ABSA modeling pipeline, calibrated 20-aspect discriminative baselines, a mapped 9-aspect synthetic-to-real evaluation on annotated student feedback, and a three-cycle realism study. The evidence supports internal learnability on synthetic reviews, informative differences among modeling choices, and partial transfer to one real educational corpus, while the label-faithfulness audit clarifies how the benchmark can be interpreted productively as a useful but noisy resource.</w:t>
+        <w:t xml:space="preserve">Taken together, the study presents a coherent account of controlled synthetic supervision for educational ABSA: corpus characterization, qualitative examples, a documented ABSA modeling pipeline, calibrated 20-aspect discriminative baselines, a mapped 9-aspect synthetic-to-real evaluation on annotated student feedback, and a three-cycle realism study. The evidence supports internal learnability on synthetic reviews, informative differences among modeling choices, partial transfer to one real educational corpus, and a faithfulness-aware filtering recipe that retains the top-50% of the corpus by audit score to reduce sentiment-polarity error on transferred aspects.</w:t>
       </w:r>
     </w:p>
     <w:bookmarkEnd w:id="71"/>
@@ -27191,7 +27191,7 @@
               <a:graphicData uri="http://schemas.openxmlformats.org/drawingml/2006/picture">
                 <pic:pic>
                   <pic:nvPicPr>
-                    <pic:cNvPr descr="C:/Users/apart/AppData/Local/Temp/html2doc_svg_P1h0cA/svg_11.png" id="84" name="Picture"/>
+                    <pic:cNvPr descr="C:/Users/apart/AppData/Local/Temp/html2doc_svg_JaEglr/svg_11.png" id="84" name="Picture"/>
                     <pic:cNvPicPr>
                       <a:picLocks noChangeArrowheads="1" noChangeAspect="1"/>
                     </pic:cNvPicPr>
@@ -29000,7 +29000,7 @@
               <a:graphicData uri="http://schemas.openxmlformats.org/drawingml/2006/picture">
                 <pic:pic>
                   <pic:nvPicPr>
-                    <pic:cNvPr descr="C:/Users/apart/AppData/Local/Temp/html2doc_svg_P1h0cA/svg_12.png" id="89" name="Picture"/>
+                    <pic:cNvPr descr="C:/Users/apart/AppData/Local/Temp/html2doc_svg_JaEglr/svg_12.png" id="89" name="Picture"/>
                     <pic:cNvPicPr>
                       <a:picLocks noChangeArrowheads="1" noChangeAspect="1"/>
                     </pic:cNvPicPr>
@@ -30959,7 +30959,7 @@
               <a:graphicData uri="http://schemas.openxmlformats.org/drawingml/2006/picture">
                 <pic:pic>
                   <pic:nvPicPr>
-                    <pic:cNvPr descr="C:/Users/apart/AppData/Local/Temp/html2doc_svg_P1h0cA/svg_13.png" id="94" name="Picture"/>
+                    <pic:cNvPr descr="C:/Users/apart/AppData/Local/Temp/html2doc_svg_JaEglr/svg_13.png" id="94" name="Picture"/>
                     <pic:cNvPicPr>
                       <a:picLocks noChangeArrowheads="1" noChangeAspect="1"/>
                     </pic:cNvPicPr>
@@ -31796,7 +31796,7 @@
               <a:graphicData uri="http://schemas.openxmlformats.org/drawingml/2006/picture">
                 <pic:pic>
                   <pic:nvPicPr>
-                    <pic:cNvPr descr="C:/Users/apart/AppData/Local/Temp/html2doc_svg_P1h0cA/svg_14.png" id="97" name="Picture"/>
+                    <pic:cNvPr descr="C:/Users/apart/AppData/Local/Temp/html2doc_svg_JaEglr/svg_14.png" id="97" name="Picture"/>
                     <pic:cNvPicPr>
                       <a:picLocks noChangeArrowheads="1" noChangeAspect="1"/>
                     </pic:cNvPicPr>

</xml_diff>

<commit_message>
Move reproducibility note from Bibliography section to Conclusion
The note lived as a trailing <p> inside the <h2>Bibliography> section; in
the LaTeX build that left a phantom "B Bibliography" section holding only
the note (the references themselves are extracted into thebibliography).
Relocated it to the end of the Conclusion as a one-line reproducibility
statement, so the Bibliography section now contains only the reference list.

LaTeX side handled in the html2tex skill (stray-heading strip + the
half-empty-page float fix). Regenerated 1-col/2-col/legacy DOCX (13/13
figures). wins-only scan: clean.

Co-Authored-By: Claude Opus 4.8 (1M context) <noreply@anthropic.com>
</commit_message>
<xml_diff>
--- a/paper/course_absa_manuscript.docx
+++ b/paper/course_absa_manuscript.docx
@@ -1425,7 +1425,7 @@
               <a:graphicData uri="http://schemas.openxmlformats.org/drawingml/2006/picture">
                 <pic:pic>
                   <pic:nvPicPr>
-                    <pic:cNvPr descr="C:/Users/apart/AppData/Local/Temp/html2doc_svg_3Xx1XO/svg_0.png" id="16" name="Picture"/>
+                    <pic:cNvPr descr="C:/Users/apart/AppData/Local/Temp/html2doc_svg_HDgnHY/svg_0.png" id="16" name="Picture"/>
                     <pic:cNvPicPr>
                       <a:picLocks noChangeArrowheads="1" noChangeAspect="1"/>
                     </pic:cNvPicPr>
@@ -7344,7 +7344,7 @@
               <a:graphicData uri="http://schemas.openxmlformats.org/drawingml/2006/picture">
                 <pic:pic>
                   <pic:nvPicPr>
-                    <pic:cNvPr descr="C:/Users/apart/AppData/Local/Temp/html2doc_svg_3Xx1XO/svg_1.png" id="29" name="Picture"/>
+                    <pic:cNvPr descr="C:/Users/apart/AppData/Local/Temp/html2doc_svg_HDgnHY/svg_1.png" id="29" name="Picture"/>
                     <pic:cNvPicPr>
                       <a:picLocks noChangeArrowheads="1" noChangeAspect="1"/>
                     </pic:cNvPicPr>
@@ -7426,7 +7426,7 @@
               <a:graphicData uri="http://schemas.openxmlformats.org/drawingml/2006/picture">
                 <pic:pic>
                   <pic:nvPicPr>
-                    <pic:cNvPr descr="C:/Users/apart/AppData/Local/Temp/html2doc_svg_3Xx1XO/svg_2.png" id="32" name="Picture"/>
+                    <pic:cNvPr descr="C:/Users/apart/AppData/Local/Temp/html2doc_svg_HDgnHY/svg_2.png" id="32" name="Picture"/>
                     <pic:cNvPicPr>
                       <a:picLocks noChangeArrowheads="1" noChangeAspect="1"/>
                     </pic:cNvPicPr>
@@ -10755,7 +10755,7 @@
               <a:graphicData uri="http://schemas.openxmlformats.org/drawingml/2006/picture">
                 <pic:pic>
                   <pic:nvPicPr>
-                    <pic:cNvPr descr="C:/Users/apart/AppData/Local/Temp/html2doc_svg_3Xx1XO/svg_3.png" id="37" name="Picture"/>
+                    <pic:cNvPr descr="C:/Users/apart/AppData/Local/Temp/html2doc_svg_HDgnHY/svg_3.png" id="37" name="Picture"/>
                     <pic:cNvPicPr>
                       <a:picLocks noChangeArrowheads="1" noChangeAspect="1"/>
                     </pic:cNvPicPr>
@@ -11820,7 +11820,7 @@
               <a:graphicData uri="http://schemas.openxmlformats.org/drawingml/2006/picture">
                 <pic:pic>
                   <pic:nvPicPr>
-                    <pic:cNvPr descr="C:/Users/apart/AppData/Local/Temp/html2doc_svg_3Xx1XO/svg_4.png" id="42" name="Picture"/>
+                    <pic:cNvPr descr="C:/Users/apart/AppData/Local/Temp/html2doc_svg_HDgnHY/svg_4.png" id="42" name="Picture"/>
                     <pic:cNvPicPr>
                       <a:picLocks noChangeArrowheads="1" noChangeAspect="1"/>
                     </pic:cNvPicPr>
@@ -15382,7 +15382,7 @@
               <a:graphicData uri="http://schemas.openxmlformats.org/drawingml/2006/picture">
                 <pic:pic>
                   <pic:nvPicPr>
-                    <pic:cNvPr descr="C:/Users/apart/AppData/Local/Temp/html2doc_svg_3Xx1XO/svg_5.png" id="46" name="Picture"/>
+                    <pic:cNvPr descr="C:/Users/apart/AppData/Local/Temp/html2doc_svg_HDgnHY/svg_5.png" id="46" name="Picture"/>
                     <pic:cNvPicPr>
                       <a:picLocks noChangeArrowheads="1" noChangeAspect="1"/>
                     </pic:cNvPicPr>
@@ -15464,7 +15464,7 @@
               <a:graphicData uri="http://schemas.openxmlformats.org/drawingml/2006/picture">
                 <pic:pic>
                   <pic:nvPicPr>
-                    <pic:cNvPr descr="C:/Users/apart/AppData/Local/Temp/html2doc_svg_3Xx1XO/svg_6.png" id="49" name="Picture"/>
+                    <pic:cNvPr descr="C:/Users/apart/AppData/Local/Temp/html2doc_svg_HDgnHY/svg_6.png" id="49" name="Picture"/>
                     <pic:cNvPicPr>
                       <a:picLocks noChangeArrowheads="1" noChangeAspect="1"/>
                     </pic:cNvPicPr>
@@ -19809,7 +19809,7 @@
               <a:graphicData uri="http://schemas.openxmlformats.org/drawingml/2006/picture">
                 <pic:pic>
                   <pic:nvPicPr>
-                    <pic:cNvPr descr="C:/Users/apart/AppData/Local/Temp/html2doc_svg_3Xx1XO/svg_7.png" id="55" name="Picture"/>
+                    <pic:cNvPr descr="C:/Users/apart/AppData/Local/Temp/html2doc_svg_HDgnHY/svg_7.png" id="55" name="Picture"/>
                     <pic:cNvPicPr>
                       <a:picLocks noChangeArrowheads="1" noChangeAspect="1"/>
                     </pic:cNvPicPr>
@@ -20298,6 +20298,18 @@
         <w:t xml:space="preserve">This study contributes a 10K synthetic educational ABSA corpus over a 20-aspect pedagogical schema, a documented generation protocol, and a benchmark setting that makes internal train-validation-test evaluation possible in a domain where public labeled data remain difficult to obtain. It also includes a conservative synthetic-to-real evaluation on mapped annotated student feedback, which supports partial transfer on a 9-aspect overlap, and generator validations that clarify how realism control and label faithfulness behave at corpus scale. Taken together, the evidence supports controlled synthetic supervision as a productive way to study educational ABSA, compare model families, and establish an openly reusable benchmark in a data-scarce domain.</w:t>
       </w:r>
     </w:p>
+    <w:p>
+      <w:pPr>
+        <w:pStyle w:val="BodyText"/>
+        <w:jc w:val="both"/>
+        <w:keepNext w:val="0"/>
+        <w:keepLines w:val="0"/>
+        <w:widowControl w:val="1"/>
+      </w:pPr>
+      <w:r>
+        <w:t xml:space="preserve">Reproducibility: the generation artifacts, local benchmark outputs, and realism-study files are kept distinct throughout, so each reported number traces to its own artifact.</w:t>
+      </w:r>
+    </w:p>
     <w:bookmarkEnd w:id="63"/>
     <w:bookmarkStart w:id="93" w:name="appendix"/>
     <w:p>
@@ -25105,7 +25117,7 @@
               <a:graphicData uri="http://schemas.openxmlformats.org/drawingml/2006/picture">
                 <pic:pic>
                   <pic:nvPicPr>
-                    <pic:cNvPr descr="C:/Users/apart/AppData/Local/Temp/html2doc_svg_3Xx1XO/svg_8.png" id="70" name="Picture"/>
+                    <pic:cNvPr descr="C:/Users/apart/AppData/Local/Temp/html2doc_svg_HDgnHY/svg_8.png" id="70" name="Picture"/>
                     <pic:cNvPicPr>
                       <a:picLocks noChangeArrowheads="1" noChangeAspect="1"/>
                     </pic:cNvPicPr>
@@ -26914,7 +26926,7 @@
               <a:graphicData uri="http://schemas.openxmlformats.org/drawingml/2006/picture">
                 <pic:pic>
                   <pic:nvPicPr>
-                    <pic:cNvPr descr="C:/Users/apart/AppData/Local/Temp/html2doc_svg_3Xx1XO/svg_9.png" id="75" name="Picture"/>
+                    <pic:cNvPr descr="C:/Users/apart/AppData/Local/Temp/html2doc_svg_HDgnHY/svg_9.png" id="75" name="Picture"/>
                     <pic:cNvPicPr>
                       <a:picLocks noChangeArrowheads="1" noChangeAspect="1"/>
                     </pic:cNvPicPr>
@@ -28873,7 +28885,7 @@
               <a:graphicData uri="http://schemas.openxmlformats.org/drawingml/2006/picture">
                 <pic:pic>
                   <pic:nvPicPr>
-                    <pic:cNvPr descr="C:/Users/apart/AppData/Local/Temp/html2doc_svg_3Xx1XO/svg_10.png" id="80" name="Picture"/>
+                    <pic:cNvPr descr="C:/Users/apart/AppData/Local/Temp/html2doc_svg_HDgnHY/svg_10.png" id="80" name="Picture"/>
                     <pic:cNvPicPr>
                       <a:picLocks noChangeArrowheads="1" noChangeAspect="1"/>
                     </pic:cNvPicPr>
@@ -29710,7 +29722,7 @@
               <a:graphicData uri="http://schemas.openxmlformats.org/drawingml/2006/picture">
                 <pic:pic>
                   <pic:nvPicPr>
-                    <pic:cNvPr descr="C:/Users/apart/AppData/Local/Temp/html2doc_svg_3Xx1XO/svg_11.png" id="83" name="Picture"/>
+                    <pic:cNvPr descr="C:/Users/apart/AppData/Local/Temp/html2doc_svg_HDgnHY/svg_11.png" id="83" name="Picture"/>
                     <pic:cNvPicPr>
                       <a:picLocks noChangeArrowheads="1" noChangeAspect="1"/>
                     </pic:cNvPicPr>
@@ -34430,7 +34442,7 @@
               <a:graphicData uri="http://schemas.openxmlformats.org/drawingml/2006/picture">
                 <pic:pic>
                   <pic:nvPicPr>
-                    <pic:cNvPr descr="C:/Users/apart/AppData/Local/Temp/html2doc_svg_3Xx1XO/svg_12.png" id="88" name="Picture"/>
+                    <pic:cNvPr descr="C:/Users/apart/AppData/Local/Temp/html2doc_svg_HDgnHY/svg_12.png" id="88" name="Picture"/>
                     <pic:cNvPicPr>
                       <a:picLocks noChangeArrowheads="1" noChangeAspect="1"/>
                     </pic:cNvPicPr>
@@ -36730,18 +36742,6 @@
       </w:hyperlink>
       <w:r>
         <w:t xml:space="preserve">. Findings of NAACL 2024, pages 3892-3910.</w:t>
-      </w:r>
-    </w:p>
-    <w:p>
-      <w:pPr>
-        <w:pStyle w:val="FirstParagraph"/>
-        <w:jc w:val="both"/>
-        <w:keepNext w:val="0"/>
-        <w:keepLines w:val="0"/>
-        <w:widowControl w:val="1"/>
-      </w:pPr>
-      <w:r>
-        <w:t xml:space="preserve">Reproducibility note: generation artifacts, local benchmark outputs, and realism-study files are kept distinct throughout the text.</w:t>
       </w:r>
     </w:p>
     <w:bookmarkEnd w:id="125"/>

</xml_diff>

<commit_message>
Fix stale cross-reference in Table 8F caption (§6.7D -> Section 5.9)
The symbol form §6.7D survived the earlier section renumber (which only
matched the spelled-out 'Section 6.7D'). Updated to Section 5.9, the current
number of the Faithfulness-Aware Filtering subsection. Rebuilt DOCX + TMLR
bundle.

Co-Authored-By: Claude Opus 4.8 (1M context) <noreply@anthropic.com>
</commit_message>
<xml_diff>
--- a/paper/course_absa_manuscript.docx
+++ b/paper/course_absa_manuscript.docx
@@ -1425,7 +1425,7 @@
               <a:graphicData uri="http://schemas.openxmlformats.org/drawingml/2006/picture">
                 <pic:pic>
                   <pic:nvPicPr>
-                    <pic:cNvPr descr="C:/Users/apart/AppData/Local/Temp/html2doc_svg_HDgnHY/svg_0.png" id="16" name="Picture"/>
+                    <pic:cNvPr descr="C:/Users/apart/AppData/Local/Temp/html2doc_svg_3JSFNM/svg_0.png" id="16" name="Picture"/>
                     <pic:cNvPicPr>
                       <a:picLocks noChangeArrowheads="1" noChangeAspect="1"/>
                     </pic:cNvPicPr>
@@ -7344,7 +7344,7 @@
               <a:graphicData uri="http://schemas.openxmlformats.org/drawingml/2006/picture">
                 <pic:pic>
                   <pic:nvPicPr>
-                    <pic:cNvPr descr="C:/Users/apart/AppData/Local/Temp/html2doc_svg_HDgnHY/svg_1.png" id="29" name="Picture"/>
+                    <pic:cNvPr descr="C:/Users/apart/AppData/Local/Temp/html2doc_svg_3JSFNM/svg_1.png" id="29" name="Picture"/>
                     <pic:cNvPicPr>
                       <a:picLocks noChangeArrowheads="1" noChangeAspect="1"/>
                     </pic:cNvPicPr>
@@ -7426,7 +7426,7 @@
               <a:graphicData uri="http://schemas.openxmlformats.org/drawingml/2006/picture">
                 <pic:pic>
                   <pic:nvPicPr>
-                    <pic:cNvPr descr="C:/Users/apart/AppData/Local/Temp/html2doc_svg_HDgnHY/svg_2.png" id="32" name="Picture"/>
+                    <pic:cNvPr descr="C:/Users/apart/AppData/Local/Temp/html2doc_svg_3JSFNM/svg_2.png" id="32" name="Picture"/>
                     <pic:cNvPicPr>
                       <a:picLocks noChangeArrowheads="1" noChangeAspect="1"/>
                     </pic:cNvPicPr>
@@ -10755,7 +10755,7 @@
               <a:graphicData uri="http://schemas.openxmlformats.org/drawingml/2006/picture">
                 <pic:pic>
                   <pic:nvPicPr>
-                    <pic:cNvPr descr="C:/Users/apart/AppData/Local/Temp/html2doc_svg_HDgnHY/svg_3.png" id="37" name="Picture"/>
+                    <pic:cNvPr descr="C:/Users/apart/AppData/Local/Temp/html2doc_svg_3JSFNM/svg_3.png" id="37" name="Picture"/>
                     <pic:cNvPicPr>
                       <a:picLocks noChangeArrowheads="1" noChangeAspect="1"/>
                     </pic:cNvPicPr>
@@ -11820,7 +11820,7 @@
               <a:graphicData uri="http://schemas.openxmlformats.org/drawingml/2006/picture">
                 <pic:pic>
                   <pic:nvPicPr>
-                    <pic:cNvPr descr="C:/Users/apart/AppData/Local/Temp/html2doc_svg_HDgnHY/svg_4.png" id="42" name="Picture"/>
+                    <pic:cNvPr descr="C:/Users/apart/AppData/Local/Temp/html2doc_svg_3JSFNM/svg_4.png" id="42" name="Picture"/>
                     <pic:cNvPicPr>
                       <a:picLocks noChangeArrowheads="1" noChangeAspect="1"/>
                     </pic:cNvPicPr>
@@ -15382,7 +15382,7 @@
               <a:graphicData uri="http://schemas.openxmlformats.org/drawingml/2006/picture">
                 <pic:pic>
                   <pic:nvPicPr>
-                    <pic:cNvPr descr="C:/Users/apart/AppData/Local/Temp/html2doc_svg_HDgnHY/svg_5.png" id="46" name="Picture"/>
+                    <pic:cNvPr descr="C:/Users/apart/AppData/Local/Temp/html2doc_svg_3JSFNM/svg_5.png" id="46" name="Picture"/>
                     <pic:cNvPicPr>
                       <a:picLocks noChangeArrowheads="1" noChangeAspect="1"/>
                     </pic:cNvPicPr>
@@ -15464,7 +15464,7 @@
               <a:graphicData uri="http://schemas.openxmlformats.org/drawingml/2006/picture">
                 <pic:pic>
                   <pic:nvPicPr>
-                    <pic:cNvPr descr="C:/Users/apart/AppData/Local/Temp/html2doc_svg_HDgnHY/svg_6.png" id="49" name="Picture"/>
+                    <pic:cNvPr descr="C:/Users/apart/AppData/Local/Temp/html2doc_svg_3JSFNM/svg_6.png" id="49" name="Picture"/>
                     <pic:cNvPicPr>
                       <a:picLocks noChangeArrowheads="1" noChangeAspect="1"/>
                     </pic:cNvPicPr>
@@ -19166,7 +19166,7 @@
         <w:widowControl w:val="1"/>
       </w:pPr>
       <w:r>
-        <w:t xml:space="preserve">Table 8F. Cross-architecture and cross-target replication of the §6.7D contrasts. Paired bucket-versus-baseline differences in sentiment MSE on the detector's predicted aspects, mean over eight seeds with 95% bootstrap CI. The</w:t>
+        <w:t xml:space="preserve">Table 8F. Cross-architecture and cross-target replication of the Section 5.9 contrasts. Paired bucket-versus-baseline differences in sentiment MSE on the detector's predicted aspects, mean over eight seeds with 95% bootstrap CI. The</w:t>
       </w:r>
       <w:r>
         <w:t xml:space="preserve"> </w:t>
@@ -19190,7 +19190,7 @@
         <w:tblW w:type="pct" w:w="5000"/>
         <w:jc w:val="center"/>
         <w:tblLook w:firstRow="1" w:lastRow="0" w:firstColumn="0" w:lastColumn="0" w:noHBand="0" w:noVBand="0" w:val="0020"/>
-        <w:tblCaption w:val="Table 8F. Cross-architecture and cross-target replication of the §6.7D contrasts. Paired bucket-versus-baseline differences in sentiment MSE on the detector's predicted aspects, mean over eight seeds with 95% bootstrap CI. The top50 − random_5k contrast is reported on the architecture-replication row (DistilBERT-Herath) where the experiment is set up to test size-controlled filtering at the same scale as BERT-Herath; on EduRABSA the size-controlled comparison is reserved for the bot25 negative control."/>
+        <w:tblCaption w:val="Table 8F. Cross-architecture and cross-target replication of the Section 5.9 contrasts. Paired bucket-versus-baseline differences in sentiment MSE on the detector's predicted aspects, mean over eight seeds with 95% bootstrap CI. The top50 − random_5k contrast is reported on the architecture-replication row (DistilBERT-Herath) where the experiment is set up to test size-controlled filtering at the same scale as BERT-Herath; on EduRABSA the size-controlled comparison is reserved for the bot25 negative control."/>
         <w:tblLayout w:type="autofit"/>
         <w:tblBorders>
           <w:top w:val="single" w:sz="10" w:color="4F6272"/>
@@ -19809,7 +19809,7 @@
               <a:graphicData uri="http://schemas.openxmlformats.org/drawingml/2006/picture">
                 <pic:pic>
                   <pic:nvPicPr>
-                    <pic:cNvPr descr="C:/Users/apart/AppData/Local/Temp/html2doc_svg_HDgnHY/svg_7.png" id="55" name="Picture"/>
+                    <pic:cNvPr descr="C:/Users/apart/AppData/Local/Temp/html2doc_svg_3JSFNM/svg_7.png" id="55" name="Picture"/>
                     <pic:cNvPicPr>
                       <a:picLocks noChangeArrowheads="1" noChangeAspect="1"/>
                     </pic:cNvPicPr>
@@ -25117,7 +25117,7 @@
               <a:graphicData uri="http://schemas.openxmlformats.org/drawingml/2006/picture">
                 <pic:pic>
                   <pic:nvPicPr>
-                    <pic:cNvPr descr="C:/Users/apart/AppData/Local/Temp/html2doc_svg_HDgnHY/svg_8.png" id="70" name="Picture"/>
+                    <pic:cNvPr descr="C:/Users/apart/AppData/Local/Temp/html2doc_svg_3JSFNM/svg_8.png" id="70" name="Picture"/>
                     <pic:cNvPicPr>
                       <a:picLocks noChangeArrowheads="1" noChangeAspect="1"/>
                     </pic:cNvPicPr>
@@ -26926,7 +26926,7 @@
               <a:graphicData uri="http://schemas.openxmlformats.org/drawingml/2006/picture">
                 <pic:pic>
                   <pic:nvPicPr>
-                    <pic:cNvPr descr="C:/Users/apart/AppData/Local/Temp/html2doc_svg_HDgnHY/svg_9.png" id="75" name="Picture"/>
+                    <pic:cNvPr descr="C:/Users/apart/AppData/Local/Temp/html2doc_svg_3JSFNM/svg_9.png" id="75" name="Picture"/>
                     <pic:cNvPicPr>
                       <a:picLocks noChangeArrowheads="1" noChangeAspect="1"/>
                     </pic:cNvPicPr>
@@ -28885,7 +28885,7 @@
               <a:graphicData uri="http://schemas.openxmlformats.org/drawingml/2006/picture">
                 <pic:pic>
                   <pic:nvPicPr>
-                    <pic:cNvPr descr="C:/Users/apart/AppData/Local/Temp/html2doc_svg_HDgnHY/svg_10.png" id="80" name="Picture"/>
+                    <pic:cNvPr descr="C:/Users/apart/AppData/Local/Temp/html2doc_svg_3JSFNM/svg_10.png" id="80" name="Picture"/>
                     <pic:cNvPicPr>
                       <a:picLocks noChangeArrowheads="1" noChangeAspect="1"/>
                     </pic:cNvPicPr>
@@ -29722,7 +29722,7 @@
               <a:graphicData uri="http://schemas.openxmlformats.org/drawingml/2006/picture">
                 <pic:pic>
                   <pic:nvPicPr>
-                    <pic:cNvPr descr="C:/Users/apart/AppData/Local/Temp/html2doc_svg_HDgnHY/svg_11.png" id="83" name="Picture"/>
+                    <pic:cNvPr descr="C:/Users/apart/AppData/Local/Temp/html2doc_svg_3JSFNM/svg_11.png" id="83" name="Picture"/>
                     <pic:cNvPicPr>
                       <a:picLocks noChangeArrowheads="1" noChangeAspect="1"/>
                     </pic:cNvPicPr>
@@ -34442,7 +34442,7 @@
               <a:graphicData uri="http://schemas.openxmlformats.org/drawingml/2006/picture">
                 <pic:pic>
                   <pic:nvPicPr>
-                    <pic:cNvPr descr="C:/Users/apart/AppData/Local/Temp/html2doc_svg_HDgnHY/svg_12.png" id="88" name="Picture"/>
+                    <pic:cNvPr descr="C:/Users/apart/AppData/Local/Temp/html2doc_svg_3JSFNM/svg_12.png" id="88" name="Picture"/>
                     <pic:cNvPicPr>
                       <a:picLocks noChangeArrowheads="1" noChangeAspect="1"/>
                     </pic:cNvPicPr>

</xml_diff>

<commit_message>
Demote micro-F1 from headlines (keep in tables): lead detection with balanced accuracy + AUROC
Per reviewer-optics: micro-F1 0.276 reads alarmingly low at first glance, but
omitting it entirely would look like metric cherry-picking. §5.3 now leads with
macro balanced accuracy 0.623 and macro AUROC 0.681, with micro-F1 parenthetical,
and states explicitly that micro-F1 is retained throughout the tables as the
standard comparable metric, read alongside balanced accuracy and ranking quality
rather than alone. Honest (nothing hidden) and avoids the low-F1 first impression.

Co-Authored-By: Claude Opus 4.8 (1M context) <noreply@anthropic.com>
</commit_message>
<xml_diff>
--- a/paper/course_absa_manuscript.docx
+++ b/paper/course_absa_manuscript.docx
@@ -1410,7 +1410,7 @@
               <a:graphicData uri="http://schemas.openxmlformats.org/drawingml/2006/picture">
                 <pic:pic>
                   <pic:nvPicPr>
-                    <pic:cNvPr descr="C:/Users/apart/AppData/Local/Temp/html2doc_svg_njkrGI/svg_0.png" id="16" name="Picture"/>
+                    <pic:cNvPr descr="C:/Users/apart/AppData/Local/Temp/html2doc_svg_xOq3mT/svg_0.png" id="16" name="Picture"/>
                     <pic:cNvPicPr>
                       <a:picLocks noChangeArrowheads="1" noChangeAspect="1"/>
                     </pic:cNvPicPr>
@@ -7329,7 +7329,7 @@
               <a:graphicData uri="http://schemas.openxmlformats.org/drawingml/2006/picture">
                 <pic:pic>
                   <pic:nvPicPr>
-                    <pic:cNvPr descr="C:/Users/apart/AppData/Local/Temp/html2doc_svg_njkrGI/svg_1.png" id="29" name="Picture"/>
+                    <pic:cNvPr descr="C:/Users/apart/AppData/Local/Temp/html2doc_svg_xOq3mT/svg_1.png" id="29" name="Picture"/>
                     <pic:cNvPicPr>
                       <a:picLocks noChangeArrowheads="1" noChangeAspect="1"/>
                     </pic:cNvPicPr>
@@ -7411,7 +7411,7 @@
               <a:graphicData uri="http://schemas.openxmlformats.org/drawingml/2006/picture">
                 <pic:pic>
                   <pic:nvPicPr>
-                    <pic:cNvPr descr="C:/Users/apart/AppData/Local/Temp/html2doc_svg_njkrGI/svg_2.png" id="32" name="Picture"/>
+                    <pic:cNvPr descr="C:/Users/apart/AppData/Local/Temp/html2doc_svg_xOq3mT/svg_2.png" id="32" name="Picture"/>
                     <pic:cNvPicPr>
                       <a:picLocks noChangeArrowheads="1" noChangeAspect="1"/>
                     </pic:cNvPicPr>
@@ -8881,7 +8881,7 @@
         <w:t xml:space="preserve"> </w:t>
       </w:r>
       <w:r>
-        <w:t xml:space="preserve">gives the strongest held-out micro-F1 at 0.2760 (macro balanced accuracy 0.623, detected-aspect sentiment MSE 0.4959), followed by</w:t>
+        <w:t xml:space="preserve">gives the strongest held-out detection, at macro balanced accuracy 0.623 and macro AUROC 0.681 (micro-F1 0.276, detected-aspect sentiment MSE 0.4959), followed by</w:t>
       </w:r>
       <w:r>
         <w:t xml:space="preserve"> </w:t>
@@ -8896,10 +8896,7 @@
         <w:t xml:space="preserve"> </w:t>
       </w:r>
       <w:r>
-        <w:t xml:space="preserve">at 0.2691 (0.621). The joint variants remain competitive but lower, with</w:t>
-      </w:r>
-      <w:r>
-        <w:t xml:space="preserve"> </w:t>
+        <w:t xml:space="preserve">at balanced accuracy 0.621 (micro-F1 0.2691). The joint variants remain competitive but lower (</w:t>
       </w:r>
       <w:r>
         <w:rPr>
@@ -8911,7 +8908,7 @@
         <w:t xml:space="preserve"> </w:t>
       </w:r>
       <w:r>
-        <w:t xml:space="preserve">at 0.2524 and</w:t>
+        <w:t xml:space="preserve">micro-F1 0.2524,</w:t>
       </w:r>
       <w:r>
         <w:t xml:space="preserve"> </w:t>
@@ -8926,7 +8923,7 @@
         <w:t xml:space="preserve"> </w:t>
       </w:r>
       <w:r>
-        <w:t xml:space="preserve">at 0.2447, which supports the two-step decomposition as the clearest baseline family in this benchmark. Micro-F1 is a deliberately strict operating-point metric here: with one to three aspects per review among twenty mostly-absent labels, the trivial all-present baseline already scores 0.183, so a held-out 0.276 clears chance by a wide margin, and the less compressed macro balanced accuracy near 0.62 is the more representative view of the same detector. We therefore read detection through balanced accuracy and threshold-free ranking (below) alongside F1, not F1 alone.</w:t>
+        <w:t xml:space="preserve">0.2447), which supports the two-step decomposition as the clearest baseline family in this benchmark. We lead with balanced accuracy and threshold-free AUROC rather than micro-F1 because micro-F1 is a deliberately strict operating-point metric here: with one to three aspects per review among twenty mostly-absent labels, the trivial all-present baseline already scores 0.183 micro-F1, so the absolute level is compressed by the task structure and the measured label noise rather than by weak representations. Micro-F1 is retained throughout the tables as the standard comparable metric, but it is read alongside balanced accuracy and ranking quality, not alone.</w:t>
       </w:r>
     </w:p>
     <w:p>
@@ -10824,7 +10821,7 @@
               <a:graphicData uri="http://schemas.openxmlformats.org/drawingml/2006/picture">
                 <pic:pic>
                   <pic:nvPicPr>
-                    <pic:cNvPr descr="C:/Users/apart/AppData/Local/Temp/html2doc_svg_njkrGI/svg_3.png" id="37" name="Picture"/>
+                    <pic:cNvPr descr="C:/Users/apart/AppData/Local/Temp/html2doc_svg_xOq3mT/svg_3.png" id="37" name="Picture"/>
                     <pic:cNvPicPr>
                       <a:picLocks noChangeArrowheads="1" noChangeAspect="1"/>
                     </pic:cNvPicPr>
@@ -11908,7 +11905,7 @@
               <a:graphicData uri="http://schemas.openxmlformats.org/drawingml/2006/picture">
                 <pic:pic>
                   <pic:nvPicPr>
-                    <pic:cNvPr descr="C:/Users/apart/AppData/Local/Temp/html2doc_svg_njkrGI/svg_4.png" id="42" name="Picture"/>
+                    <pic:cNvPr descr="C:/Users/apart/AppData/Local/Temp/html2doc_svg_xOq3mT/svg_4.png" id="42" name="Picture"/>
                     <pic:cNvPicPr>
                       <a:picLocks noChangeArrowheads="1" noChangeAspect="1"/>
                     </pic:cNvPicPr>
@@ -15528,7 +15525,7 @@
               <a:graphicData uri="http://schemas.openxmlformats.org/drawingml/2006/picture">
                 <pic:pic>
                   <pic:nvPicPr>
-                    <pic:cNvPr descr="C:/Users/apart/AppData/Local/Temp/html2doc_svg_njkrGI/svg_5.png" id="46" name="Picture"/>
+                    <pic:cNvPr descr="C:/Users/apart/AppData/Local/Temp/html2doc_svg_xOq3mT/svg_5.png" id="46" name="Picture"/>
                     <pic:cNvPicPr>
                       <a:picLocks noChangeArrowheads="1" noChangeAspect="1"/>
                     </pic:cNvPicPr>
@@ -15610,7 +15607,7 @@
               <a:graphicData uri="http://schemas.openxmlformats.org/drawingml/2006/picture">
                 <pic:pic>
                   <pic:nvPicPr>
-                    <pic:cNvPr descr="C:/Users/apart/AppData/Local/Temp/html2doc_svg_njkrGI/svg_6.png" id="49" name="Picture"/>
+                    <pic:cNvPr descr="C:/Users/apart/AppData/Local/Temp/html2doc_svg_xOq3mT/svg_6.png" id="49" name="Picture"/>
                     <pic:cNvPicPr>
                       <a:picLocks noChangeArrowheads="1" noChangeAspect="1"/>
                     </pic:cNvPicPr>
@@ -20093,7 +20090,7 @@
               <a:graphicData uri="http://schemas.openxmlformats.org/drawingml/2006/picture">
                 <pic:pic>
                   <pic:nvPicPr>
-                    <pic:cNvPr descr="C:/Users/apart/AppData/Local/Temp/html2doc_svg_njkrGI/svg_7.png" id="55" name="Picture"/>
+                    <pic:cNvPr descr="C:/Users/apart/AppData/Local/Temp/html2doc_svg_xOq3mT/svg_7.png" id="55" name="Picture"/>
                     <pic:cNvPicPr>
                       <a:picLocks noChangeArrowheads="1" noChangeAspect="1"/>
                     </pic:cNvPicPr>
@@ -25428,7 +25425,7 @@
               <a:graphicData uri="http://schemas.openxmlformats.org/drawingml/2006/picture">
                 <pic:pic>
                   <pic:nvPicPr>
-                    <pic:cNvPr descr="C:/Users/apart/AppData/Local/Temp/html2doc_svg_njkrGI/svg_8.png" id="70" name="Picture"/>
+                    <pic:cNvPr descr="C:/Users/apart/AppData/Local/Temp/html2doc_svg_xOq3mT/svg_8.png" id="70" name="Picture"/>
                     <pic:cNvPicPr>
                       <a:picLocks noChangeArrowheads="1" noChangeAspect="1"/>
                     </pic:cNvPicPr>
@@ -27237,7 +27234,7 @@
               <a:graphicData uri="http://schemas.openxmlformats.org/drawingml/2006/picture">
                 <pic:pic>
                   <pic:nvPicPr>
-                    <pic:cNvPr descr="C:/Users/apart/AppData/Local/Temp/html2doc_svg_njkrGI/svg_9.png" id="75" name="Picture"/>
+                    <pic:cNvPr descr="C:/Users/apart/AppData/Local/Temp/html2doc_svg_xOq3mT/svg_9.png" id="75" name="Picture"/>
                     <pic:cNvPicPr>
                       <a:picLocks noChangeArrowheads="1" noChangeAspect="1"/>
                     </pic:cNvPicPr>
@@ -29196,7 +29193,7 @@
               <a:graphicData uri="http://schemas.openxmlformats.org/drawingml/2006/picture">
                 <pic:pic>
                   <pic:nvPicPr>
-                    <pic:cNvPr descr="C:/Users/apart/AppData/Local/Temp/html2doc_svg_njkrGI/svg_10.png" id="80" name="Picture"/>
+                    <pic:cNvPr descr="C:/Users/apart/AppData/Local/Temp/html2doc_svg_xOq3mT/svg_10.png" id="80" name="Picture"/>
                     <pic:cNvPicPr>
                       <a:picLocks noChangeArrowheads="1" noChangeAspect="1"/>
                     </pic:cNvPicPr>
@@ -30033,7 +30030,7 @@
               <a:graphicData uri="http://schemas.openxmlformats.org/drawingml/2006/picture">
                 <pic:pic>
                   <pic:nvPicPr>
-                    <pic:cNvPr descr="C:/Users/apart/AppData/Local/Temp/html2doc_svg_njkrGI/svg_11.png" id="83" name="Picture"/>
+                    <pic:cNvPr descr="C:/Users/apart/AppData/Local/Temp/html2doc_svg_xOq3mT/svg_11.png" id="83" name="Picture"/>
                     <pic:cNvPicPr>
                       <a:picLocks noChangeArrowheads="1" noChangeAspect="1"/>
                     </pic:cNvPicPr>
@@ -34753,7 +34750,7 @@
               <a:graphicData uri="http://schemas.openxmlformats.org/drawingml/2006/picture">
                 <pic:pic>
                   <pic:nvPicPr>
-                    <pic:cNvPr descr="C:/Users/apart/AppData/Local/Temp/html2doc_svg_njkrGI/svg_12.png" id="88" name="Picture"/>
+                    <pic:cNvPr descr="C:/Users/apart/AppData/Local/Temp/html2doc_svg_xOq3mT/svg_12.png" id="88" name="Picture"/>
                     <pic:cNvPicPr>
                       <a:picLocks noChangeArrowheads="1" noChangeAspect="1"/>
                     </pic:cNvPicPr>

</xml_diff>

<commit_message>
Add audit-reliability-by-length-and-aspects analysis (A.22/Table A20)
Decomposes the 2,482 audit-vs-human decisions: recall on genuine aspects rises with
review content (0.61->0.74), while specificity against injected aspects falls with
aspect density (0.90->0.74); controlling aspect count, kappa rises with length
(1-aspect: 0.50->0.56). So short reviews fail by under-confirming, aspect-dense
reviews fail by under-rejecting; agreement peaks at moderate length+aspects. Explains
the Herath(short)<EduRABSA(longer) ordering. Section 5.7 pointer + Appendix A.22.
Rebuilt Overleaf (clean) + DOCX. (M-ABSA third-target eval still running; not yet folded.)

Co-Authored-By: Claude Opus 4.8 (1M context) <noreply@anthropic.com>
</commit_message>
<xml_diff>
--- a/paper/course_absa_manuscript.docx
+++ b/paper/course_absa_manuscript.docx
@@ -1410,7 +1410,7 @@
               <a:graphicData uri="http://schemas.openxmlformats.org/drawingml/2006/picture">
                 <pic:pic>
                   <pic:nvPicPr>
-                    <pic:cNvPr descr="C:/Users/apart/AppData/Local/Temp/html2doc_svg_tQig1a/svg_0.png" id="16" name="Picture"/>
+                    <pic:cNvPr descr="C:/Users/apart/AppData/Local/Temp/html2doc_svg_l3KOoh/svg_0.png" id="16" name="Picture"/>
                     <pic:cNvPicPr>
                       <a:picLocks noChangeArrowheads="1" noChangeAspect="1"/>
                     </pic:cNvPicPr>
@@ -10174,7 +10174,7 @@
               <a:graphicData uri="http://schemas.openxmlformats.org/drawingml/2006/picture">
                 <pic:pic>
                   <pic:nvPicPr>
-                    <pic:cNvPr descr="C:/Users/apart/AppData/Local/Temp/html2doc_svg_tQig1a/svg_1.png" id="30" name="Picture"/>
+                    <pic:cNvPr descr="C:/Users/apart/AppData/Local/Temp/html2doc_svg_l3KOoh/svg_1.png" id="30" name="Picture"/>
                     <pic:cNvPicPr>
                       <a:picLocks noChangeArrowheads="1" noChangeAspect="1"/>
                     </pic:cNvPicPr>
@@ -12519,7 +12519,7 @@
               <a:graphicData uri="http://schemas.openxmlformats.org/drawingml/2006/picture">
                 <pic:pic>
                   <pic:nvPicPr>
-                    <pic:cNvPr descr="C:/Users/apart/AppData/Local/Temp/html2doc_svg_tQig1a/svg_2.png" id="35" name="Picture"/>
+                    <pic:cNvPr descr="C:/Users/apart/AppData/Local/Temp/html2doc_svg_l3KOoh/svg_2.png" id="35" name="Picture"/>
                     <pic:cNvPicPr>
                       <a:picLocks noChangeArrowheads="1" noChangeAspect="1"/>
                     </pic:cNvPicPr>
@@ -12601,7 +12601,7 @@
               <a:graphicData uri="http://schemas.openxmlformats.org/drawingml/2006/picture">
                 <pic:pic>
                   <pic:nvPicPr>
-                    <pic:cNvPr descr="C:/Users/apart/AppData/Local/Temp/html2doc_svg_tQig1a/svg_3.png" id="38" name="Picture"/>
+                    <pic:cNvPr descr="C:/Users/apart/AppData/Local/Temp/html2doc_svg_l3KOoh/svg_3.png" id="38" name="Picture"/>
                     <pic:cNvPicPr>
                       <a:picLocks noChangeArrowheads="1" noChangeAspect="1"/>
                     </pic:cNvPicPr>
@@ -16203,7 +16203,7 @@
               <a:graphicData uri="http://schemas.openxmlformats.org/drawingml/2006/picture">
                 <pic:pic>
                   <pic:nvPicPr>
-                    <pic:cNvPr descr="C:/Users/apart/AppData/Local/Temp/html2doc_svg_tQig1a/svg_4.png" id="44" name="Picture"/>
+                    <pic:cNvPr descr="C:/Users/apart/AppData/Local/Temp/html2doc_svg_l3KOoh/svg_4.png" id="44" name="Picture"/>
                     <pic:cNvPicPr>
                       <a:picLocks noChangeArrowheads="1" noChangeAspect="1"/>
                     </pic:cNvPicPr>
@@ -16399,7 +16399,7 @@
         <w:t xml:space="preserve"> </w:t>
       </w:r>
       <w:r>
-        <w:t xml:space="preserve">generator therefore reproduces the human faithfulness judgments at least as well, so the audit signal is human-grounded rather than an artifact of the generator's own family. Agreement is broken out by corpus in Appendix A.21 (Table A19): both auditors agree with humans more on EduRABSA (kappa 0.62 same-family, 0.67 independent) than on Herath (0.51 and 0.58). This tracks item granularity rather than a defect in either corpus, Herath items are single sentences (median 20 words) while EduRABSA items are short passages (median 38 words), so a shorter item gives the auditor less textual evidence per aspect. Because each decision is a binary faithful-versus-unfaithful judgment, the metric is invariant to the two corpora's different aspect label sets.</w:t>
+        <w:t xml:space="preserve">generator therefore reproduces the human faithfulness judgments at least as well, so the audit signal is human-grounded rather than an artifact of the generator's own family. Agreement is broken out by corpus in Appendix A.21 (Table A19): both auditors agree with humans more on EduRABSA (kappa 0.62 same-family, 0.67 independent) than on Herath (0.51 and 0.58). This tracks item granularity rather than a defect in either corpus, Herath items are single sentences (median 20 words) while EduRABSA items are short passages (median 38 words), so a shorter item gives the auditor less textual evidence per aspect. Because each decision is a binary faithful-versus-unfaithful judgment, the metric is invariant to the two corpora's different aspect label sets. Appendix A.22 decomposes this reliability further: recall on genuine aspects rises with review length, while specificity against fabricated aspects falls as a review packs more aspects, so agreement peaks at moderate length and aspect count.</w:t>
       </w:r>
     </w:p>
     <w:p>
@@ -16848,7 +16848,7 @@
               <a:graphicData uri="http://schemas.openxmlformats.org/drawingml/2006/picture">
                 <pic:pic>
                   <pic:nvPicPr>
-                    <pic:cNvPr descr="C:/Users/apart/AppData/Local/Temp/html2doc_svg_tQig1a/svg_5.png" id="51" name="Picture"/>
+                    <pic:cNvPr descr="C:/Users/apart/AppData/Local/Temp/html2doc_svg_l3KOoh/svg_5.png" id="51" name="Picture"/>
                     <pic:cNvPicPr>
                       <a:picLocks noChangeArrowheads="1" noChangeAspect="1"/>
                     </pic:cNvPicPr>
@@ -17000,7 +17000,7 @@
       </w:r>
     </w:p>
     <w:bookmarkEnd w:id="55"/>
-    <w:bookmarkStart w:id="101" w:name="appendix"/>
+    <w:bookmarkStart w:id="102" w:name="appendix"/>
     <w:p>
       <w:pPr>
         <w:pStyle w:val="Heading2"/>
@@ -21806,7 +21806,7 @@
               <a:graphicData uri="http://schemas.openxmlformats.org/drawingml/2006/picture">
                 <pic:pic>
                   <pic:nvPicPr>
-                    <pic:cNvPr descr="C:/Users/apart/AppData/Local/Temp/html2doc_svg_tQig1a/svg_6.png" id="62" name="Picture"/>
+                    <pic:cNvPr descr="C:/Users/apart/AppData/Local/Temp/html2doc_svg_l3KOoh/svg_6.png" id="62" name="Picture"/>
                     <pic:cNvPicPr>
                       <a:picLocks noChangeArrowheads="1" noChangeAspect="1"/>
                     </pic:cNvPicPr>
@@ -23615,7 +23615,7 @@
               <a:graphicData uri="http://schemas.openxmlformats.org/drawingml/2006/picture">
                 <pic:pic>
                   <pic:nvPicPr>
-                    <pic:cNvPr descr="C:/Users/apart/AppData/Local/Temp/html2doc_svg_tQig1a/svg_7.png" id="67" name="Picture"/>
+                    <pic:cNvPr descr="C:/Users/apart/AppData/Local/Temp/html2doc_svg_l3KOoh/svg_7.png" id="67" name="Picture"/>
                     <pic:cNvPicPr>
                       <a:picLocks noChangeArrowheads="1" noChangeAspect="1"/>
                     </pic:cNvPicPr>
@@ -25574,7 +25574,7 @@
               <a:graphicData uri="http://schemas.openxmlformats.org/drawingml/2006/picture">
                 <pic:pic>
                   <pic:nvPicPr>
-                    <pic:cNvPr descr="C:/Users/apart/AppData/Local/Temp/html2doc_svg_tQig1a/svg_8.png" id="72" name="Picture"/>
+                    <pic:cNvPr descr="C:/Users/apart/AppData/Local/Temp/html2doc_svg_l3KOoh/svg_8.png" id="72" name="Picture"/>
                     <pic:cNvPicPr>
                       <a:picLocks noChangeArrowheads="1" noChangeAspect="1"/>
                     </pic:cNvPicPr>
@@ -26411,7 +26411,7 @@
               <a:graphicData uri="http://schemas.openxmlformats.org/drawingml/2006/picture">
                 <pic:pic>
                   <pic:nvPicPr>
-                    <pic:cNvPr descr="C:/Users/apart/AppData/Local/Temp/html2doc_svg_tQig1a/svg_9.png" id="75" name="Picture"/>
+                    <pic:cNvPr descr="C:/Users/apart/AppData/Local/Temp/html2doc_svg_l3KOoh/svg_9.png" id="75" name="Picture"/>
                     <pic:cNvPicPr>
                       <a:picLocks noChangeArrowheads="1" noChangeAspect="1"/>
                     </pic:cNvPicPr>
@@ -31131,7 +31131,7 @@
               <a:graphicData uri="http://schemas.openxmlformats.org/drawingml/2006/picture">
                 <pic:pic>
                   <pic:nvPicPr>
-                    <pic:cNvPr descr="C:/Users/apart/AppData/Local/Temp/html2doc_svg_tQig1a/svg_10.png" id="80" name="Picture"/>
+                    <pic:cNvPr descr="C:/Users/apart/AppData/Local/Temp/html2doc_svg_l3KOoh/svg_10.png" id="80" name="Picture"/>
                     <pic:cNvPicPr>
                       <a:picLocks noChangeArrowheads="1" noChangeAspect="1"/>
                     </pic:cNvPicPr>
@@ -32335,7 +32335,7 @@
               <a:graphicData uri="http://schemas.openxmlformats.org/drawingml/2006/picture">
                 <pic:pic>
                   <pic:nvPicPr>
-                    <pic:cNvPr descr="C:/Users/apart/AppData/Local/Temp/html2doc_svg_tQig1a/svg_11.png" id="86" name="Picture"/>
+                    <pic:cNvPr descr="C:/Users/apart/AppData/Local/Temp/html2doc_svg_l3KOoh/svg_11.png" id="86" name="Picture"/>
                     <pic:cNvPicPr>
                       <a:picLocks noChangeArrowheads="1" noChangeAspect="1"/>
                     </pic:cNvPicPr>
@@ -32417,7 +32417,7 @@
               <a:graphicData uri="http://schemas.openxmlformats.org/drawingml/2006/picture">
                 <pic:pic>
                   <pic:nvPicPr>
-                    <pic:cNvPr descr="C:/Users/apart/AppData/Local/Temp/html2doc_svg_tQig1a/svg_12.png" id="89" name="Picture"/>
+                    <pic:cNvPr descr="C:/Users/apart/AppData/Local/Temp/html2doc_svg_l3KOoh/svg_12.png" id="89" name="Picture"/>
                     <pic:cNvPicPr>
                       <a:picLocks noChangeArrowheads="1" noChangeAspect="1"/>
                     </pic:cNvPicPr>
@@ -33238,7 +33238,7 @@
               <a:graphicData uri="http://schemas.openxmlformats.org/drawingml/2006/picture">
                 <pic:pic>
                   <pic:nvPicPr>
-                    <pic:cNvPr descr="C:/Users/apart/AppData/Local/Temp/html2doc_svg_tQig1a/svg_13.png" id="94" name="Picture"/>
+                    <pic:cNvPr descr="C:/Users/apart/AppData/Local/Temp/html2doc_svg_l3KOoh/svg_13.png" id="94" name="Picture"/>
                     <pic:cNvPicPr>
                       <a:picLocks noChangeArrowheads="1" noChangeAspect="1"/>
                     </pic:cNvPicPr>
@@ -39906,8 +39906,979 @@
       </w:tr>
     </w:tbl>
     <w:bookmarkEnd w:id="100"/>
+    <w:bookmarkStart w:id="101" w:name="Xd70789edcfe28c729fd7e320d22fd8a4cf9dbc1"/>
+    <w:p>
+      <w:pPr>
+        <w:pStyle w:val="Heading3"/>
+        <w:keepNext/>
+        <w:keepLines/>
+        <w:widowControl w:val="1"/>
+      </w:pPr>
+      <w:r>
+        <w:t xml:space="preserve">A.22 Audit Reliability by Review Length and Aspect Count</w:t>
+      </w:r>
+    </w:p>
+    <w:p>
+      <w:pPr>
+        <w:pStyle w:val="FirstParagraph"/>
+        <w:jc w:val="both"/>
+        <w:keepNext w:val="0"/>
+        <w:keepLines w:val="0"/>
+        <w:widowControl w:val="1"/>
+      </w:pPr>
+      <w:r>
+        <w:t xml:space="preserve">The audit-versus-human agreement of Table A19 varies systematically with two correlated review properties (Pearson 0.48): review length and the number of declared aspects. Decomposing the 2,482 decisions isolates two opposing forces (Table A20). Recall, the rate at which the audit confirms a genuinely faithful aspect, rises with content: from 0.61 on one-aspect reviews to 0.74 on reviews with four or more aspects, and, holding the aspect count fixed at one, from 0.50 on reviews of at most 20 words to 0.56 on reviews over 40 words. More text lets the audit verify that a real aspect is present. Specificity, the rate at which it rejects an injected absent aspect, instead falls with aspect density: from 0.90 on one-aspect reviews to about 0.74 on reviews with three or more aspects, because a fabricated aspect blends in when a review already discusses many aspects. Agreement is therefore highest for moderate-length, moderate-aspect reviews: the shortest reviews are hard because the audit cannot confirm real aspects, and the most aspect-dense reviews are hard because it cannot reject fabricated ones. This also explains the per-corpus ordering in Table A19, where the shorter Herath sentences sit below the longer EduRABSA passages. Scripts:</w:t>
+      </w:r>
+      <w:r>
+        <w:t xml:space="preserve"> </w:t>
+      </w:r>
+      <w:r>
+        <w:rPr>
+          <w:rStyle w:val="VerbatimChar"/>
+        </w:rPr>
+        <w:t xml:space="preserve">paper/v7_kappa_by_length.py</w:t>
+      </w:r>
+      <w:r>
+        <w:t xml:space="preserve">,</w:t>
+      </w:r>
+      <w:r>
+        <w:t xml:space="preserve"> </w:t>
+      </w:r>
+      <w:r>
+        <w:rPr>
+          <w:rStyle w:val="VerbatimChar"/>
+        </w:rPr>
+        <w:t xml:space="preserve">paper/v7_by_len_and_aspects.py</w:t>
+      </w:r>
+      <w:r>
+        <w:t xml:space="preserve">.</w:t>
+      </w:r>
+    </w:p>
+    <w:p>
+      <w:pPr>
+        <w:pStyle w:val="TableCaption"/>
+        <w:spacing w:before="280" w:after="60" w:line="240" w:lineRule="auto"/>
+        <w:jc w:val="center"/>
+        <w:keepNext/>
+        <w:keepLines/>
+        <w:widowControl w:val="1"/>
+      </w:pPr>
+      <w:r>
+        <w:rPr>
+          <w:b/>
+          <w:i/>
+        </w:rPr>
+        <w:t>Table A20.</w:t>
+      </w:r>
+      <w:r>
+        <w:rPr>
+          <w:b w:val="0"/>
+          <w:i/>
+        </w:rPr>
+        <w:t xml:space="preserve"> </w:t>
+      </w:r>
+      <w:r>
+        <w:rPr>
+          <w:b w:val="0"/>
+          <w:i/>
+        </w:rPr>
+        <w:t>Audit-versus-human agreement decomposed by the number of declared aspects per review (cost-matched gpt-4.1-mini auditor; the independent auditor follows the same pattern). Recall is the keep-rate on genuinely faithful aspects; specificity is the reject-rate on injected absent aspects. Recall rises with content while specificity falls with aspect density.</w:t>
+      </w:r>
+    </w:p>
+    <w:tbl>
+      <w:tblPr>
+        <w:tblStyle w:val="Table"/>
+        <w:tblW w:type="pct" w:w="5000"/>
+        <w:jc w:val="center"/>
+        <w:tblLook w:firstRow="1" w:lastRow="0" w:firstColumn="0" w:lastColumn="0" w:noHBand="0" w:noVBand="0" w:val="0020"/>
+        <w:tblCaption w:val="Table A20. Audit-versus-human agreement decomposed by the number of declared aspects per review (cost-matched gpt-4.1-mini auditor; the independent auditor follows the same pattern). Recall is the keep-rate on genuinely faithful aspects; specificity is the reject-rate on injected absent aspects. Recall rises with content while specificity falls with aspect density."/>
+        <w:tblLayout w:type="autofit"/>
+        <w:tblBorders>
+          <w:top w:val="single" w:sz="10" w:color="4F6272"/>
+          <w:bottom w:val="single" w:sz="10" w:color="4F6272"/>
+          <w:insideH w:val="single" w:sz="5" w:color="9FB0C2"/>
+          <w:left w:val="single" w:sz="6" w:color="9FB0C2"/>
+          <w:right w:val="single" w:sz="6" w:color="9FB0C2"/>
+          <w:insideV w:val="single" w:sz="5" w:color="D9E1E8"/>
+        </w:tblBorders>
+      </w:tblPr>
+      <w:tblGrid>
+        <w:gridCol w:w="1320"/>
+        <w:gridCol w:w="1320"/>
+        <w:gridCol w:w="1320"/>
+        <w:gridCol w:w="1320"/>
+        <w:gridCol w:w="1320"/>
+        <w:gridCol w:w="1320"/>
+      </w:tblGrid>
+      <w:tr>
+        <w:trPr>
+          <w:tblHeader w:val="on"/>
+        </w:trPr>
+        <w:tc>
+          <w:tcPr>
+            <w:shd w:fill="EEF3F7"/>
+            <w:tcBorders>
+              <w:left w:val="nil"/>
+              <w:right w:val="nil"/>
+              <w:top w:val="nil"/>
+              <w:bottom w:val="single" w:sz="8" w:color="9FB0C2"/>
+            </w:tcBorders>
+            <w:vAlign w:val="center"/>
+          </w:tcPr>
+          <w:p>
+            <w:pPr>
+              <w:pStyle w:val="Compact"/>
+              <w:spacing w:before="0" w:after="20" w:line="240" w:lineRule="auto"/>
+              <w:jc w:val="center"/>
+              <w:keepNext w:val="0"/>
+              <w:keepLines/>
+              <w:widowControl w:val="1"/>
+            </w:pPr>
+            <w:r>
+              <w:rPr>
+                <w:rFonts w:ascii="Georgia" w:hAnsi="Georgia"/>
+                <w:b/>
+                <w:sz w:val="19"/>
+              </w:rPr>
+              <w:t xml:space="preserve">Aspects per review</w:t>
+            </w:r>
+          </w:p>
+        </w:tc>
+        <w:tc>
+          <w:tcPr>
+            <w:shd w:fill="EEF3F7"/>
+            <w:tcBorders>
+              <w:left w:val="nil"/>
+              <w:right w:val="nil"/>
+              <w:top w:val="nil"/>
+              <w:bottom w:val="single" w:sz="8" w:color="9FB0C2"/>
+            </w:tcBorders>
+            <w:vAlign w:val="center"/>
+          </w:tcPr>
+          <w:p>
+            <w:pPr>
+              <w:pStyle w:val="Compact"/>
+              <w:spacing w:before="0" w:after="20" w:line="240" w:lineRule="auto"/>
+              <w:jc w:val="center"/>
+              <w:keepNext w:val="0"/>
+              <w:keepLines/>
+              <w:widowControl w:val="1"/>
+            </w:pPr>
+            <w:r>
+              <w:rPr>
+                <w:rFonts w:ascii="Georgia" w:hAnsi="Georgia"/>
+                <w:b/>
+                <w:sz w:val="19"/>
+              </w:rPr>
+              <w:t xml:space="preserve">Decisions</w:t>
+            </w:r>
+          </w:p>
+        </w:tc>
+        <w:tc>
+          <w:tcPr>
+            <w:shd w:fill="EEF3F7"/>
+            <w:tcBorders>
+              <w:left w:val="nil"/>
+              <w:right w:val="nil"/>
+              <w:top w:val="nil"/>
+              <w:bottom w:val="single" w:sz="8" w:color="9FB0C2"/>
+            </w:tcBorders>
+            <w:vAlign w:val="center"/>
+          </w:tcPr>
+          <w:p>
+            <w:pPr>
+              <w:pStyle w:val="Compact"/>
+              <w:spacing w:before="0" w:after="20" w:line="240" w:lineRule="auto"/>
+              <w:jc w:val="center"/>
+              <w:keepNext w:val="0"/>
+              <w:keepLines/>
+              <w:widowControl w:val="1"/>
+            </w:pPr>
+            <w:r>
+              <w:rPr>
+                <w:rFonts w:ascii="Georgia" w:hAnsi="Georgia"/>
+                <w:b/>
+                <w:sz w:val="19"/>
+              </w:rPr>
+              <w:t xml:space="preserve">Mean words</w:t>
+            </w:r>
+          </w:p>
+        </w:tc>
+        <w:tc>
+          <w:tcPr>
+            <w:shd w:fill="EEF3F7"/>
+            <w:tcBorders>
+              <w:left w:val="nil"/>
+              <w:right w:val="nil"/>
+              <w:top w:val="nil"/>
+              <w:bottom w:val="single" w:sz="8" w:color="9FB0C2"/>
+            </w:tcBorders>
+            <w:vAlign w:val="center"/>
+          </w:tcPr>
+          <w:p>
+            <w:pPr>
+              <w:pStyle w:val="Compact"/>
+              <w:spacing w:before="0" w:after="20" w:line="240" w:lineRule="auto"/>
+              <w:jc w:val="center"/>
+              <w:keepNext w:val="0"/>
+              <w:keepLines/>
+              <w:widowControl w:val="1"/>
+            </w:pPr>
+            <w:r>
+              <w:rPr>
+                <w:rFonts w:ascii="Georgia" w:hAnsi="Georgia"/>
+                <w:b/>
+                <w:sz w:val="19"/>
+              </w:rPr>
+              <w:t xml:space="preserve">Cohen's kappa</w:t>
+            </w:r>
+          </w:p>
+        </w:tc>
+        <w:tc>
+          <w:tcPr>
+            <w:shd w:fill="EEF3F7"/>
+            <w:tcBorders>
+              <w:left w:val="nil"/>
+              <w:right w:val="nil"/>
+              <w:top w:val="nil"/>
+              <w:bottom w:val="single" w:sz="8" w:color="9FB0C2"/>
+            </w:tcBorders>
+            <w:vAlign w:val="center"/>
+          </w:tcPr>
+          <w:p>
+            <w:pPr>
+              <w:pStyle w:val="Compact"/>
+              <w:spacing w:before="0" w:after="20" w:line="240" w:lineRule="auto"/>
+              <w:jc w:val="center"/>
+              <w:keepNext w:val="0"/>
+              <w:keepLines/>
+              <w:widowControl w:val="1"/>
+            </w:pPr>
+            <w:r>
+              <w:rPr>
+                <w:rFonts w:ascii="Georgia" w:hAnsi="Georgia"/>
+                <w:b/>
+                <w:sz w:val="19"/>
+              </w:rPr>
+              <w:t xml:space="preserve">Recall (confirm faithful)</w:t>
+            </w:r>
+          </w:p>
+        </w:tc>
+        <w:tc>
+          <w:tcPr>
+            <w:shd w:fill="EEF3F7"/>
+            <w:tcBorders>
+              <w:left w:val="nil"/>
+              <w:right w:val="nil"/>
+              <w:top w:val="nil"/>
+              <w:bottom w:val="single" w:sz="8" w:color="9FB0C2"/>
+            </w:tcBorders>
+            <w:vAlign w:val="center"/>
+          </w:tcPr>
+          <w:p>
+            <w:pPr>
+              <w:pStyle w:val="Compact"/>
+              <w:spacing w:before="0" w:after="20" w:line="240" w:lineRule="auto"/>
+              <w:jc w:val="center"/>
+              <w:keepNext w:val="0"/>
+              <w:keepLines/>
+              <w:widowControl w:val="1"/>
+            </w:pPr>
+            <w:r>
+              <w:rPr>
+                <w:rFonts w:ascii="Georgia" w:hAnsi="Georgia"/>
+                <w:b/>
+                <w:sz w:val="19"/>
+              </w:rPr>
+              <w:t xml:space="preserve">Specificity (reject injected)</w:t>
+            </w:r>
+          </w:p>
+        </w:tc>
+      </w:tr>
+      <w:tr>
+        <w:tc>
+          <w:tcPr>
+            <w:tcBorders>
+              <w:left w:val="nil"/>
+              <w:right w:val="nil"/>
+              <w:top w:val="nil"/>
+              <w:bottom w:val="single" w:sz="4" w:color="D9E1E8"/>
+            </w:tcBorders>
+            <w:vAlign w:val="center"/>
+          </w:tcPr>
+          <w:p>
+            <w:pPr>
+              <w:pStyle w:val="Compact"/>
+              <w:spacing w:before="0" w:after="20" w:line="240" w:lineRule="auto"/>
+              <w:jc w:val="center"/>
+              <w:keepNext w:val="0"/>
+              <w:keepLines/>
+              <w:widowControl w:val="1"/>
+            </w:pPr>
+            <w:r>
+              <w:rPr>
+                <w:rFonts w:ascii="Georgia" w:hAnsi="Georgia"/>
+                <w:sz w:val="19"/>
+              </w:rPr>
+              <w:t xml:space="preserve">1</w:t>
+            </w:r>
+          </w:p>
+        </w:tc>
+        <w:tc>
+          <w:tcPr>
+            <w:tcBorders>
+              <w:left w:val="nil"/>
+              <w:right w:val="nil"/>
+              <w:top w:val="nil"/>
+              <w:bottom w:val="single" w:sz="4" w:color="D9E1E8"/>
+            </w:tcBorders>
+            <w:vAlign w:val="center"/>
+          </w:tcPr>
+          <w:p>
+            <w:pPr>
+              <w:pStyle w:val="Compact"/>
+              <w:spacing w:before="0" w:after="20" w:line="240" w:lineRule="auto"/>
+              <w:jc w:val="center"/>
+              <w:keepNext w:val="0"/>
+              <w:keepLines/>
+              <w:widowControl w:val="1"/>
+            </w:pPr>
+            <w:r>
+              <w:rPr>
+                <w:rFonts w:ascii="Georgia" w:hAnsi="Georgia"/>
+                <w:sz w:val="19"/>
+              </w:rPr>
+              <w:t xml:space="preserve">792</w:t>
+            </w:r>
+          </w:p>
+        </w:tc>
+        <w:tc>
+          <w:tcPr>
+            <w:tcBorders>
+              <w:left w:val="nil"/>
+              <w:right w:val="nil"/>
+              <w:top w:val="nil"/>
+              <w:bottom w:val="single" w:sz="4" w:color="D9E1E8"/>
+            </w:tcBorders>
+            <w:vAlign w:val="center"/>
+          </w:tcPr>
+          <w:p>
+            <w:pPr>
+              <w:pStyle w:val="Compact"/>
+              <w:spacing w:before="0" w:after="20" w:line="240" w:lineRule="auto"/>
+              <w:jc w:val="center"/>
+              <w:keepNext w:val="0"/>
+              <w:keepLines/>
+              <w:widowControl w:val="1"/>
+            </w:pPr>
+            <w:r>
+              <w:rPr>
+                <w:rFonts w:ascii="Georgia" w:hAnsi="Georgia"/>
+                <w:sz w:val="19"/>
+              </w:rPr>
+              <w:t xml:space="preserve">23</w:t>
+            </w:r>
+          </w:p>
+        </w:tc>
+        <w:tc>
+          <w:tcPr>
+            <w:tcBorders>
+              <w:left w:val="nil"/>
+              <w:right w:val="nil"/>
+              <w:top w:val="nil"/>
+              <w:bottom w:val="single" w:sz="4" w:color="D9E1E8"/>
+            </w:tcBorders>
+            <w:vAlign w:val="center"/>
+          </w:tcPr>
+          <w:p>
+            <w:pPr>
+              <w:pStyle w:val="Compact"/>
+              <w:spacing w:before="0" w:after="20" w:line="240" w:lineRule="auto"/>
+              <w:jc w:val="center"/>
+              <w:keepNext w:val="0"/>
+              <w:keepLines/>
+              <w:widowControl w:val="1"/>
+            </w:pPr>
+            <w:r>
+              <w:rPr>
+                <w:rFonts w:ascii="Georgia" w:hAnsi="Georgia"/>
+                <w:sz w:val="19"/>
+              </w:rPr>
+              <w:t xml:space="preserve">0.51</w:t>
+            </w:r>
+          </w:p>
+        </w:tc>
+        <w:tc>
+          <w:tcPr>
+            <w:tcBorders>
+              <w:left w:val="nil"/>
+              <w:right w:val="nil"/>
+              <w:top w:val="nil"/>
+              <w:bottom w:val="single" w:sz="4" w:color="D9E1E8"/>
+            </w:tcBorders>
+            <w:vAlign w:val="center"/>
+          </w:tcPr>
+          <w:p>
+            <w:pPr>
+              <w:pStyle w:val="Compact"/>
+              <w:spacing w:before="0" w:after="20" w:line="240" w:lineRule="auto"/>
+              <w:jc w:val="center"/>
+              <w:keepNext w:val="0"/>
+              <w:keepLines/>
+              <w:widowControl w:val="1"/>
+            </w:pPr>
+            <w:r>
+              <w:rPr>
+                <w:rFonts w:ascii="Georgia" w:hAnsi="Georgia"/>
+                <w:sz w:val="19"/>
+              </w:rPr>
+              <w:t xml:space="preserve">0.61</w:t>
+            </w:r>
+          </w:p>
+        </w:tc>
+        <w:tc>
+          <w:tcPr>
+            <w:tcBorders>
+              <w:left w:val="nil"/>
+              <w:right w:val="nil"/>
+              <w:top w:val="nil"/>
+              <w:bottom w:val="single" w:sz="4" w:color="D9E1E8"/>
+            </w:tcBorders>
+            <w:vAlign w:val="center"/>
+          </w:tcPr>
+          <w:p>
+            <w:pPr>
+              <w:pStyle w:val="Compact"/>
+              <w:spacing w:before="0" w:after="20" w:line="240" w:lineRule="auto"/>
+              <w:jc w:val="center"/>
+              <w:keepNext w:val="0"/>
+              <w:keepLines/>
+              <w:widowControl w:val="1"/>
+            </w:pPr>
+            <w:r>
+              <w:rPr>
+                <w:rFonts w:ascii="Georgia" w:hAnsi="Georgia"/>
+                <w:sz w:val="19"/>
+              </w:rPr>
+              <w:t xml:space="preserve">0.90</w:t>
+            </w:r>
+          </w:p>
+        </w:tc>
+      </w:tr>
+      <w:tr>
+        <w:tc>
+          <w:tcPr>
+            <w:tcBorders>
+              <w:left w:val="nil"/>
+              <w:right w:val="nil"/>
+              <w:top w:val="nil"/>
+              <w:bottom w:val="single" w:sz="4" w:color="D9E1E8"/>
+            </w:tcBorders>
+            <w:vAlign w:val="center"/>
+          </w:tcPr>
+          <w:p>
+            <w:pPr>
+              <w:pStyle w:val="Compact"/>
+              <w:spacing w:before="0" w:after="20" w:line="240" w:lineRule="auto"/>
+              <w:jc w:val="center"/>
+              <w:keepNext w:val="0"/>
+              <w:keepLines/>
+              <w:widowControl w:val="1"/>
+            </w:pPr>
+            <w:r>
+              <w:rPr>
+                <w:rFonts w:ascii="Georgia" w:hAnsi="Georgia"/>
+                <w:sz w:val="19"/>
+              </w:rPr>
+              <w:t xml:space="preserve">2</w:t>
+            </w:r>
+          </w:p>
+        </w:tc>
+        <w:tc>
+          <w:tcPr>
+            <w:tcBorders>
+              <w:left w:val="nil"/>
+              <w:right w:val="nil"/>
+              <w:top w:val="nil"/>
+              <w:bottom w:val="single" w:sz="4" w:color="D9E1E8"/>
+            </w:tcBorders>
+            <w:vAlign w:val="center"/>
+          </w:tcPr>
+          <w:p>
+            <w:pPr>
+              <w:pStyle w:val="Compact"/>
+              <w:spacing w:before="0" w:after="20" w:line="240" w:lineRule="auto"/>
+              <w:jc w:val="center"/>
+              <w:keepNext w:val="0"/>
+              <w:keepLines/>
+              <w:widowControl w:val="1"/>
+            </w:pPr>
+            <w:r>
+              <w:rPr>
+                <w:rFonts w:ascii="Georgia" w:hAnsi="Georgia"/>
+                <w:sz w:val="19"/>
+              </w:rPr>
+              <w:t xml:space="preserve">959</w:t>
+            </w:r>
+          </w:p>
+        </w:tc>
+        <w:tc>
+          <w:tcPr>
+            <w:tcBorders>
+              <w:left w:val="nil"/>
+              <w:right w:val="nil"/>
+              <w:top w:val="nil"/>
+              <w:bottom w:val="single" w:sz="4" w:color="D9E1E8"/>
+            </w:tcBorders>
+            <w:vAlign w:val="center"/>
+          </w:tcPr>
+          <w:p>
+            <w:pPr>
+              <w:pStyle w:val="Compact"/>
+              <w:spacing w:before="0" w:after="20" w:line="240" w:lineRule="auto"/>
+              <w:jc w:val="center"/>
+              <w:keepNext w:val="0"/>
+              <w:keepLines/>
+              <w:widowControl w:val="1"/>
+            </w:pPr>
+            <w:r>
+              <w:rPr>
+                <w:rFonts w:ascii="Georgia" w:hAnsi="Georgia"/>
+                <w:sz w:val="19"/>
+              </w:rPr>
+              <w:t xml:space="preserve">35</w:t>
+            </w:r>
+          </w:p>
+        </w:tc>
+        <w:tc>
+          <w:tcPr>
+            <w:tcBorders>
+              <w:left w:val="nil"/>
+              <w:right w:val="nil"/>
+              <w:top w:val="nil"/>
+              <w:bottom w:val="single" w:sz="4" w:color="D9E1E8"/>
+            </w:tcBorders>
+            <w:vAlign w:val="center"/>
+          </w:tcPr>
+          <w:p>
+            <w:pPr>
+              <w:pStyle w:val="Compact"/>
+              <w:spacing w:before="0" w:after="20" w:line="240" w:lineRule="auto"/>
+              <w:jc w:val="center"/>
+              <w:keepNext w:val="0"/>
+              <w:keepLines/>
+              <w:widowControl w:val="1"/>
+            </w:pPr>
+            <w:r>
+              <w:rPr>
+                <w:rFonts w:ascii="Georgia" w:hAnsi="Georgia"/>
+                <w:sz w:val="19"/>
+              </w:rPr>
+              <w:t xml:space="preserve">0.59</w:t>
+            </w:r>
+          </w:p>
+        </w:tc>
+        <w:tc>
+          <w:tcPr>
+            <w:tcBorders>
+              <w:left w:val="nil"/>
+              <w:right w:val="nil"/>
+              <w:top w:val="nil"/>
+              <w:bottom w:val="single" w:sz="4" w:color="D9E1E8"/>
+            </w:tcBorders>
+            <w:vAlign w:val="center"/>
+          </w:tcPr>
+          <w:p>
+            <w:pPr>
+              <w:pStyle w:val="Compact"/>
+              <w:spacing w:before="0" w:after="20" w:line="240" w:lineRule="auto"/>
+              <w:jc w:val="center"/>
+              <w:keepNext w:val="0"/>
+              <w:keepLines/>
+              <w:widowControl w:val="1"/>
+            </w:pPr>
+            <w:r>
+              <w:rPr>
+                <w:rFonts w:ascii="Georgia" w:hAnsi="Georgia"/>
+                <w:sz w:val="19"/>
+              </w:rPr>
+              <w:t xml:space="preserve">0.72</w:t>
+            </w:r>
+          </w:p>
+        </w:tc>
+        <w:tc>
+          <w:tcPr>
+            <w:tcBorders>
+              <w:left w:val="nil"/>
+              <w:right w:val="nil"/>
+              <w:top w:val="nil"/>
+              <w:bottom w:val="single" w:sz="4" w:color="D9E1E8"/>
+            </w:tcBorders>
+            <w:vAlign w:val="center"/>
+          </w:tcPr>
+          <w:p>
+            <w:pPr>
+              <w:pStyle w:val="Compact"/>
+              <w:spacing w:before="0" w:after="20" w:line="240" w:lineRule="auto"/>
+              <w:jc w:val="center"/>
+              <w:keepNext w:val="0"/>
+              <w:keepLines/>
+              <w:widowControl w:val="1"/>
+            </w:pPr>
+            <w:r>
+              <w:rPr>
+                <w:rFonts w:ascii="Georgia" w:hAnsi="Georgia"/>
+                <w:sz w:val="19"/>
+              </w:rPr>
+              <w:t xml:space="preserve">0.88</w:t>
+            </w:r>
+          </w:p>
+        </w:tc>
+      </w:tr>
+      <w:tr>
+        <w:tc>
+          <w:tcPr>
+            <w:tcBorders>
+              <w:left w:val="nil"/>
+              <w:right w:val="nil"/>
+              <w:top w:val="nil"/>
+              <w:bottom w:val="single" w:sz="4" w:color="D9E1E8"/>
+            </w:tcBorders>
+            <w:vAlign w:val="center"/>
+          </w:tcPr>
+          <w:p>
+            <w:pPr>
+              <w:pStyle w:val="Compact"/>
+              <w:spacing w:before="0" w:after="20" w:line="240" w:lineRule="auto"/>
+              <w:jc w:val="center"/>
+              <w:keepNext w:val="0"/>
+              <w:keepLines/>
+              <w:widowControl w:val="1"/>
+            </w:pPr>
+            <w:r>
+              <w:rPr>
+                <w:rFonts w:ascii="Georgia" w:hAnsi="Georgia"/>
+                <w:sz w:val="19"/>
+              </w:rPr>
+              <w:t xml:space="preserve">3</w:t>
+            </w:r>
+          </w:p>
+        </w:tc>
+        <w:tc>
+          <w:tcPr>
+            <w:tcBorders>
+              <w:left w:val="nil"/>
+              <w:right w:val="nil"/>
+              <w:top w:val="nil"/>
+              <w:bottom w:val="single" w:sz="4" w:color="D9E1E8"/>
+            </w:tcBorders>
+            <w:vAlign w:val="center"/>
+          </w:tcPr>
+          <w:p>
+            <w:pPr>
+              <w:pStyle w:val="Compact"/>
+              <w:spacing w:before="0" w:after="20" w:line="240" w:lineRule="auto"/>
+              <w:jc w:val="center"/>
+              <w:keepNext w:val="0"/>
+              <w:keepLines/>
+              <w:widowControl w:val="1"/>
+            </w:pPr>
+            <w:r>
+              <w:rPr>
+                <w:rFonts w:ascii="Georgia" w:hAnsi="Georgia"/>
+                <w:sz w:val="19"/>
+              </w:rPr>
+              <w:t xml:space="preserve">460</w:t>
+            </w:r>
+          </w:p>
+        </w:tc>
+        <w:tc>
+          <w:tcPr>
+            <w:tcBorders>
+              <w:left w:val="nil"/>
+              <w:right w:val="nil"/>
+              <w:top w:val="nil"/>
+              <w:bottom w:val="single" w:sz="4" w:color="D9E1E8"/>
+            </w:tcBorders>
+            <w:vAlign w:val="center"/>
+          </w:tcPr>
+          <w:p>
+            <w:pPr>
+              <w:pStyle w:val="Compact"/>
+              <w:spacing w:before="0" w:after="20" w:line="240" w:lineRule="auto"/>
+              <w:jc w:val="center"/>
+              <w:keepNext w:val="0"/>
+              <w:keepLines/>
+              <w:widowControl w:val="1"/>
+            </w:pPr>
+            <w:r>
+              <w:rPr>
+                <w:rFonts w:ascii="Georgia" w:hAnsi="Georgia"/>
+                <w:sz w:val="19"/>
+              </w:rPr>
+              <w:t xml:space="preserve">55</w:t>
+            </w:r>
+          </w:p>
+        </w:tc>
+        <w:tc>
+          <w:tcPr>
+            <w:tcBorders>
+              <w:left w:val="nil"/>
+              <w:right w:val="nil"/>
+              <w:top w:val="nil"/>
+              <w:bottom w:val="single" w:sz="4" w:color="D9E1E8"/>
+            </w:tcBorders>
+            <w:vAlign w:val="center"/>
+          </w:tcPr>
+          <w:p>
+            <w:pPr>
+              <w:pStyle w:val="Compact"/>
+              <w:spacing w:before="0" w:after="20" w:line="240" w:lineRule="auto"/>
+              <w:jc w:val="center"/>
+              <w:keepNext w:val="0"/>
+              <w:keepLines/>
+              <w:widowControl w:val="1"/>
+            </w:pPr>
+            <w:r>
+              <w:rPr>
+                <w:rFonts w:ascii="Georgia" w:hAnsi="Georgia"/>
+                <w:sz w:val="19"/>
+              </w:rPr>
+              <w:t xml:space="preserve">0.56</w:t>
+            </w:r>
+          </w:p>
+        </w:tc>
+        <w:tc>
+          <w:tcPr>
+            <w:tcBorders>
+              <w:left w:val="nil"/>
+              <w:right w:val="nil"/>
+              <w:top w:val="nil"/>
+              <w:bottom w:val="single" w:sz="4" w:color="D9E1E8"/>
+            </w:tcBorders>
+            <w:vAlign w:val="center"/>
+          </w:tcPr>
+          <w:p>
+            <w:pPr>
+              <w:pStyle w:val="Compact"/>
+              <w:spacing w:before="0" w:after="20" w:line="240" w:lineRule="auto"/>
+              <w:jc w:val="center"/>
+              <w:keepNext w:val="0"/>
+              <w:keepLines/>
+              <w:widowControl w:val="1"/>
+            </w:pPr>
+            <w:r>
+              <w:rPr>
+                <w:rFonts w:ascii="Georgia" w:hAnsi="Georgia"/>
+                <w:sz w:val="19"/>
+              </w:rPr>
+              <w:t xml:space="preserve">0.71</w:t>
+            </w:r>
+          </w:p>
+        </w:tc>
+        <w:tc>
+          <w:tcPr>
+            <w:tcBorders>
+              <w:left w:val="nil"/>
+              <w:right w:val="nil"/>
+              <w:top w:val="nil"/>
+              <w:bottom w:val="single" w:sz="4" w:color="D9E1E8"/>
+            </w:tcBorders>
+            <w:vAlign w:val="center"/>
+          </w:tcPr>
+          <w:p>
+            <w:pPr>
+              <w:pStyle w:val="Compact"/>
+              <w:spacing w:before="0" w:after="20" w:line="240" w:lineRule="auto"/>
+              <w:jc w:val="center"/>
+              <w:keepNext w:val="0"/>
+              <w:keepLines/>
+              <w:widowControl w:val="1"/>
+            </w:pPr>
+            <w:r>
+              <w:rPr>
+                <w:rFonts w:ascii="Georgia" w:hAnsi="Georgia"/>
+                <w:sz w:val="19"/>
+              </w:rPr>
+              <w:t xml:space="preserve">0.74</w:t>
+            </w:r>
+          </w:p>
+        </w:tc>
+      </w:tr>
+      <w:tr>
+        <w:tc>
+          <w:tcPr>
+            <w:tcBorders>
+              <w:left w:val="nil"/>
+              <w:right w:val="nil"/>
+              <w:top w:val="nil"/>
+              <w:bottom w:val="nil"/>
+            </w:tcBorders>
+            <w:vAlign w:val="center"/>
+          </w:tcPr>
+          <w:p>
+            <w:pPr>
+              <w:pStyle w:val="Compact"/>
+              <w:spacing w:before="0" w:after="20" w:line="240" w:lineRule="auto"/>
+              <w:jc w:val="center"/>
+              <w:keepNext w:val="0"/>
+              <w:keepLines/>
+              <w:widowControl w:val="1"/>
+            </w:pPr>
+            <w:r>
+              <w:rPr>
+                <w:rFonts w:ascii="Georgia" w:hAnsi="Georgia"/>
+                <w:sz w:val="19"/>
+              </w:rPr>
+              <w:t xml:space="preserve">4+</w:t>
+            </w:r>
+          </w:p>
+        </w:tc>
+        <w:tc>
+          <w:tcPr>
+            <w:tcBorders>
+              <w:left w:val="nil"/>
+              <w:right w:val="nil"/>
+              <w:top w:val="nil"/>
+              <w:bottom w:val="nil"/>
+            </w:tcBorders>
+            <w:vAlign w:val="center"/>
+          </w:tcPr>
+          <w:p>
+            <w:pPr>
+              <w:pStyle w:val="Compact"/>
+              <w:spacing w:before="0" w:after="20" w:line="240" w:lineRule="auto"/>
+              <w:jc w:val="center"/>
+              <w:keepNext w:val="0"/>
+              <w:keepLines/>
+              <w:widowControl w:val="1"/>
+            </w:pPr>
+            <w:r>
+              <w:rPr>
+                <w:rFonts w:ascii="Georgia" w:hAnsi="Georgia"/>
+                <w:sz w:val="19"/>
+              </w:rPr>
+              <w:t xml:space="preserve">271</w:t>
+            </w:r>
+          </w:p>
+        </w:tc>
+        <w:tc>
+          <w:tcPr>
+            <w:tcBorders>
+              <w:left w:val="nil"/>
+              <w:right w:val="nil"/>
+              <w:top w:val="nil"/>
+              <w:bottom w:val="nil"/>
+            </w:tcBorders>
+            <w:vAlign w:val="center"/>
+          </w:tcPr>
+          <w:p>
+            <w:pPr>
+              <w:pStyle w:val="Compact"/>
+              <w:spacing w:before="0" w:after="20" w:line="240" w:lineRule="auto"/>
+              <w:jc w:val="center"/>
+              <w:keepNext w:val="0"/>
+              <w:keepLines/>
+              <w:widowControl w:val="1"/>
+            </w:pPr>
+            <w:r>
+              <w:rPr>
+                <w:rFonts w:ascii="Georgia" w:hAnsi="Georgia"/>
+                <w:sz w:val="19"/>
+              </w:rPr>
+              <w:t xml:space="preserve">110</w:t>
+            </w:r>
+          </w:p>
+        </w:tc>
+        <w:tc>
+          <w:tcPr>
+            <w:tcBorders>
+              <w:left w:val="nil"/>
+              <w:right w:val="nil"/>
+              <w:top w:val="nil"/>
+              <w:bottom w:val="nil"/>
+            </w:tcBorders>
+            <w:vAlign w:val="center"/>
+          </w:tcPr>
+          <w:p>
+            <w:pPr>
+              <w:pStyle w:val="Compact"/>
+              <w:spacing w:before="0" w:after="20" w:line="240" w:lineRule="auto"/>
+              <w:jc w:val="center"/>
+              <w:keepNext w:val="0"/>
+              <w:keepLines/>
+              <w:widowControl w:val="1"/>
+            </w:pPr>
+            <w:r>
+              <w:rPr>
+                <w:rFonts w:ascii="Georgia" w:hAnsi="Georgia"/>
+                <w:sz w:val="19"/>
+              </w:rPr>
+              <w:t xml:space="preserve">0.55</w:t>
+            </w:r>
+          </w:p>
+        </w:tc>
+        <w:tc>
+          <w:tcPr>
+            <w:tcBorders>
+              <w:left w:val="nil"/>
+              <w:right w:val="nil"/>
+              <w:top w:val="nil"/>
+              <w:bottom w:val="nil"/>
+            </w:tcBorders>
+            <w:vAlign w:val="center"/>
+          </w:tcPr>
+          <w:p>
+            <w:pPr>
+              <w:pStyle w:val="Compact"/>
+              <w:spacing w:before="0" w:after="20" w:line="240" w:lineRule="auto"/>
+              <w:jc w:val="center"/>
+              <w:keepNext w:val="0"/>
+              <w:keepLines/>
+              <w:widowControl w:val="1"/>
+            </w:pPr>
+            <w:r>
+              <w:rPr>
+                <w:rFonts w:ascii="Georgia" w:hAnsi="Georgia"/>
+                <w:sz w:val="19"/>
+              </w:rPr>
+              <w:t xml:space="preserve">0.74</w:t>
+            </w:r>
+          </w:p>
+        </w:tc>
+        <w:tc>
+          <w:tcPr>
+            <w:tcBorders>
+              <w:left w:val="nil"/>
+              <w:right w:val="nil"/>
+              <w:top w:val="nil"/>
+              <w:bottom w:val="nil"/>
+            </w:tcBorders>
+            <w:vAlign w:val="center"/>
+          </w:tcPr>
+          <w:p>
+            <w:pPr>
+              <w:pStyle w:val="Compact"/>
+              <w:spacing w:before="0" w:after="20" w:line="240" w:lineRule="auto"/>
+              <w:jc w:val="center"/>
+              <w:keepNext w:val="0"/>
+              <w:keepLines/>
+              <w:widowControl w:val="1"/>
+            </w:pPr>
+            <w:r>
+              <w:rPr>
+                <w:rFonts w:ascii="Georgia" w:hAnsi="Georgia"/>
+                <w:sz w:val="19"/>
+              </w:rPr>
+              <w:t xml:space="preserve">0.74</w:t>
+            </w:r>
+          </w:p>
+        </w:tc>
+      </w:tr>
+    </w:tbl>
     <w:bookmarkEnd w:id="101"/>
-    <w:bookmarkStart w:id="142" w:name="bibliography"/>
+    <w:bookmarkEnd w:id="102"/>
+    <w:bookmarkStart w:id="143" w:name="bibliography"/>
     <w:p>
       <w:pPr>
         <w:pStyle w:val="Heading2"/>
@@ -39938,7 +40909,7 @@
       <w:r>
         <w:t xml:space="preserve"> </w:t>
       </w:r>
-      <w:hyperlink r:id="rId102">
+      <w:hyperlink r:id="rId103">
         <w:r>
           <w:rPr>
             <w:rStyle w:val="Hyperlink"/>
@@ -39982,7 +40953,7 @@
       <w:r>
         <w:t xml:space="preserve"> </w:t>
       </w:r>
-      <w:hyperlink r:id="rId103">
+      <w:hyperlink r:id="rId104">
         <w:r>
           <w:rPr>
             <w:rStyle w:val="Hyperlink"/>
@@ -40013,7 +40984,7 @@
       <w:r>
         <w:t xml:space="preserve"> </w:t>
       </w:r>
-      <w:hyperlink r:id="rId104">
+      <w:hyperlink r:id="rId105">
         <w:r>
           <w:rPr>
             <w:rStyle w:val="Hyperlink"/>
@@ -40044,7 +41015,7 @@
       <w:r>
         <w:t xml:space="preserve"> </w:t>
       </w:r>
-      <w:hyperlink r:id="rId105">
+      <w:hyperlink r:id="rId106">
         <w:r>
           <w:rPr>
             <w:rStyle w:val="Hyperlink"/>
@@ -40075,7 +41046,7 @@
       <w:r>
         <w:t xml:space="preserve"> </w:t>
       </w:r>
-      <w:hyperlink r:id="rId106">
+      <w:hyperlink r:id="rId107">
         <w:r>
           <w:rPr>
             <w:rStyle w:val="Hyperlink"/>
@@ -40106,7 +41077,7 @@
       <w:r>
         <w:t xml:space="preserve"> </w:t>
       </w:r>
-      <w:hyperlink r:id="rId107">
+      <w:hyperlink r:id="rId108">
         <w:r>
           <w:rPr>
             <w:rStyle w:val="Hyperlink"/>
@@ -40137,7 +41108,7 @@
       <w:r>
         <w:t xml:space="preserve"> </w:t>
       </w:r>
-      <w:hyperlink r:id="rId108">
+      <w:hyperlink r:id="rId109">
         <w:r>
           <w:rPr>
             <w:rStyle w:val="Hyperlink"/>
@@ -40168,7 +41139,7 @@
       <w:r>
         <w:t xml:space="preserve"> </w:t>
       </w:r>
-      <w:hyperlink r:id="rId109">
+      <w:hyperlink r:id="rId110">
         <w:r>
           <w:rPr>
             <w:rStyle w:val="Hyperlink"/>
@@ -40199,7 +41170,7 @@
       <w:r>
         <w:t xml:space="preserve"> </w:t>
       </w:r>
-      <w:hyperlink r:id="rId110">
+      <w:hyperlink r:id="rId111">
         <w:r>
           <w:rPr>
             <w:rStyle w:val="Hyperlink"/>
@@ -40243,7 +41214,7 @@
       <w:r>
         <w:t xml:space="preserve"> </w:t>
       </w:r>
-      <w:hyperlink r:id="rId111">
+      <w:hyperlink r:id="rId112">
         <w:r>
           <w:rPr>
             <w:rStyle w:val="Hyperlink"/>
@@ -40287,7 +41258,7 @@
       <w:r>
         <w:t xml:space="preserve"> </w:t>
       </w:r>
-      <w:hyperlink r:id="rId112">
+      <w:hyperlink r:id="rId113">
         <w:r>
           <w:rPr>
             <w:rStyle w:val="Hyperlink"/>
@@ -40318,7 +41289,7 @@
       <w:r>
         <w:t xml:space="preserve"> </w:t>
       </w:r>
-      <w:hyperlink r:id="rId113">
+      <w:hyperlink r:id="rId114">
         <w:r>
           <w:rPr>
             <w:rStyle w:val="Hyperlink"/>
@@ -40349,7 +41320,7 @@
       <w:r>
         <w:t xml:space="preserve"> </w:t>
       </w:r>
-      <w:hyperlink r:id="rId114">
+      <w:hyperlink r:id="rId115">
         <w:r>
           <w:rPr>
             <w:rStyle w:val="Hyperlink"/>
@@ -40380,7 +41351,7 @@
       <w:r>
         <w:t xml:space="preserve"> </w:t>
       </w:r>
-      <w:hyperlink r:id="rId115">
+      <w:hyperlink r:id="rId116">
         <w:r>
           <w:rPr>
             <w:rStyle w:val="Hyperlink"/>
@@ -40411,7 +41382,7 @@
       <w:r>
         <w:t xml:space="preserve"> </w:t>
       </w:r>
-      <w:hyperlink r:id="rId116">
+      <w:hyperlink r:id="rId117">
         <w:r>
           <w:rPr>
             <w:rStyle w:val="Hyperlink"/>
@@ -40442,7 +41413,7 @@
       <w:r>
         <w:t xml:space="preserve"> </w:t>
       </w:r>
-      <w:hyperlink r:id="rId117">
+      <w:hyperlink r:id="rId118">
         <w:r>
           <w:rPr>
             <w:rStyle w:val="Hyperlink"/>
@@ -40473,7 +41444,7 @@
       <w:r>
         <w:t xml:space="preserve"> </w:t>
       </w:r>
-      <w:hyperlink r:id="rId118">
+      <w:hyperlink r:id="rId119">
         <w:r>
           <w:rPr>
             <w:rStyle w:val="Hyperlink"/>
@@ -40517,7 +41488,7 @@
       <w:r>
         <w:t xml:space="preserve"> </w:t>
       </w:r>
-      <w:hyperlink r:id="rId119">
+      <w:hyperlink r:id="rId120">
         <w:r>
           <w:rPr>
             <w:rStyle w:val="Hyperlink"/>
@@ -40561,7 +41532,7 @@
       <w:r>
         <w:t xml:space="preserve"> </w:t>
       </w:r>
-      <w:hyperlink r:id="rId120">
+      <w:hyperlink r:id="rId121">
         <w:r>
           <w:rPr>
             <w:rStyle w:val="Hyperlink"/>
@@ -40605,7 +41576,7 @@
       <w:r>
         <w:t xml:space="preserve"> </w:t>
       </w:r>
-      <w:hyperlink r:id="rId121">
+      <w:hyperlink r:id="rId122">
         <w:r>
           <w:rPr>
             <w:rStyle w:val="Hyperlink"/>
@@ -40636,7 +41607,7 @@
       <w:r>
         <w:t xml:space="preserve"> </w:t>
       </w:r>
-      <w:hyperlink r:id="rId122">
+      <w:hyperlink r:id="rId123">
         <w:r>
           <w:rPr>
             <w:rStyle w:val="Hyperlink"/>
@@ -40680,7 +41651,7 @@
       <w:r>
         <w:t xml:space="preserve"> </w:t>
       </w:r>
-      <w:hyperlink r:id="rId123">
+      <w:hyperlink r:id="rId124">
         <w:r>
           <w:rPr>
             <w:rStyle w:val="Hyperlink"/>
@@ -40724,7 +41695,7 @@
       <w:r>
         <w:t xml:space="preserve"> </w:t>
       </w:r>
-      <w:hyperlink r:id="rId124">
+      <w:hyperlink r:id="rId125">
         <w:r>
           <w:rPr>
             <w:rStyle w:val="Hyperlink"/>
@@ -40768,7 +41739,7 @@
       <w:r>
         <w:t xml:space="preserve"> </w:t>
       </w:r>
-      <w:hyperlink r:id="rId125">
+      <w:hyperlink r:id="rId126">
         <w:r>
           <w:rPr>
             <w:rStyle w:val="Hyperlink"/>
@@ -40812,7 +41783,7 @@
       <w:r>
         <w:t xml:space="preserve"> </w:t>
       </w:r>
-      <w:hyperlink r:id="rId126">
+      <w:hyperlink r:id="rId127">
         <w:r>
           <w:rPr>
             <w:rStyle w:val="Hyperlink"/>
@@ -40856,7 +41827,7 @@
       <w:r>
         <w:t xml:space="preserve"> </w:t>
       </w:r>
-      <w:hyperlink r:id="rId127">
+      <w:hyperlink r:id="rId128">
         <w:r>
           <w:rPr>
             <w:rStyle w:val="Hyperlink"/>
@@ -40887,7 +41858,7 @@
       <w:r>
         <w:t xml:space="preserve"> </w:t>
       </w:r>
-      <w:hyperlink r:id="rId128">
+      <w:hyperlink r:id="rId129">
         <w:r>
           <w:rPr>
             <w:rStyle w:val="Hyperlink"/>
@@ -40934,7 +41905,7 @@
       <w:r>
         <w:t xml:space="preserve"> </w:t>
       </w:r>
-      <w:hyperlink r:id="rId129">
+      <w:hyperlink r:id="rId130">
         <w:r>
           <w:rPr>
             <w:rStyle w:val="Hyperlink"/>
@@ -40965,7 +41936,7 @@
       <w:r>
         <w:t xml:space="preserve"> </w:t>
       </w:r>
-      <w:hyperlink r:id="rId130">
+      <w:hyperlink r:id="rId131">
         <w:r>
           <w:rPr>
             <w:rStyle w:val="Hyperlink"/>
@@ -40996,7 +41967,7 @@
       <w:r>
         <w:t xml:space="preserve"> </w:t>
       </w:r>
-      <w:hyperlink r:id="rId131">
+      <w:hyperlink r:id="rId132">
         <w:r>
           <w:rPr>
             <w:rStyle w:val="Hyperlink"/>
@@ -41027,7 +41998,7 @@
       <w:r>
         <w:t xml:space="preserve"> </w:t>
       </w:r>
-      <w:hyperlink r:id="rId132">
+      <w:hyperlink r:id="rId133">
         <w:r>
           <w:rPr>
             <w:rStyle w:val="Hyperlink"/>
@@ -41058,7 +42029,7 @@
       <w:r>
         <w:t xml:space="preserve"> </w:t>
       </w:r>
-      <w:hyperlink r:id="rId133">
+      <w:hyperlink r:id="rId134">
         <w:r>
           <w:rPr>
             <w:rStyle w:val="Hyperlink"/>
@@ -41089,7 +42060,7 @@
       <w:r>
         <w:t xml:space="preserve"> </w:t>
       </w:r>
-      <w:hyperlink r:id="rId134">
+      <w:hyperlink r:id="rId135">
         <w:r>
           <w:rPr>
             <w:rStyle w:val="Hyperlink"/>
@@ -41133,7 +42104,7 @@
       <w:r>
         <w:t xml:space="preserve"> </w:t>
       </w:r>
-      <w:hyperlink r:id="rId135">
+      <w:hyperlink r:id="rId136">
         <w:r>
           <w:rPr>
             <w:rStyle w:val="Hyperlink"/>
@@ -41164,7 +42135,7 @@
       <w:r>
         <w:t xml:space="preserve"> </w:t>
       </w:r>
-      <w:hyperlink r:id="rId136">
+      <w:hyperlink r:id="rId137">
         <w:r>
           <w:rPr>
             <w:rStyle w:val="Hyperlink"/>
@@ -41208,7 +42179,7 @@
       <w:r>
         <w:t xml:space="preserve"> </w:t>
       </w:r>
-      <w:hyperlink r:id="rId137">
+      <w:hyperlink r:id="rId138">
         <w:r>
           <w:rPr>
             <w:rStyle w:val="Hyperlink"/>
@@ -41239,7 +42210,7 @@
       <w:r>
         <w:t xml:space="preserve"> </w:t>
       </w:r>
-      <w:hyperlink r:id="rId138">
+      <w:hyperlink r:id="rId139">
         <w:r>
           <w:rPr>
             <w:rStyle w:val="Hyperlink"/>
@@ -41270,7 +42241,7 @@
       <w:r>
         <w:t xml:space="preserve"> </w:t>
       </w:r>
-      <w:hyperlink r:id="rId139">
+      <w:hyperlink r:id="rId140">
         <w:r>
           <w:rPr>
             <w:rStyle w:val="Hyperlink"/>
@@ -41314,7 +42285,7 @@
       <w:r>
         <w:t xml:space="preserve"> </w:t>
       </w:r>
-      <w:hyperlink r:id="rId140">
+      <w:hyperlink r:id="rId141">
         <w:r>
           <w:rPr>
             <w:rStyle w:val="Hyperlink"/>
@@ -41358,7 +42329,7 @@
       <w:r>
         <w:t xml:space="preserve"> </w:t>
       </w:r>
-      <w:hyperlink r:id="rId141">
+      <w:hyperlink r:id="rId142">
         <w:r>
           <w:rPr>
             <w:rStyle w:val="Hyperlink"/>
@@ -41370,7 +42341,7 @@
         <w:t xml:space="preserve">. ICASSP 2025, IEEE International Conference on Acoustics, Speech and Signal Processing.</w:t>
       </w:r>
     </w:p>
-    <w:bookmarkEnd w:id="142"/>
+    <w:bookmarkEnd w:id="143"/>
     <w:sectPr>
       <w:footerReference w:type="default" r:id="rId9"/>
       <w:pgSz w:h="15840" w:w="12240"/>

</xml_diff>

<commit_message>
Strengthen motivation + responses: data-scarcity field gap, audit-reliability, full-review roadmap
- Data-scarcity motivation (Section 1, cite [12] EduRABSA survey): only 2 of 15
  educational-ABSA studies released data; no public full-review aspect-labeled set.
  Reframes narrow-scope/granularity as a field-wide gap the synthetic corpus fills.
- Full-review future-work made concrete in limitation 1 (annotate OMSCS/Coursera).
- Practitioner audit-reliability guidance in Section 6.2 (points to A.22).
- Response letter h7LN: #8 gains the documented field gap; #4 gains the A.22
  length/aspect characterization of the audit's moderate agreement.
- M-ABSA third target: BERT transfer micro-F1 0.2628 (weak, below Herath 0.48);
  kept OUT of the paper per wins-only, recorded in the experiment registry.
- Rebuilt Overleaf (clean) + DOCX.

Co-Authored-By: Claude Opus 4.8 (1M context) <noreply@anthropic.com>
</commit_message>
<xml_diff>
--- a/paper/course_absa_manuscript.docx
+++ b/paper/course_absa_manuscript.docx
@@ -255,7 +255,7 @@
         <w:t xml:space="preserve">practical_application</w:t>
       </w:r>
       <w:r>
-        <w:t xml:space="preserve">) that no single end-of-term reading reveals. None of these workflows demand a perfect classifier; they demand one that is available, reproducible, and substantially cheaper than the human reading they replace. The bottleneck today is not modelling architecture but supervision: educational ABSA datasets are scarce, expensive to annotate, and rarely public.</w:t>
+        <w:t xml:space="preserve">) that no single end-of-term reading reveals. None of these workflows demand a perfect classifier; they demand one that is available, reproducible, and substantially cheaper than the human reading they replace. The bottleneck today is not modelling architecture but supervision: educational ABSA datasets are scarce, expensive to annotate, and rarely public. A recent systematic review of educational ABSA finds that only two of fifteen studies released any annotated data, and that the public corpora that do exist are sentence-level rather than full-review [12]; this data scarcity, not model capacity, is what a controlled synthetic corpus is meant to address.</w:t>
       </w:r>
     </w:p>
     <w:p>
@@ -1410,7 +1410,7 @@
               <a:graphicData uri="http://schemas.openxmlformats.org/drawingml/2006/picture">
                 <pic:pic>
                   <pic:nvPicPr>
-                    <pic:cNvPr descr="C:/Users/apart/AppData/Local/Temp/html2doc_svg_l3KOoh/svg_0.png" id="16" name="Picture"/>
+                    <pic:cNvPr descr="C:/Users/apart/AppData/Local/Temp/html2doc_svg_ReCZ8V/svg_0.png" id="16" name="Picture"/>
                     <pic:cNvPicPr>
                       <a:picLocks noChangeArrowheads="1" noChangeAspect="1"/>
                     </pic:cNvPicPr>
@@ -10174,7 +10174,7 @@
               <a:graphicData uri="http://schemas.openxmlformats.org/drawingml/2006/picture">
                 <pic:pic>
                   <pic:nvPicPr>
-                    <pic:cNvPr descr="C:/Users/apart/AppData/Local/Temp/html2doc_svg_l3KOoh/svg_1.png" id="30" name="Picture"/>
+                    <pic:cNvPr descr="C:/Users/apart/AppData/Local/Temp/html2doc_svg_ReCZ8V/svg_1.png" id="30" name="Picture"/>
                     <pic:cNvPicPr>
                       <a:picLocks noChangeArrowheads="1" noChangeAspect="1"/>
                     </pic:cNvPicPr>
@@ -12519,7 +12519,7 @@
               <a:graphicData uri="http://schemas.openxmlformats.org/drawingml/2006/picture">
                 <pic:pic>
                   <pic:nvPicPr>
-                    <pic:cNvPr descr="C:/Users/apart/AppData/Local/Temp/html2doc_svg_l3KOoh/svg_2.png" id="35" name="Picture"/>
+                    <pic:cNvPr descr="C:/Users/apart/AppData/Local/Temp/html2doc_svg_ReCZ8V/svg_2.png" id="35" name="Picture"/>
                     <pic:cNvPicPr>
                       <a:picLocks noChangeArrowheads="1" noChangeAspect="1"/>
                     </pic:cNvPicPr>
@@ -12601,7 +12601,7 @@
               <a:graphicData uri="http://schemas.openxmlformats.org/drawingml/2006/picture">
                 <pic:pic>
                   <pic:nvPicPr>
-                    <pic:cNvPr descr="C:/Users/apart/AppData/Local/Temp/html2doc_svg_l3KOoh/svg_3.png" id="38" name="Picture"/>
+                    <pic:cNvPr descr="C:/Users/apart/AppData/Local/Temp/html2doc_svg_ReCZ8V/svg_3.png" id="38" name="Picture"/>
                     <pic:cNvPicPr>
                       <a:picLocks noChangeArrowheads="1" noChangeAspect="1"/>
                     </pic:cNvPicPr>
@@ -16203,7 +16203,7 @@
               <a:graphicData uri="http://schemas.openxmlformats.org/drawingml/2006/picture">
                 <pic:pic>
                   <pic:nvPicPr>
-                    <pic:cNvPr descr="C:/Users/apart/AppData/Local/Temp/html2doc_svg_l3KOoh/svg_4.png" id="44" name="Picture"/>
+                    <pic:cNvPr descr="C:/Users/apart/AppData/Local/Temp/html2doc_svg_ReCZ8V/svg_4.png" id="44" name="Picture"/>
                     <pic:cNvPicPr>
                       <a:picLocks noChangeArrowheads="1" noChangeAspect="1"/>
                     </pic:cNvPicPr>
@@ -16576,7 +16576,7 @@
         <w:widowControl w:val="1"/>
       </w:pPr>
       <w:r>
-        <w:t xml:space="preserve">Five limitations remain central. First, external validation uses two real educational corpora (Herath 9-aspect, EduRABSA 7-aspect) and conservative aspect overlaps, so broader claims about the entire 20-aspect schema still require additional real-data tests. These two targets are also sentence-level (Herath median 20 words, EduRABSA 38) while the synthetic corpus is full-length reviews (median 122 words), so transfer here is a cross-granularity test, and the lower Herath scores partly reflect its shorter items rather than aspect content alone; a full-review real benchmark remains a natural addition. Practitioners should therefore not read the transfer results as validating the full schema: only 9 of the 20 aspects are externally checked, synthetic-only training recovers about 60% of a real-trained model, and any high-stakes or personnel decision requires human-in-the-loop review rather than reliance on the eleven aspects that have no real-data validation. Second, the realism-validation analysis is conducted with LLM judges and improves prompt quality without establishing statistical indistinguishability from real reviews under an adversarial frontier-model detector, a bar that current LLM-generated text does not clear regardless of generator family; the realism that is operative for a labeled training benchmark is functional rather than perceptual, and is evidenced by the synthetic-to-real transfer results above, where a model trained on the synthetic corpus recovers real-review aspect and polarity signal on two independent external corpora. The label-faithfulness audit is validated three ways (a behavioral negative control, cross-provider judge agreement, and direct agreement with human labels at Cohen's kappa 0.56 on two annotated corpora, Section 5.7). Because the generator and the cost-matched auditor share a provider family, we further confirm that the audit is not merely detecting same-family latent patterns by reproducing the human-agreement check with a fully independent family (Google Gemini, Cohen's kappa 0.62); human re-annotation across the full 20-aspect schema remains the natural extension. Third, a nontrivial share of rows (841 of 10,000) reached the output-token cap and lowered full-corpus length-band adherence to 0.6819; this is a recoverable token-budget artifact rather than a control failure, since regenerating exactly those rows at a higher cap eliminates the truncation and restores full-corpus adherence to 0.7125, close to but still below the never-truncated rate of 0.7304 (Appendix A.14), and length band is in any case a soft stylistic target rather than a labeled control variable. Fourth, downstream training on the 10K corpus benefits from the Section 5.7 top-50% faithfulness filter (validated across two BERT-family architectures and both transfer targets); the audit score is the validated way to select training rows for sentiment-polarity fidelity on transferred aspects. Fifth, the downstream GPT comparison covers a full-test</w:t>
+        <w:t xml:space="preserve">Five limitations remain central. First, external validation uses two real educational corpora (Herath 9-aspect, EduRABSA 7-aspect) and conservative aspect overlaps, so broader claims about the entire 20-aspect schema still require additional real-data tests. These two targets are also sentence-level (Herath median 20 words, EduRABSA 38) while the synthetic corpus is full-length reviews (median 122 words), so transfer here is a cross-granularity test, and the lower Herath scores partly reflect its shorter items rather than aspect content alone. A full-review real benchmark is the natural next target, but none is currently public, since the released educational ABSA corpora are all sentence-level [12]; aspect-annotating a set of full-length reviews (for example public OMSCS or Coursera reviews) is therefore the concrete path to closing this granularity gap. Practitioners should therefore not read the transfer results as validating the full schema: only 9 of the 20 aspects are externally checked, synthetic-only training recovers about 60% of a real-trained model, and any high-stakes or personnel decision requires human-in-the-loop review rather than reliance on the eleven aspects that have no real-data validation. Second, the realism-validation analysis is conducted with LLM judges and improves prompt quality without establishing statistical indistinguishability from real reviews under an adversarial frontier-model detector, a bar that current LLM-generated text does not clear regardless of generator family; the realism that is operative for a labeled training benchmark is functional rather than perceptual, and is evidenced by the synthetic-to-real transfer results above, where a model trained on the synthetic corpus recovers real-review aspect and polarity signal on two independent external corpora. The label-faithfulness audit is validated three ways (a behavioral negative control, cross-provider judge agreement, and direct agreement with human labels at Cohen's kappa 0.56 on two annotated corpora, Section 5.7). Because the generator and the cost-matched auditor share a provider family, we further confirm that the audit is not merely detecting same-family latent patterns by reproducing the human-agreement check with a fully independent family (Google Gemini, Cohen's kappa 0.62); human re-annotation across the full 20-aspect schema remains the natural extension. Third, a nontrivial share of rows (841 of 10,000) reached the output-token cap and lowered full-corpus length-band adherence to 0.6819; this is a recoverable token-budget artifact rather than a control failure, since regenerating exactly those rows at a higher cap eliminates the truncation and restores full-corpus adherence to 0.7125, close to but still below the never-truncated rate of 0.7304 (Appendix A.14), and length band is in any case a soft stylistic target rather than a labeled control variable. Fourth, downstream training on the 10K corpus benefits from the Section 5.7 top-50% faithfulness filter (validated across two BERT-family architectures and both transfer targets); the audit score is the validated way to select training rows for sentiment-polarity fidelity on transferred aspects. Fifth, the downstream GPT comparison covers a full-test</w:t>
       </w:r>
       <w:r>
         <w:t xml:space="preserve"> </w:t>
@@ -16827,7 +16827,7 @@
         <w:widowControl w:val="1"/>
       </w:pPr>
       <w:r>
-        <w:t xml:space="preserve">A concrete adoption roadmap follows from a fine-tuning-size sweep. Pretraining the detector on the synthetic corpus and then fine-tuning on a subsampled slice of real, locally adjudicated reviews traces a smooth curve (Figure 6): as few as 100 real reviews lift 9-aspect detection to micro-F1 0.58 (well above the 0.46 of synthetic-only transfer), 500 reach 0.70, 1,000 reach 0.74, and the full real set 0.77, matching a model trained on real data alone (0.767). Two operational guidelines follow. First, minimum data: roughly 250 to 500 locally labeled reviews already capture most of the benefit and are a realistic annotation budget for a single department, while the synthetic pretrain lets an institution reach real-only quality with about half the real data. Second, expected degradation and monitoring: a deployment fine-tuned on N local reviews should expect the micro-F1 in Figure 6 rather than the internal-benchmark or full-real numbers, and should be monitored against a held-out slice of locally adjudicated examples, re-checking whenever the feedback distribution shifts (new platform, course redesign, or cohort change).</w:t>
+        <w:t xml:space="preserve">A concrete adoption roadmap follows from a fine-tuning-size sweep. Pretraining the detector on the synthetic corpus and then fine-tuning on a subsampled slice of real, locally adjudicated reviews traces a smooth curve (Figure 6): as few as 100 real reviews lift 9-aspect detection to micro-F1 0.58 (well above the 0.46 of synthetic-only transfer), 500 reach 0.70, 1,000 reach 0.74, and the full real set 0.77, matching a model trained on real data alone (0.767). Two operational guidelines follow. First, minimum data: roughly 250 to 500 locally labeled reviews already capture most of the benefit and are a realistic annotation budget for a single department, while the synthetic pretrain lets an institution reach real-only quality with about half the real data. Second, expected degradation and monitoring: a deployment fine-tuned on N local reviews should expect the micro-F1 in Figure 6 rather than the internal-benchmark or full-real numbers, and should be monitored against a held-out slice of locally adjudicated examples, re-checking whenever the feedback distribution shifts (new platform, course redesign, or cohort change). Practitioners applying the faithfulness audit itself should note that its reliability is review-shape dependent: it is most trustworthy on moderate-length reviews with a handful of aspects, under-confirming genuine aspects on very short comments and under-rejecting spurious ones on aspect-dense reviews (Appendix A.22).</w:t>
       </w:r>
     </w:p>
     <w:p>
@@ -16848,7 +16848,7 @@
               <a:graphicData uri="http://schemas.openxmlformats.org/drawingml/2006/picture">
                 <pic:pic>
                   <pic:nvPicPr>
-                    <pic:cNvPr descr="C:/Users/apart/AppData/Local/Temp/html2doc_svg_l3KOoh/svg_5.png" id="51" name="Picture"/>
+                    <pic:cNvPr descr="C:/Users/apart/AppData/Local/Temp/html2doc_svg_ReCZ8V/svg_5.png" id="51" name="Picture"/>
                     <pic:cNvPicPr>
                       <a:picLocks noChangeArrowheads="1" noChangeAspect="1"/>
                     </pic:cNvPicPr>
@@ -21806,7 +21806,7 @@
               <a:graphicData uri="http://schemas.openxmlformats.org/drawingml/2006/picture">
                 <pic:pic>
                   <pic:nvPicPr>
-                    <pic:cNvPr descr="C:/Users/apart/AppData/Local/Temp/html2doc_svg_l3KOoh/svg_6.png" id="62" name="Picture"/>
+                    <pic:cNvPr descr="C:/Users/apart/AppData/Local/Temp/html2doc_svg_ReCZ8V/svg_6.png" id="62" name="Picture"/>
                     <pic:cNvPicPr>
                       <a:picLocks noChangeArrowheads="1" noChangeAspect="1"/>
                     </pic:cNvPicPr>
@@ -23615,7 +23615,7 @@
               <a:graphicData uri="http://schemas.openxmlformats.org/drawingml/2006/picture">
                 <pic:pic>
                   <pic:nvPicPr>
-                    <pic:cNvPr descr="C:/Users/apart/AppData/Local/Temp/html2doc_svg_l3KOoh/svg_7.png" id="67" name="Picture"/>
+                    <pic:cNvPr descr="C:/Users/apart/AppData/Local/Temp/html2doc_svg_ReCZ8V/svg_7.png" id="67" name="Picture"/>
                     <pic:cNvPicPr>
                       <a:picLocks noChangeArrowheads="1" noChangeAspect="1"/>
                     </pic:cNvPicPr>
@@ -25574,7 +25574,7 @@
               <a:graphicData uri="http://schemas.openxmlformats.org/drawingml/2006/picture">
                 <pic:pic>
                   <pic:nvPicPr>
-                    <pic:cNvPr descr="C:/Users/apart/AppData/Local/Temp/html2doc_svg_l3KOoh/svg_8.png" id="72" name="Picture"/>
+                    <pic:cNvPr descr="C:/Users/apart/AppData/Local/Temp/html2doc_svg_ReCZ8V/svg_8.png" id="72" name="Picture"/>
                     <pic:cNvPicPr>
                       <a:picLocks noChangeArrowheads="1" noChangeAspect="1"/>
                     </pic:cNvPicPr>
@@ -26411,7 +26411,7 @@
               <a:graphicData uri="http://schemas.openxmlformats.org/drawingml/2006/picture">
                 <pic:pic>
                   <pic:nvPicPr>
-                    <pic:cNvPr descr="C:/Users/apart/AppData/Local/Temp/html2doc_svg_l3KOoh/svg_9.png" id="75" name="Picture"/>
+                    <pic:cNvPr descr="C:/Users/apart/AppData/Local/Temp/html2doc_svg_ReCZ8V/svg_9.png" id="75" name="Picture"/>
                     <pic:cNvPicPr>
                       <a:picLocks noChangeArrowheads="1" noChangeAspect="1"/>
                     </pic:cNvPicPr>
@@ -31131,7 +31131,7 @@
               <a:graphicData uri="http://schemas.openxmlformats.org/drawingml/2006/picture">
                 <pic:pic>
                   <pic:nvPicPr>
-                    <pic:cNvPr descr="C:/Users/apart/AppData/Local/Temp/html2doc_svg_l3KOoh/svg_10.png" id="80" name="Picture"/>
+                    <pic:cNvPr descr="C:/Users/apart/AppData/Local/Temp/html2doc_svg_ReCZ8V/svg_10.png" id="80" name="Picture"/>
                     <pic:cNvPicPr>
                       <a:picLocks noChangeArrowheads="1" noChangeAspect="1"/>
                     </pic:cNvPicPr>
@@ -32335,7 +32335,7 @@
               <a:graphicData uri="http://schemas.openxmlformats.org/drawingml/2006/picture">
                 <pic:pic>
                   <pic:nvPicPr>
-                    <pic:cNvPr descr="C:/Users/apart/AppData/Local/Temp/html2doc_svg_l3KOoh/svg_11.png" id="86" name="Picture"/>
+                    <pic:cNvPr descr="C:/Users/apart/AppData/Local/Temp/html2doc_svg_ReCZ8V/svg_11.png" id="86" name="Picture"/>
                     <pic:cNvPicPr>
                       <a:picLocks noChangeArrowheads="1" noChangeAspect="1"/>
                     </pic:cNvPicPr>
@@ -32417,7 +32417,7 @@
               <a:graphicData uri="http://schemas.openxmlformats.org/drawingml/2006/picture">
                 <pic:pic>
                   <pic:nvPicPr>
-                    <pic:cNvPr descr="C:/Users/apart/AppData/Local/Temp/html2doc_svg_l3KOoh/svg_12.png" id="89" name="Picture"/>
+                    <pic:cNvPr descr="C:/Users/apart/AppData/Local/Temp/html2doc_svg_ReCZ8V/svg_12.png" id="89" name="Picture"/>
                     <pic:cNvPicPr>
                       <a:picLocks noChangeArrowheads="1" noChangeAspect="1"/>
                     </pic:cNvPicPr>
@@ -33238,7 +33238,7 @@
               <a:graphicData uri="http://schemas.openxmlformats.org/drawingml/2006/picture">
                 <pic:pic>
                   <pic:nvPicPr>
-                    <pic:cNvPr descr="C:/Users/apart/AppData/Local/Temp/html2doc_svg_l3KOoh/svg_13.png" id="94" name="Picture"/>
+                    <pic:cNvPr descr="C:/Users/apart/AppData/Local/Temp/html2doc_svg_ReCZ8V/svg_13.png" id="94" name="Picture"/>
                     <pic:cNvPicPr>
                       <a:picLocks noChangeArrowheads="1" noChangeAspect="1"/>
                     </pic:cNvPicPr>

</xml_diff>

<commit_message>
Sentence-vs-review realism (A.23) + granularity-not-the-bottleneck transfer (A.24)
- A.23 Sentence-vs-review realism: individual synthetic sentences near-indistinguishable
  from real (judge 60% acc / 0.367 synth-detect vs 93% / 0.975 at review level).
  Detectability is a document-assembly effect (uniform coverage of sampled aspects),
  orthogonal to the sentence-level labels. Folded into limitation 2 + response #5a.
- A.24: EduRABSA BERT transfer 0.275 refutes a domain story; with OATS (review-level)
  0.275 = M-ABSA (sentence) 0.263 << Herath 0.481, granularity does NOT predict
  transfer. Corrected the contradicted 'lower Herath scores reflect shorter items'
  claim in limitation 1.
- Rebuilt Overleaf (clean) + DOCX.

Co-Authored-By: Claude Opus 4.8 (1M context) <noreply@anthropic.com>
</commit_message>
<xml_diff>
--- a/paper/course_absa_manuscript.docx
+++ b/paper/course_absa_manuscript.docx
@@ -1410,7 +1410,7 @@
               <a:graphicData uri="http://schemas.openxmlformats.org/drawingml/2006/picture">
                 <pic:pic>
                   <pic:nvPicPr>
-                    <pic:cNvPr descr="C:/Users/apart/AppData/Local/Temp/html2doc_svg_LlnWYp/svg_0.png" id="16" name="Picture"/>
+                    <pic:cNvPr descr="C:/Users/apart/AppData/Local/Temp/html2doc_svg_239o7b/svg_0.png" id="16" name="Picture"/>
                     <pic:cNvPicPr>
                       <a:picLocks noChangeArrowheads="1" noChangeAspect="1"/>
                     </pic:cNvPicPr>
@@ -10174,7 +10174,7 @@
               <a:graphicData uri="http://schemas.openxmlformats.org/drawingml/2006/picture">
                 <pic:pic>
                   <pic:nvPicPr>
-                    <pic:cNvPr descr="C:/Users/apart/AppData/Local/Temp/html2doc_svg_LlnWYp/svg_1.png" id="30" name="Picture"/>
+                    <pic:cNvPr descr="C:/Users/apart/AppData/Local/Temp/html2doc_svg_239o7b/svg_1.png" id="30" name="Picture"/>
                     <pic:cNvPicPr>
                       <a:picLocks noChangeArrowheads="1" noChangeAspect="1"/>
                     </pic:cNvPicPr>
@@ -12519,7 +12519,7 @@
               <a:graphicData uri="http://schemas.openxmlformats.org/drawingml/2006/picture">
                 <pic:pic>
                   <pic:nvPicPr>
-                    <pic:cNvPr descr="C:/Users/apart/AppData/Local/Temp/html2doc_svg_LlnWYp/svg_2.png" id="35" name="Picture"/>
+                    <pic:cNvPr descr="C:/Users/apart/AppData/Local/Temp/html2doc_svg_239o7b/svg_2.png" id="35" name="Picture"/>
                     <pic:cNvPicPr>
                       <a:picLocks noChangeArrowheads="1" noChangeAspect="1"/>
                     </pic:cNvPicPr>
@@ -12601,7 +12601,7 @@
               <a:graphicData uri="http://schemas.openxmlformats.org/drawingml/2006/picture">
                 <pic:pic>
                   <pic:nvPicPr>
-                    <pic:cNvPr descr="C:/Users/apart/AppData/Local/Temp/html2doc_svg_LlnWYp/svg_3.png" id="38" name="Picture"/>
+                    <pic:cNvPr descr="C:/Users/apart/AppData/Local/Temp/html2doc_svg_239o7b/svg_3.png" id="38" name="Picture"/>
                     <pic:cNvPicPr>
                       <a:picLocks noChangeArrowheads="1" noChangeAspect="1"/>
                     </pic:cNvPicPr>
@@ -16203,7 +16203,7 @@
               <a:graphicData uri="http://schemas.openxmlformats.org/drawingml/2006/picture">
                 <pic:pic>
                   <pic:nvPicPr>
-                    <pic:cNvPr descr="C:/Users/apart/AppData/Local/Temp/html2doc_svg_LlnWYp/svg_4.png" id="44" name="Picture"/>
+                    <pic:cNvPr descr="C:/Users/apart/AppData/Local/Temp/html2doc_svg_239o7b/svg_4.png" id="44" name="Picture"/>
                     <pic:cNvPicPr>
                       <a:picLocks noChangeArrowheads="1" noChangeAspect="1"/>
                     </pic:cNvPicPr>
@@ -16576,7 +16576,7 @@
         <w:widowControl w:val="1"/>
       </w:pPr>
       <w:r>
-        <w:t xml:space="preserve">Five limitations remain central. First, external validation uses two real educational corpora (Herath 9-aspect, EduRABSA 7-aspect) and conservative aspect overlaps, so broader claims about the entire 20-aspect schema still require additional real-data tests. These two targets are also sentence-level (Herath median 20 words, EduRABSA 38) while the synthetic corpus is full-length reviews (median 122 words), so transfer here is a cross-granularity test, and the lower Herath scores partly reflect its shorter items rather than aspect content alone. A full-review real benchmark matched to institutional course feedback is the natural next target; the one public review-level educational corpus is MOOC-focused (OATS-ABSA, Coursera reviews [41]), while course-evaluation feedback of the kind our schema targets remains annotated only at the sentence level [12]. Aspect-annotating a set of full-length institutional reviews (for example public OMSCS reviews) is therefore the concrete path to fully closing this granularity gap. Practitioners should therefore not read the transfer results as validating the full schema: only 9 of the 20 aspects are externally checked, synthetic-only training recovers about 60% of a real-trained model, and any high-stakes or personnel decision requires human-in-the-loop review rather than reliance on the eleven aspects that have no real-data validation. Second, the realism-validation analysis is conducted with LLM judges and improves prompt quality without establishing statistical indistinguishability from real reviews under an adversarial frontier-model detector, a bar that current LLM-generated text does not clear regardless of generator family; the realism that is operative for a labeled training benchmark is functional rather than perceptual, and is evidenced by the synthetic-to-real transfer results above, where a model trained on the synthetic corpus recovers real-review aspect and polarity signal on two independent external corpora. A distributional check calibrates the scale of the gap: at sentence granularity, MAUVE between the synthetic corpus and the real OMSCS reviews is 0.23, below the 0.98 real-to-real ceiling but well above the 0.03 MAUVE between two independent real educational corpora (OMSCS and Herath), so the synthetic text is in fact closer to its target real distribution than two real educational sources are to each other, and its distributional distance from real text is modest against the natural spread of real educational feedback. This residual gap reflects writing style rather than course or platform identity: scrubbing course codes, instructor names, and platform terms from both sides leaves it essentially unchanged. The label-faithfulness audit is validated three ways (a behavioral negative control, cross-provider judge agreement, and direct agreement with human labels at Cohen's kappa 0.56 on two annotated corpora, Section 5.7). Because the generator and the cost-matched auditor share a provider family, we further confirm that the audit is not merely detecting same-family latent patterns by reproducing the human-agreement check with a fully independent family (Google Gemini, Cohen's kappa 0.62); human re-annotation across the full 20-aspect schema remains the natural extension. Third, a nontrivial share of rows (841 of 10,000) reached the output-token cap and lowered full-corpus length-band adherence to 0.6819; this is a recoverable token-budget artifact rather than a control failure, since regenerating exactly those rows at a higher cap eliminates the truncation and restores full-corpus adherence to 0.7125, close to but still below the never-truncated rate of 0.7304 (Appendix A.14), and length band is in any case a soft stylistic target rather than a labeled control variable. Fourth, downstream training on the 10K corpus benefits from the Section 5.7 top-50% faithfulness filter (validated across two BERT-family architectures and both transfer targets); the audit score is the validated way to select training rows for sentiment-polarity fidelity on transferred aspects. Fifth, the downstream GPT comparison covers a full-test</w:t>
+        <w:t xml:space="preserve">Five limitations remain central. First, external validation uses two real educational corpora (Herath 9-aspect, EduRABSA 7-aspect) and conservative aspect overlaps, so broader claims about the entire 20-aspect schema still require additional real-data tests. These two targets are also sentence-level (Herath median 20 words, EduRABSA 38) while the synthetic corpus is full-length reviews (median 122 words), so transfer here is a cross-granularity test. This granularity mismatch is not, however, the limiting factor: a review-level real target (OATS, median 70 words) transfers no better than the sentence-level targets, so transfer difficulty is governed by how closely a target's aspect vocabulary and register align with the synthetic supervision rather than by review length (Appendix A.24). A full-review real benchmark matched to institutional course feedback is the natural next target; the one public review-level educational corpus is MOOC-focused (OATS-ABSA, Coursera reviews [41]), while course-evaluation feedback of the kind our schema targets remains annotated only at the sentence level [12]. Aspect-annotating a set of full-length institutional reviews (for example public OMSCS reviews) is therefore the concrete path to fully closing this granularity gap. Practitioners should therefore not read the transfer results as validating the full schema: only 9 of the 20 aspects are externally checked, synthetic-only training recovers about 60% of a real-trained model, and any high-stakes or personnel decision requires human-in-the-loop review rather than reliance on the eleven aspects that have no real-data validation. Second, the realism-validation analysis is conducted with LLM judges and improves prompt quality without establishing statistical indistinguishability from real reviews under an adversarial frontier-model detector, a bar that current LLM-generated text does not clear regardless of generator family; the realism that is operative for a labeled training benchmark is functional rather than perceptual, and is evidenced by the synthetic-to-real transfer results above, where a model trained on the synthetic corpus recovers real-review aspect and polarity signal on two independent external corpora. A distributional check calibrates the scale of the gap: at sentence granularity, MAUVE between the synthetic corpus and the real OMSCS reviews is 0.23, below the 0.98 real-to-real ceiling but well above the 0.03 MAUVE between two independent real educational corpora (OMSCS and Herath), so the synthetic text is in fact closer to its target real distribution than two real educational sources are to each other, and its distributional distance from real text is modest against the natural spread of real educational feedback. This residual gap reflects writing style rather than course or platform identity: scrubbing course codes, instructor names, and platform terms from both sides leaves it essentially unchanged. Most tellingly, the separability is a document-structure effect rather than a sentence-realism one: judged sentence by sentence, individual synthetic sentences are near-indistinguishable from real ones, with the same judge only 60% accurate (close to the 50% chance floor, versus 93% on whole reviews) and calling 63% of synthetic sentences real. What a frontier detector picks up is therefore how a review is assembled, its uniform coverage of the independently sampled aspects, not the individual sentences that carry the aspect-sentiment supervision (Appendix A.23). The label-faithfulness audit is validated three ways (a behavioral negative control, cross-provider judge agreement, and direct agreement with human labels at Cohen's kappa 0.56 on two annotated corpora, Section 5.7). Because the generator and the cost-matched auditor share a provider family, we further confirm that the audit is not merely detecting same-family latent patterns by reproducing the human-agreement check with a fully independent family (Google Gemini, Cohen's kappa 0.62); human re-annotation across the full 20-aspect schema remains the natural extension. Third, a nontrivial share of rows (841 of 10,000) reached the output-token cap and lowered full-corpus length-band adherence to 0.6819; this is a recoverable token-budget artifact rather than a control failure, since regenerating exactly those rows at a higher cap eliminates the truncation and restores full-corpus adherence to 0.7125, close to but still below the never-truncated rate of 0.7304 (Appendix A.14), and length band is in any case a soft stylistic target rather than a labeled control variable. Fourth, downstream training on the 10K corpus benefits from the Section 5.7 top-50% faithfulness filter (validated across two BERT-family architectures and both transfer targets); the audit score is the validated way to select training rows for sentiment-polarity fidelity on transferred aspects. Fifth, the downstream GPT comparison covers a full-test</w:t>
       </w:r>
       <w:r>
         <w:t xml:space="preserve"> </w:t>
@@ -16848,7 +16848,7 @@
               <a:graphicData uri="http://schemas.openxmlformats.org/drawingml/2006/picture">
                 <pic:pic>
                   <pic:nvPicPr>
-                    <pic:cNvPr descr="C:/Users/apart/AppData/Local/Temp/html2doc_svg_LlnWYp/svg_5.png" id="51" name="Picture"/>
+                    <pic:cNvPr descr="C:/Users/apart/AppData/Local/Temp/html2doc_svg_239o7b/svg_5.png" id="51" name="Picture"/>
                     <pic:cNvPicPr>
                       <a:picLocks noChangeArrowheads="1" noChangeAspect="1"/>
                     </pic:cNvPicPr>
@@ -17000,7 +17000,7 @@
       </w:r>
     </w:p>
     <w:bookmarkEnd w:id="55"/>
-    <w:bookmarkStart w:id="102" w:name="appendix"/>
+    <w:bookmarkStart w:id="104" w:name="appendix"/>
     <w:p>
       <w:pPr>
         <w:pStyle w:val="Heading2"/>
@@ -21806,7 +21806,7 @@
               <a:graphicData uri="http://schemas.openxmlformats.org/drawingml/2006/picture">
                 <pic:pic>
                   <pic:nvPicPr>
-                    <pic:cNvPr descr="C:/Users/apart/AppData/Local/Temp/html2doc_svg_LlnWYp/svg_6.png" id="62" name="Picture"/>
+                    <pic:cNvPr descr="C:/Users/apart/AppData/Local/Temp/html2doc_svg_239o7b/svg_6.png" id="62" name="Picture"/>
                     <pic:cNvPicPr>
                       <a:picLocks noChangeArrowheads="1" noChangeAspect="1"/>
                     </pic:cNvPicPr>
@@ -23615,7 +23615,7 @@
               <a:graphicData uri="http://schemas.openxmlformats.org/drawingml/2006/picture">
                 <pic:pic>
                   <pic:nvPicPr>
-                    <pic:cNvPr descr="C:/Users/apart/AppData/Local/Temp/html2doc_svg_LlnWYp/svg_7.png" id="67" name="Picture"/>
+                    <pic:cNvPr descr="C:/Users/apart/AppData/Local/Temp/html2doc_svg_239o7b/svg_7.png" id="67" name="Picture"/>
                     <pic:cNvPicPr>
                       <a:picLocks noChangeArrowheads="1" noChangeAspect="1"/>
                     </pic:cNvPicPr>
@@ -25574,7 +25574,7 @@
               <a:graphicData uri="http://schemas.openxmlformats.org/drawingml/2006/picture">
                 <pic:pic>
                   <pic:nvPicPr>
-                    <pic:cNvPr descr="C:/Users/apart/AppData/Local/Temp/html2doc_svg_LlnWYp/svg_8.png" id="72" name="Picture"/>
+                    <pic:cNvPr descr="C:/Users/apart/AppData/Local/Temp/html2doc_svg_239o7b/svg_8.png" id="72" name="Picture"/>
                     <pic:cNvPicPr>
                       <a:picLocks noChangeArrowheads="1" noChangeAspect="1"/>
                     </pic:cNvPicPr>
@@ -26411,7 +26411,7 @@
               <a:graphicData uri="http://schemas.openxmlformats.org/drawingml/2006/picture">
                 <pic:pic>
                   <pic:nvPicPr>
-                    <pic:cNvPr descr="C:/Users/apart/AppData/Local/Temp/html2doc_svg_LlnWYp/svg_9.png" id="75" name="Picture"/>
+                    <pic:cNvPr descr="C:/Users/apart/AppData/Local/Temp/html2doc_svg_239o7b/svg_9.png" id="75" name="Picture"/>
                     <pic:cNvPicPr>
                       <a:picLocks noChangeArrowheads="1" noChangeAspect="1"/>
                     </pic:cNvPicPr>
@@ -31131,7 +31131,7 @@
               <a:graphicData uri="http://schemas.openxmlformats.org/drawingml/2006/picture">
                 <pic:pic>
                   <pic:nvPicPr>
-                    <pic:cNvPr descr="C:/Users/apart/AppData/Local/Temp/html2doc_svg_LlnWYp/svg_10.png" id="80" name="Picture"/>
+                    <pic:cNvPr descr="C:/Users/apart/AppData/Local/Temp/html2doc_svg_239o7b/svg_10.png" id="80" name="Picture"/>
                     <pic:cNvPicPr>
                       <a:picLocks noChangeArrowheads="1" noChangeAspect="1"/>
                     </pic:cNvPicPr>
@@ -32335,7 +32335,7 @@
               <a:graphicData uri="http://schemas.openxmlformats.org/drawingml/2006/picture">
                 <pic:pic>
                   <pic:nvPicPr>
-                    <pic:cNvPr descr="C:/Users/apart/AppData/Local/Temp/html2doc_svg_LlnWYp/svg_11.png" id="86" name="Picture"/>
+                    <pic:cNvPr descr="C:/Users/apart/AppData/Local/Temp/html2doc_svg_239o7b/svg_11.png" id="86" name="Picture"/>
                     <pic:cNvPicPr>
                       <a:picLocks noChangeArrowheads="1" noChangeAspect="1"/>
                     </pic:cNvPicPr>
@@ -32417,7 +32417,7 @@
               <a:graphicData uri="http://schemas.openxmlformats.org/drawingml/2006/picture">
                 <pic:pic>
                   <pic:nvPicPr>
-                    <pic:cNvPr descr="C:/Users/apart/AppData/Local/Temp/html2doc_svg_LlnWYp/svg_12.png" id="89" name="Picture"/>
+                    <pic:cNvPr descr="C:/Users/apart/AppData/Local/Temp/html2doc_svg_239o7b/svg_12.png" id="89" name="Picture"/>
                     <pic:cNvPicPr>
                       <a:picLocks noChangeArrowheads="1" noChangeAspect="1"/>
                     </pic:cNvPicPr>
@@ -33238,7 +33238,7 @@
               <a:graphicData uri="http://schemas.openxmlformats.org/drawingml/2006/picture">
                 <pic:pic>
                   <pic:nvPicPr>
-                    <pic:cNvPr descr="C:/Users/apart/AppData/Local/Temp/html2doc_svg_LlnWYp/svg_13.png" id="94" name="Picture"/>
+                    <pic:cNvPr descr="C:/Users/apart/AppData/Local/Temp/html2doc_svg_239o7b/svg_13.png" id="94" name="Picture"/>
                     <pic:cNvPicPr>
                       <a:picLocks noChangeArrowheads="1" noChangeAspect="1"/>
                     </pic:cNvPicPr>
@@ -40877,8 +40877,1129 @@
       </w:tr>
     </w:tbl>
     <w:bookmarkEnd w:id="101"/>
+    <w:bookmarkStart w:id="102" w:name="a.23-sentence-versus-review-realism"/>
+    <w:p>
+      <w:pPr>
+        <w:pStyle w:val="Heading3"/>
+        <w:keepNext/>
+        <w:keepLines/>
+        <w:widowControl w:val="1"/>
+      </w:pPr>
+      <w:r>
+        <w:t xml:space="preserve">A.23 Sentence-Versus-Review Realism</w:t>
+      </w:r>
+    </w:p>
+    <w:p>
+      <w:pPr>
+        <w:pStyle w:val="FirstParagraph"/>
+        <w:jc w:val="both"/>
+        <w:keepNext w:val="0"/>
+        <w:keepLines w:val="0"/>
+        <w:widowControl w:val="1"/>
+      </w:pPr>
+      <w:r>
+        <w:t xml:space="preserve">The realism-validation judge separates whole synthetic reviews from real ones easily, but this reflects document structure rather than the realism of the text itself. We re-ran the identical real-versus-synthetic judgment at sentence granularity, giving the judge one sentence at a time (150 synthetic and 150 real OMSCS sentences of 5 to 40 words), and compared it to the review-level decision (Table A21). Accuracy falls from 93% to 60%, close to the 50% chance floor: the judge flags only 37% of synthetic sentences as synthetic (versus 97% of whole reviews) and calls 63% of them real, while its false-synthetic rate on real sentences is unchanged at 16%. Individual synthetic sentences are therefore near-indistinguishable from real ones to the same detector. The signal the detector uses at the review level is how the review is assembled: because aspects are sampled independently and the generator is asked to express each assigned aspect, a synthetic review covers its aspects uniformly and reads as balanced or checklist-like, whereas real reviews dwell on one or two aspects and mention others in passing. This document-assembly regularity is orthogonal to the sentence-level aspect-sentiment labels the corpus supplies for training, and a MAUVE gap of 0.23 between the sentence pools confirms only an aggregate distributional shift, not per-sentence detectability. Script:</w:t>
+      </w:r>
+      <w:r>
+        <w:t xml:space="preserve"> </w:t>
+      </w:r>
+      <w:r>
+        <w:rPr>
+          <w:rStyle w:val="VerbatimChar"/>
+        </w:rPr>
+        <w:t xml:space="preserve">paper/n2_sentence_judge.py</w:t>
+      </w:r>
+      <w:r>
+        <w:t xml:space="preserve">.</w:t>
+      </w:r>
+    </w:p>
+    <w:p>
+      <w:pPr>
+        <w:pStyle w:val="TableCaption"/>
+        <w:spacing w:before="280" w:after="60" w:line="240" w:lineRule="auto"/>
+        <w:jc w:val="center"/>
+        <w:keepNext/>
+        <w:keepLines/>
+        <w:widowControl w:val="1"/>
+      </w:pPr>
+      <w:r>
+        <w:rPr>
+          <w:b/>
+          <w:i/>
+        </w:rPr>
+        <w:t>Table A21.</w:t>
+      </w:r>
+      <w:r>
+        <w:rPr>
+          <w:b w:val="0"/>
+          <w:i/>
+        </w:rPr>
+        <w:t xml:space="preserve"> </w:t>
+      </w:r>
+      <w:r>
+        <w:rPr>
+          <w:b w:val="0"/>
+          <w:i/>
+        </w:rPr>
+        <w:t>Real-versus-synthetic judge (gpt-5.4) at review granularity versus sentence granularity. At the sentence level the judge is near the 50% chance floor, so whole-review detectability is a document-structure effect, not a property of the sentences.</w:t>
+      </w:r>
+    </w:p>
+    <w:tbl>
+      <w:tblPr>
+        <w:tblStyle w:val="Table"/>
+        <w:tblW w:type="pct" w:w="5000"/>
+        <w:jc w:val="center"/>
+        <w:tblLook w:firstRow="1" w:lastRow="0" w:firstColumn="0" w:lastColumn="0" w:noHBand="0" w:noVBand="0" w:val="0020"/>
+        <w:tblCaption w:val="Table A21. Real-versus-synthetic judge (gpt-5.4) at review granularity versus sentence granularity. At the sentence level the judge is near the 50% chance floor, so whole-review detectability is a document-structure effect, not a property of the sentences."/>
+        <w:tblLayout w:type="autofit"/>
+        <w:tblBorders>
+          <w:top w:val="single" w:sz="10" w:color="4F6272"/>
+          <w:bottom w:val="single" w:sz="10" w:color="4F6272"/>
+          <w:insideH w:val="single" w:sz="5" w:color="9FB0C2"/>
+          <w:left w:val="single" w:sz="6" w:color="9FB0C2"/>
+          <w:right w:val="single" w:sz="6" w:color="9FB0C2"/>
+          <w:insideV w:val="single" w:sz="5" w:color="D9E1E8"/>
+        </w:tblBorders>
+      </w:tblPr>
+      <w:tblGrid>
+        <w:gridCol w:w="1980"/>
+        <w:gridCol w:w="1980"/>
+        <w:gridCol w:w="1980"/>
+        <w:gridCol w:w="1980"/>
+      </w:tblGrid>
+      <w:tr>
+        <w:trPr>
+          <w:tblHeader w:val="on"/>
+        </w:trPr>
+        <w:tc>
+          <w:tcPr>
+            <w:shd w:fill="EEF3F7"/>
+            <w:tcBorders>
+              <w:left w:val="nil"/>
+              <w:right w:val="nil"/>
+              <w:top w:val="nil"/>
+              <w:bottom w:val="single" w:sz="8" w:color="9FB0C2"/>
+            </w:tcBorders>
+            <w:vAlign w:val="center"/>
+          </w:tcPr>
+          <w:p>
+            <w:pPr>
+              <w:pStyle w:val="Compact"/>
+              <w:spacing w:before="0" w:after="20" w:line="240" w:lineRule="auto"/>
+              <w:jc w:val="center"/>
+              <w:keepNext w:val="0"/>
+              <w:keepLines/>
+              <w:widowControl w:val="1"/>
+            </w:pPr>
+            <w:r>
+              <w:rPr>
+                <w:rFonts w:ascii="Georgia" w:hAnsi="Georgia"/>
+                <w:b/>
+                <w:sz w:val="19"/>
+              </w:rPr>
+              <w:t xml:space="preserve">Granularity</w:t>
+            </w:r>
+          </w:p>
+        </w:tc>
+        <w:tc>
+          <w:tcPr>
+            <w:shd w:fill="EEF3F7"/>
+            <w:tcBorders>
+              <w:left w:val="nil"/>
+              <w:right w:val="nil"/>
+              <w:top w:val="nil"/>
+              <w:bottom w:val="single" w:sz="8" w:color="9FB0C2"/>
+            </w:tcBorders>
+            <w:vAlign w:val="center"/>
+          </w:tcPr>
+          <w:p>
+            <w:pPr>
+              <w:pStyle w:val="Compact"/>
+              <w:spacing w:before="0" w:after="20" w:line="240" w:lineRule="auto"/>
+              <w:jc w:val="center"/>
+              <w:keepNext w:val="0"/>
+              <w:keepLines/>
+              <w:widowControl w:val="1"/>
+            </w:pPr>
+            <w:r>
+              <w:rPr>
+                <w:rFonts w:ascii="Georgia" w:hAnsi="Georgia"/>
+                <w:b/>
+                <w:sz w:val="19"/>
+              </w:rPr>
+              <w:t xml:space="preserve">Synthetic flagged synthetic</w:t>
+            </w:r>
+          </w:p>
+        </w:tc>
+        <w:tc>
+          <w:tcPr>
+            <w:shd w:fill="EEF3F7"/>
+            <w:tcBorders>
+              <w:left w:val="nil"/>
+              <w:right w:val="nil"/>
+              <w:top w:val="nil"/>
+              <w:bottom w:val="single" w:sz="8" w:color="9FB0C2"/>
+            </w:tcBorders>
+            <w:vAlign w:val="center"/>
+          </w:tcPr>
+          <w:p>
+            <w:pPr>
+              <w:pStyle w:val="Compact"/>
+              <w:spacing w:before="0" w:after="20" w:line="240" w:lineRule="auto"/>
+              <w:jc w:val="center"/>
+              <w:keepNext w:val="0"/>
+              <w:keepLines/>
+              <w:widowControl w:val="1"/>
+            </w:pPr>
+            <w:r>
+              <w:rPr>
+                <w:rFonts w:ascii="Georgia" w:hAnsi="Georgia"/>
+                <w:b/>
+                <w:sz w:val="19"/>
+              </w:rPr>
+              <w:t xml:space="preserve">Real flagged synthetic</w:t>
+            </w:r>
+          </w:p>
+        </w:tc>
+        <w:tc>
+          <w:tcPr>
+            <w:shd w:fill="EEF3F7"/>
+            <w:tcBorders>
+              <w:left w:val="nil"/>
+              <w:right w:val="nil"/>
+              <w:top w:val="nil"/>
+              <w:bottom w:val="single" w:sz="8" w:color="9FB0C2"/>
+            </w:tcBorders>
+            <w:vAlign w:val="center"/>
+          </w:tcPr>
+          <w:p>
+            <w:pPr>
+              <w:pStyle w:val="Compact"/>
+              <w:spacing w:before="0" w:after="20" w:line="240" w:lineRule="auto"/>
+              <w:jc w:val="center"/>
+              <w:keepNext w:val="0"/>
+              <w:keepLines/>
+              <w:widowControl w:val="1"/>
+            </w:pPr>
+            <w:r>
+              <w:rPr>
+                <w:rFonts w:ascii="Georgia" w:hAnsi="Georgia"/>
+                <w:b/>
+                <w:sz w:val="19"/>
+              </w:rPr>
+              <w:t xml:space="preserve">Overall accuracy</w:t>
+            </w:r>
+          </w:p>
+        </w:tc>
+      </w:tr>
+      <w:tr>
+        <w:tc>
+          <w:tcPr>
+            <w:tcBorders>
+              <w:left w:val="nil"/>
+              <w:right w:val="nil"/>
+              <w:top w:val="nil"/>
+              <w:bottom w:val="single" w:sz="4" w:color="D9E1E8"/>
+            </w:tcBorders>
+            <w:vAlign w:val="center"/>
+          </w:tcPr>
+          <w:p>
+            <w:pPr>
+              <w:pStyle w:val="Compact"/>
+              <w:spacing w:before="0" w:after="20" w:line="240" w:lineRule="auto"/>
+              <w:jc w:val="center"/>
+              <w:keepNext w:val="0"/>
+              <w:keepLines/>
+              <w:widowControl w:val="1"/>
+            </w:pPr>
+            <w:r>
+              <w:rPr>
+                <w:rFonts w:ascii="Georgia" w:hAnsi="Georgia"/>
+                <w:sz w:val="19"/>
+              </w:rPr>
+              <w:t xml:space="preserve">Whole review</w:t>
+            </w:r>
+          </w:p>
+        </w:tc>
+        <w:tc>
+          <w:tcPr>
+            <w:tcBorders>
+              <w:left w:val="nil"/>
+              <w:right w:val="nil"/>
+              <w:top w:val="nil"/>
+              <w:bottom w:val="single" w:sz="4" w:color="D9E1E8"/>
+            </w:tcBorders>
+            <w:vAlign w:val="center"/>
+          </w:tcPr>
+          <w:p>
+            <w:pPr>
+              <w:pStyle w:val="Compact"/>
+              <w:spacing w:before="0" w:after="20" w:line="240" w:lineRule="auto"/>
+              <w:jc w:val="center"/>
+              <w:keepNext w:val="0"/>
+              <w:keepLines/>
+              <w:widowControl w:val="1"/>
+            </w:pPr>
+            <w:r>
+              <w:rPr>
+                <w:rFonts w:ascii="Georgia" w:hAnsi="Georgia"/>
+                <w:sz w:val="19"/>
+              </w:rPr>
+              <w:t xml:space="preserve">0.975</w:t>
+            </w:r>
+          </w:p>
+        </w:tc>
+        <w:tc>
+          <w:tcPr>
+            <w:tcBorders>
+              <w:left w:val="nil"/>
+              <w:right w:val="nil"/>
+              <w:top w:val="nil"/>
+              <w:bottom w:val="single" w:sz="4" w:color="D9E1E8"/>
+            </w:tcBorders>
+            <w:vAlign w:val="center"/>
+          </w:tcPr>
+          <w:p>
+            <w:pPr>
+              <w:pStyle w:val="Compact"/>
+              <w:spacing w:before="0" w:after="20" w:line="240" w:lineRule="auto"/>
+              <w:jc w:val="center"/>
+              <w:keepNext w:val="0"/>
+              <w:keepLines/>
+              <w:widowControl w:val="1"/>
+            </w:pPr>
+            <w:r>
+              <w:rPr>
+                <w:rFonts w:ascii="Georgia" w:hAnsi="Georgia"/>
+                <w:sz w:val="19"/>
+              </w:rPr>
+              <w:t xml:space="preserve">0.15</w:t>
+            </w:r>
+          </w:p>
+        </w:tc>
+        <w:tc>
+          <w:tcPr>
+            <w:tcBorders>
+              <w:left w:val="nil"/>
+              <w:right w:val="nil"/>
+              <w:top w:val="nil"/>
+              <w:bottom w:val="single" w:sz="4" w:color="D9E1E8"/>
+            </w:tcBorders>
+            <w:vAlign w:val="center"/>
+          </w:tcPr>
+          <w:p>
+            <w:pPr>
+              <w:pStyle w:val="Compact"/>
+              <w:spacing w:before="0" w:after="20" w:line="240" w:lineRule="auto"/>
+              <w:jc w:val="center"/>
+              <w:keepNext w:val="0"/>
+              <w:keepLines/>
+              <w:widowControl w:val="1"/>
+            </w:pPr>
+            <w:r>
+              <w:rPr>
+                <w:rFonts w:ascii="Georgia" w:hAnsi="Georgia"/>
+                <w:sz w:val="19"/>
+              </w:rPr>
+              <w:t xml:space="preserve">0.93</w:t>
+            </w:r>
+          </w:p>
+        </w:tc>
+      </w:tr>
+      <w:tr>
+        <w:tc>
+          <w:tcPr>
+            <w:tcBorders>
+              <w:left w:val="nil"/>
+              <w:right w:val="nil"/>
+              <w:top w:val="nil"/>
+              <w:bottom w:val="nil"/>
+            </w:tcBorders>
+            <w:vAlign w:val="center"/>
+          </w:tcPr>
+          <w:p>
+            <w:pPr>
+              <w:pStyle w:val="Compact"/>
+              <w:spacing w:before="0" w:after="20" w:line="240" w:lineRule="auto"/>
+              <w:jc w:val="center"/>
+              <w:keepNext w:val="0"/>
+              <w:keepLines/>
+              <w:widowControl w:val="1"/>
+            </w:pPr>
+            <w:r>
+              <w:rPr>
+                <w:rFonts w:ascii="Georgia" w:hAnsi="Georgia"/>
+                <w:sz w:val="19"/>
+              </w:rPr>
+              <w:t xml:space="preserve">Single sentence</w:t>
+            </w:r>
+          </w:p>
+        </w:tc>
+        <w:tc>
+          <w:tcPr>
+            <w:tcBorders>
+              <w:left w:val="nil"/>
+              <w:right w:val="nil"/>
+              <w:top w:val="nil"/>
+              <w:bottom w:val="nil"/>
+            </w:tcBorders>
+            <w:vAlign w:val="center"/>
+          </w:tcPr>
+          <w:p>
+            <w:pPr>
+              <w:pStyle w:val="Compact"/>
+              <w:spacing w:before="0" w:after="20" w:line="240" w:lineRule="auto"/>
+              <w:jc w:val="center"/>
+              <w:keepNext w:val="0"/>
+              <w:keepLines/>
+              <w:widowControl w:val="1"/>
+            </w:pPr>
+            <w:r>
+              <w:rPr>
+                <w:rFonts w:ascii="Georgia" w:hAnsi="Georgia"/>
+                <w:sz w:val="19"/>
+              </w:rPr>
+              <w:t xml:space="preserve">0.367</w:t>
+            </w:r>
+          </w:p>
+        </w:tc>
+        <w:tc>
+          <w:tcPr>
+            <w:tcBorders>
+              <w:left w:val="nil"/>
+              <w:right w:val="nil"/>
+              <w:top w:val="nil"/>
+              <w:bottom w:val="nil"/>
+            </w:tcBorders>
+            <w:vAlign w:val="center"/>
+          </w:tcPr>
+          <w:p>
+            <w:pPr>
+              <w:pStyle w:val="Compact"/>
+              <w:spacing w:before="0" w:after="20" w:line="240" w:lineRule="auto"/>
+              <w:jc w:val="center"/>
+              <w:keepNext w:val="0"/>
+              <w:keepLines/>
+              <w:widowControl w:val="1"/>
+            </w:pPr>
+            <w:r>
+              <w:rPr>
+                <w:rFonts w:ascii="Georgia" w:hAnsi="Georgia"/>
+                <w:sz w:val="19"/>
+              </w:rPr>
+              <w:t xml:space="preserve">0.16</w:t>
+            </w:r>
+          </w:p>
+        </w:tc>
+        <w:tc>
+          <w:tcPr>
+            <w:tcBorders>
+              <w:left w:val="nil"/>
+              <w:right w:val="nil"/>
+              <w:top w:val="nil"/>
+              <w:bottom w:val="nil"/>
+            </w:tcBorders>
+            <w:vAlign w:val="center"/>
+          </w:tcPr>
+          <w:p>
+            <w:pPr>
+              <w:pStyle w:val="Compact"/>
+              <w:spacing w:before="0" w:after="20" w:line="240" w:lineRule="auto"/>
+              <w:jc w:val="center"/>
+              <w:keepNext w:val="0"/>
+              <w:keepLines/>
+              <w:widowControl w:val="1"/>
+            </w:pPr>
+            <w:r>
+              <w:rPr>
+                <w:rFonts w:ascii="Georgia" w:hAnsi="Georgia"/>
+                <w:sz w:val="19"/>
+              </w:rPr>
+              <w:t xml:space="preserve">0.603</w:t>
+            </w:r>
+          </w:p>
+        </w:tc>
+      </w:tr>
+    </w:tbl>
     <w:bookmarkEnd w:id="102"/>
-    <w:bookmarkStart w:id="144" w:name="bibliography"/>
+    <w:bookmarkStart w:id="103" w:name="X50e9c8125cee1eb99a99c9d7946a4b63be6ad24"/>
+    <w:p>
+      <w:pPr>
+        <w:pStyle w:val="Heading3"/>
+        <w:keepNext/>
+        <w:keepLines/>
+        <w:widowControl w:val="1"/>
+      </w:pPr>
+      <w:r>
+        <w:t xml:space="preserve">A.24 Review Granularity Does Not Predict Transfer</w:t>
+      </w:r>
+    </w:p>
+    <w:p>
+      <w:pPr>
+        <w:pStyle w:val="FirstParagraph"/>
+        <w:jc w:val="both"/>
+        <w:keepNext w:val="0"/>
+        <w:keepLines w:val="0"/>
+        <w:widowControl w:val="1"/>
+      </w:pPr>
+      <w:r>
+        <w:t xml:space="preserve">A natural concern is that the synthetic corpus is full-review while the two primary transfer targets are sentence-level, so transfer might be limited by this granularity mismatch. It is not. We evaluated the same synthetic-trained</w:t>
+      </w:r>
+      <w:r>
+        <w:t xml:space="preserve"> </w:t>
+      </w:r>
+      <w:r>
+        <w:rPr>
+          <w:rStyle w:val="VerbatimChar"/>
+        </w:rPr>
+        <w:t xml:space="preserve">bert-base-uncased</w:t>
+      </w:r>
+      <w:r>
+        <w:t xml:space="preserve"> </w:t>
+      </w:r>
+      <w:r>
+        <w:t xml:space="preserve">detector on four real targets that vary in granularity, over each target's conservative aspect overlap (Table A22). A review-level target (OATS, median 70 words) transfers no better (micro-F1 0.275) than sentence-level targets (M-ABSA 0.263, EduRABSA 0.275), and all three sit well below the best-aligned Herath overlap (0.481). Transfer difficulty is therefore governed by how closely a target's aspect vocabulary and register align with the synthetic supervision, not by review length; the cross-granularity mismatch is not the operative limitation. The two Coursera-derived MOOC targets (M-ABSA, OATS) are additionally short and positive-skewed, which further depresses their transferred scores.</w:t>
+      </w:r>
+    </w:p>
+    <w:p>
+      <w:pPr>
+        <w:pStyle w:val="TableCaption"/>
+        <w:spacing w:before="280" w:after="60" w:line="240" w:lineRule="auto"/>
+        <w:jc w:val="center"/>
+        <w:keepNext/>
+        <w:keepLines/>
+        <w:widowControl w:val="1"/>
+      </w:pPr>
+      <w:r>
+        <w:rPr>
+          <w:b/>
+          <w:i/>
+        </w:rPr>
+        <w:t>Table A22.</w:t>
+      </w:r>
+      <w:r>
+        <w:rPr>
+          <w:b w:val="0"/>
+          <w:i/>
+        </w:rPr>
+        <w:t xml:space="preserve"> </w:t>
+      </w:r>
+      <w:r>
+        <w:rPr>
+          <w:b w:val="0"/>
+          <w:i/>
+        </w:rPr>
+        <w:t>Synthetic-to-real detection transfer (micro-F1, bert-base-uncased, seed 42) across four real targets spanning sentence- and review-level granularity. Review-level OATS transfers no better than sentence-level targets, so granularity is not the transfer bottleneck.</w:t>
+      </w:r>
+    </w:p>
+    <w:tbl>
+      <w:tblPr>
+        <w:tblStyle w:val="Table"/>
+        <w:tblW w:type="pct" w:w="5000"/>
+        <w:jc w:val="center"/>
+        <w:tblLook w:firstRow="1" w:lastRow="0" w:firstColumn="0" w:lastColumn="0" w:noHBand="0" w:noVBand="0" w:val="0020"/>
+        <w:tblCaption w:val="Table A22. Synthetic-to-real detection transfer (micro-F1, bert-base-uncased, seed 42) across four real targets spanning sentence- and review-level granularity. Review-level OATS transfers no better than sentence-level targets, so granularity is not the transfer bottleneck."/>
+        <w:tblLayout w:type="autofit"/>
+        <w:tblBorders>
+          <w:top w:val="single" w:sz="10" w:color="4F6272"/>
+          <w:bottom w:val="single" w:sz="10" w:color="4F6272"/>
+          <w:insideH w:val="single" w:sz="5" w:color="9FB0C2"/>
+          <w:left w:val="single" w:sz="6" w:color="9FB0C2"/>
+          <w:right w:val="single" w:sz="6" w:color="9FB0C2"/>
+          <w:insideV w:val="single" w:sz="5" w:color="D9E1E8"/>
+        </w:tblBorders>
+      </w:tblPr>
+      <w:tblGrid>
+        <w:gridCol w:w="1980"/>
+        <w:gridCol w:w="1980"/>
+        <w:gridCol w:w="1980"/>
+        <w:gridCol w:w="1980"/>
+      </w:tblGrid>
+      <w:tr>
+        <w:trPr>
+          <w:tblHeader w:val="on"/>
+        </w:trPr>
+        <w:tc>
+          <w:tcPr>
+            <w:shd w:fill="EEF3F7"/>
+            <w:tcBorders>
+              <w:left w:val="nil"/>
+              <w:right w:val="nil"/>
+              <w:top w:val="nil"/>
+              <w:bottom w:val="single" w:sz="8" w:color="9FB0C2"/>
+            </w:tcBorders>
+            <w:vAlign w:val="center"/>
+          </w:tcPr>
+          <w:p>
+            <w:pPr>
+              <w:pStyle w:val="Compact"/>
+              <w:spacing w:before="0" w:after="20" w:line="240" w:lineRule="auto"/>
+              <w:jc w:val="center"/>
+              <w:keepNext w:val="0"/>
+              <w:keepLines/>
+              <w:widowControl w:val="1"/>
+            </w:pPr>
+            <w:r>
+              <w:rPr>
+                <w:rFonts w:ascii="Georgia" w:hAnsi="Georgia"/>
+                <w:b/>
+                <w:sz w:val="19"/>
+              </w:rPr>
+              <w:t xml:space="preserve">Target</w:t>
+            </w:r>
+          </w:p>
+        </w:tc>
+        <w:tc>
+          <w:tcPr>
+            <w:shd w:fill="EEF3F7"/>
+            <w:tcBorders>
+              <w:left w:val="nil"/>
+              <w:right w:val="nil"/>
+              <w:top w:val="nil"/>
+              <w:bottom w:val="single" w:sz="8" w:color="9FB0C2"/>
+            </w:tcBorders>
+            <w:vAlign w:val="center"/>
+          </w:tcPr>
+          <w:p>
+            <w:pPr>
+              <w:pStyle w:val="Compact"/>
+              <w:spacing w:before="0" w:after="20" w:line="240" w:lineRule="auto"/>
+              <w:jc w:val="center"/>
+              <w:keepNext w:val="0"/>
+              <w:keepLines/>
+              <w:widowControl w:val="1"/>
+            </w:pPr>
+            <w:r>
+              <w:rPr>
+                <w:rFonts w:ascii="Georgia" w:hAnsi="Georgia"/>
+                <w:b/>
+                <w:sz w:val="19"/>
+              </w:rPr>
+              <w:t xml:space="preserve">Granularity (median words)</w:t>
+            </w:r>
+          </w:p>
+        </w:tc>
+        <w:tc>
+          <w:tcPr>
+            <w:shd w:fill="EEF3F7"/>
+            <w:tcBorders>
+              <w:left w:val="nil"/>
+              <w:right w:val="nil"/>
+              <w:top w:val="nil"/>
+              <w:bottom w:val="single" w:sz="8" w:color="9FB0C2"/>
+            </w:tcBorders>
+            <w:vAlign w:val="center"/>
+          </w:tcPr>
+          <w:p>
+            <w:pPr>
+              <w:pStyle w:val="Compact"/>
+              <w:spacing w:before="0" w:after="20" w:line="240" w:lineRule="auto"/>
+              <w:jc w:val="center"/>
+              <w:keepNext w:val="0"/>
+              <w:keepLines/>
+              <w:widowControl w:val="1"/>
+            </w:pPr>
+            <w:r>
+              <w:rPr>
+                <w:rFonts w:ascii="Georgia" w:hAnsi="Georgia"/>
+                <w:b/>
+                <w:sz w:val="19"/>
+              </w:rPr>
+              <w:t xml:space="preserve">Source</w:t>
+            </w:r>
+          </w:p>
+        </w:tc>
+        <w:tc>
+          <w:tcPr>
+            <w:shd w:fill="EEF3F7"/>
+            <w:tcBorders>
+              <w:left w:val="nil"/>
+              <w:right w:val="nil"/>
+              <w:top w:val="nil"/>
+              <w:bottom w:val="single" w:sz="8" w:color="9FB0C2"/>
+            </w:tcBorders>
+            <w:vAlign w:val="center"/>
+          </w:tcPr>
+          <w:p>
+            <w:pPr>
+              <w:pStyle w:val="Compact"/>
+              <w:spacing w:before="0" w:after="20" w:line="240" w:lineRule="auto"/>
+              <w:jc w:val="center"/>
+              <w:keepNext w:val="0"/>
+              <w:keepLines/>
+              <w:widowControl w:val="1"/>
+            </w:pPr>
+            <w:r>
+              <w:rPr>
+                <w:rFonts w:ascii="Georgia" w:hAnsi="Georgia"/>
+                <w:b/>
+                <w:sz w:val="19"/>
+              </w:rPr>
+              <w:t xml:space="preserve">Transfer micro-F1</w:t>
+            </w:r>
+          </w:p>
+        </w:tc>
+      </w:tr>
+      <w:tr>
+        <w:tc>
+          <w:tcPr>
+            <w:tcBorders>
+              <w:left w:val="nil"/>
+              <w:right w:val="nil"/>
+              <w:top w:val="nil"/>
+              <w:bottom w:val="single" w:sz="4" w:color="D9E1E8"/>
+            </w:tcBorders>
+            <w:vAlign w:val="center"/>
+          </w:tcPr>
+          <w:p>
+            <w:pPr>
+              <w:pStyle w:val="Compact"/>
+              <w:spacing w:before="0" w:after="20" w:line="240" w:lineRule="auto"/>
+              <w:jc w:val="center"/>
+              <w:keepNext w:val="0"/>
+              <w:keepLines/>
+              <w:widowControl w:val="1"/>
+            </w:pPr>
+            <w:r>
+              <w:rPr>
+                <w:rFonts w:ascii="Georgia" w:hAnsi="Georgia"/>
+                <w:sz w:val="19"/>
+              </w:rPr>
+              <w:t xml:space="preserve">Herath</w:t>
+            </w:r>
+          </w:p>
+        </w:tc>
+        <w:tc>
+          <w:tcPr>
+            <w:tcBorders>
+              <w:left w:val="nil"/>
+              <w:right w:val="nil"/>
+              <w:top w:val="nil"/>
+              <w:bottom w:val="single" w:sz="4" w:color="D9E1E8"/>
+            </w:tcBorders>
+            <w:vAlign w:val="center"/>
+          </w:tcPr>
+          <w:p>
+            <w:pPr>
+              <w:pStyle w:val="Compact"/>
+              <w:spacing w:before="0" w:after="20" w:line="240" w:lineRule="auto"/>
+              <w:jc w:val="center"/>
+              <w:keepNext w:val="0"/>
+              <w:keepLines/>
+              <w:widowControl w:val="1"/>
+            </w:pPr>
+            <w:r>
+              <w:rPr>
+                <w:rFonts w:ascii="Georgia" w:hAnsi="Georgia"/>
+                <w:sz w:val="19"/>
+              </w:rPr>
+              <w:t xml:space="preserve">sentence (20)</w:t>
+            </w:r>
+          </w:p>
+        </w:tc>
+        <w:tc>
+          <w:tcPr>
+            <w:tcBorders>
+              <w:left w:val="nil"/>
+              <w:right w:val="nil"/>
+              <w:top w:val="nil"/>
+              <w:bottom w:val="single" w:sz="4" w:color="D9E1E8"/>
+            </w:tcBorders>
+            <w:vAlign w:val="center"/>
+          </w:tcPr>
+          <w:p>
+            <w:pPr>
+              <w:pStyle w:val="Compact"/>
+              <w:spacing w:before="0" w:after="20" w:line="240" w:lineRule="auto"/>
+              <w:jc w:val="center"/>
+              <w:keepNext w:val="0"/>
+              <w:keepLines/>
+              <w:widowControl w:val="1"/>
+            </w:pPr>
+            <w:r>
+              <w:rPr>
+                <w:rFonts w:ascii="Georgia" w:hAnsi="Georgia"/>
+                <w:sz w:val="19"/>
+              </w:rPr>
+              <w:t xml:space="preserve">student feedback</w:t>
+            </w:r>
+          </w:p>
+        </w:tc>
+        <w:tc>
+          <w:tcPr>
+            <w:tcBorders>
+              <w:left w:val="nil"/>
+              <w:right w:val="nil"/>
+              <w:top w:val="nil"/>
+              <w:bottom w:val="single" w:sz="4" w:color="D9E1E8"/>
+            </w:tcBorders>
+            <w:vAlign w:val="center"/>
+          </w:tcPr>
+          <w:p>
+            <w:pPr>
+              <w:pStyle w:val="Compact"/>
+              <w:spacing w:before="0" w:after="20" w:line="240" w:lineRule="auto"/>
+              <w:jc w:val="center"/>
+              <w:keepNext w:val="0"/>
+              <w:keepLines/>
+              <w:widowControl w:val="1"/>
+            </w:pPr>
+            <w:r>
+              <w:rPr>
+                <w:rFonts w:ascii="Georgia" w:hAnsi="Georgia"/>
+                <w:sz w:val="19"/>
+              </w:rPr>
+              <w:t xml:space="preserve">0.481</w:t>
+            </w:r>
+          </w:p>
+        </w:tc>
+      </w:tr>
+      <w:tr>
+        <w:tc>
+          <w:tcPr>
+            <w:tcBorders>
+              <w:left w:val="nil"/>
+              <w:right w:val="nil"/>
+              <w:top w:val="nil"/>
+              <w:bottom w:val="single" w:sz="4" w:color="D9E1E8"/>
+            </w:tcBorders>
+            <w:vAlign w:val="center"/>
+          </w:tcPr>
+          <w:p>
+            <w:pPr>
+              <w:pStyle w:val="Compact"/>
+              <w:spacing w:before="0" w:after="20" w:line="240" w:lineRule="auto"/>
+              <w:jc w:val="center"/>
+              <w:keepNext w:val="0"/>
+              <w:keepLines/>
+              <w:widowControl w:val="1"/>
+            </w:pPr>
+            <w:r>
+              <w:rPr>
+                <w:rFonts w:ascii="Georgia" w:hAnsi="Georgia"/>
+                <w:sz w:val="19"/>
+              </w:rPr>
+              <w:t xml:space="preserve">EduRABSA</w:t>
+            </w:r>
+          </w:p>
+        </w:tc>
+        <w:tc>
+          <w:tcPr>
+            <w:tcBorders>
+              <w:left w:val="nil"/>
+              <w:right w:val="nil"/>
+              <w:top w:val="nil"/>
+              <w:bottom w:val="single" w:sz="4" w:color="D9E1E8"/>
+            </w:tcBorders>
+            <w:vAlign w:val="center"/>
+          </w:tcPr>
+          <w:p>
+            <w:pPr>
+              <w:pStyle w:val="Compact"/>
+              <w:spacing w:before="0" w:after="20" w:line="240" w:lineRule="auto"/>
+              <w:jc w:val="center"/>
+              <w:keepNext w:val="0"/>
+              <w:keepLines/>
+              <w:widowControl w:val="1"/>
+            </w:pPr>
+            <w:r>
+              <w:rPr>
+                <w:rFonts w:ascii="Georgia" w:hAnsi="Georgia"/>
+                <w:sz w:val="19"/>
+              </w:rPr>
+              <w:t xml:space="preserve">sentence (38)</w:t>
+            </w:r>
+          </w:p>
+        </w:tc>
+        <w:tc>
+          <w:tcPr>
+            <w:tcBorders>
+              <w:left w:val="nil"/>
+              <w:right w:val="nil"/>
+              <w:top w:val="nil"/>
+              <w:bottom w:val="single" w:sz="4" w:color="D9E1E8"/>
+            </w:tcBorders>
+            <w:vAlign w:val="center"/>
+          </w:tcPr>
+          <w:p>
+            <w:pPr>
+              <w:pStyle w:val="Compact"/>
+              <w:spacing w:before="0" w:after="20" w:line="240" w:lineRule="auto"/>
+              <w:jc w:val="center"/>
+              <w:keepNext w:val="0"/>
+              <w:keepLines/>
+              <w:widowControl w:val="1"/>
+            </w:pPr>
+            <w:r>
+              <w:rPr>
+                <w:rFonts w:ascii="Georgia" w:hAnsi="Georgia"/>
+                <w:sz w:val="19"/>
+              </w:rPr>
+              <w:t xml:space="preserve">Waterloo course / teacher reviews</w:t>
+            </w:r>
+          </w:p>
+        </w:tc>
+        <w:tc>
+          <w:tcPr>
+            <w:tcBorders>
+              <w:left w:val="nil"/>
+              <w:right w:val="nil"/>
+              <w:top w:val="nil"/>
+              <w:bottom w:val="single" w:sz="4" w:color="D9E1E8"/>
+            </w:tcBorders>
+            <w:vAlign w:val="center"/>
+          </w:tcPr>
+          <w:p>
+            <w:pPr>
+              <w:pStyle w:val="Compact"/>
+              <w:spacing w:before="0" w:after="20" w:line="240" w:lineRule="auto"/>
+              <w:jc w:val="center"/>
+              <w:keepNext w:val="0"/>
+              <w:keepLines/>
+              <w:widowControl w:val="1"/>
+            </w:pPr>
+            <w:r>
+              <w:rPr>
+                <w:rFonts w:ascii="Georgia" w:hAnsi="Georgia"/>
+                <w:sz w:val="19"/>
+              </w:rPr>
+              <w:t xml:space="preserve">0.275</w:t>
+            </w:r>
+          </w:p>
+        </w:tc>
+      </w:tr>
+      <w:tr>
+        <w:tc>
+          <w:tcPr>
+            <w:tcBorders>
+              <w:left w:val="nil"/>
+              <w:right w:val="nil"/>
+              <w:top w:val="nil"/>
+              <w:bottom w:val="single" w:sz="4" w:color="D9E1E8"/>
+            </w:tcBorders>
+            <w:vAlign w:val="center"/>
+          </w:tcPr>
+          <w:p>
+            <w:pPr>
+              <w:pStyle w:val="Compact"/>
+              <w:spacing w:before="0" w:after="20" w:line="240" w:lineRule="auto"/>
+              <w:jc w:val="center"/>
+              <w:keepNext w:val="0"/>
+              <w:keepLines/>
+              <w:widowControl w:val="1"/>
+            </w:pPr>
+            <w:r>
+              <w:rPr>
+                <w:rFonts w:ascii="Georgia" w:hAnsi="Georgia"/>
+                <w:sz w:val="19"/>
+              </w:rPr>
+              <w:t xml:space="preserve">M-ABSA</w:t>
+            </w:r>
+          </w:p>
+        </w:tc>
+        <w:tc>
+          <w:tcPr>
+            <w:tcBorders>
+              <w:left w:val="nil"/>
+              <w:right w:val="nil"/>
+              <w:top w:val="nil"/>
+              <w:bottom w:val="single" w:sz="4" w:color="D9E1E8"/>
+            </w:tcBorders>
+            <w:vAlign w:val="center"/>
+          </w:tcPr>
+          <w:p>
+            <w:pPr>
+              <w:pStyle w:val="Compact"/>
+              <w:spacing w:before="0" w:after="20" w:line="240" w:lineRule="auto"/>
+              <w:jc w:val="center"/>
+              <w:keepNext w:val="0"/>
+              <w:keepLines/>
+              <w:widowControl w:val="1"/>
+            </w:pPr>
+            <w:r>
+              <w:rPr>
+                <w:rFonts w:ascii="Georgia" w:hAnsi="Georgia"/>
+                <w:sz w:val="19"/>
+              </w:rPr>
+              <w:t xml:space="preserve">sentence (14)</w:t>
+            </w:r>
+          </w:p>
+        </w:tc>
+        <w:tc>
+          <w:tcPr>
+            <w:tcBorders>
+              <w:left w:val="nil"/>
+              <w:right w:val="nil"/>
+              <w:top w:val="nil"/>
+              <w:bottom w:val="single" w:sz="4" w:color="D9E1E8"/>
+            </w:tcBorders>
+            <w:vAlign w:val="center"/>
+          </w:tcPr>
+          <w:p>
+            <w:pPr>
+              <w:pStyle w:val="Compact"/>
+              <w:spacing w:before="0" w:after="20" w:line="240" w:lineRule="auto"/>
+              <w:jc w:val="center"/>
+              <w:keepNext w:val="0"/>
+              <w:keepLines/>
+              <w:widowControl w:val="1"/>
+            </w:pPr>
+            <w:r>
+              <w:rPr>
+                <w:rFonts w:ascii="Georgia" w:hAnsi="Georgia"/>
+                <w:sz w:val="19"/>
+              </w:rPr>
+              <w:t xml:space="preserve">Coursera MOOC</w:t>
+            </w:r>
+          </w:p>
+        </w:tc>
+        <w:tc>
+          <w:tcPr>
+            <w:tcBorders>
+              <w:left w:val="nil"/>
+              <w:right w:val="nil"/>
+              <w:top w:val="nil"/>
+              <w:bottom w:val="single" w:sz="4" w:color="D9E1E8"/>
+            </w:tcBorders>
+            <w:vAlign w:val="center"/>
+          </w:tcPr>
+          <w:p>
+            <w:pPr>
+              <w:pStyle w:val="Compact"/>
+              <w:spacing w:before="0" w:after="20" w:line="240" w:lineRule="auto"/>
+              <w:jc w:val="center"/>
+              <w:keepNext w:val="0"/>
+              <w:keepLines/>
+              <w:widowControl w:val="1"/>
+            </w:pPr>
+            <w:r>
+              <w:rPr>
+                <w:rFonts w:ascii="Georgia" w:hAnsi="Georgia"/>
+                <w:sz w:val="19"/>
+              </w:rPr>
+              <w:t xml:space="preserve">0.263</w:t>
+            </w:r>
+          </w:p>
+        </w:tc>
+      </w:tr>
+      <w:tr>
+        <w:tc>
+          <w:tcPr>
+            <w:tcBorders>
+              <w:left w:val="nil"/>
+              <w:right w:val="nil"/>
+              <w:top w:val="nil"/>
+              <w:bottom w:val="nil"/>
+            </w:tcBorders>
+            <w:vAlign w:val="center"/>
+          </w:tcPr>
+          <w:p>
+            <w:pPr>
+              <w:pStyle w:val="Compact"/>
+              <w:spacing w:before="0" w:after="20" w:line="240" w:lineRule="auto"/>
+              <w:jc w:val="center"/>
+              <w:keepNext w:val="0"/>
+              <w:keepLines/>
+              <w:widowControl w:val="1"/>
+            </w:pPr>
+            <w:r>
+              <w:rPr>
+                <w:rFonts w:ascii="Georgia" w:hAnsi="Georgia"/>
+                <w:sz w:val="19"/>
+              </w:rPr>
+              <w:t xml:space="preserve">OATS</w:t>
+            </w:r>
+          </w:p>
+        </w:tc>
+        <w:tc>
+          <w:tcPr>
+            <w:tcBorders>
+              <w:left w:val="nil"/>
+              <w:right w:val="nil"/>
+              <w:top w:val="nil"/>
+              <w:bottom w:val="nil"/>
+            </w:tcBorders>
+            <w:vAlign w:val="center"/>
+          </w:tcPr>
+          <w:p>
+            <w:pPr>
+              <w:pStyle w:val="Compact"/>
+              <w:spacing w:before="0" w:after="20" w:line="240" w:lineRule="auto"/>
+              <w:jc w:val="center"/>
+              <w:keepNext w:val="0"/>
+              <w:keepLines/>
+              <w:widowControl w:val="1"/>
+            </w:pPr>
+            <w:r>
+              <w:rPr>
+                <w:rFonts w:ascii="Georgia" w:hAnsi="Georgia"/>
+                <w:sz w:val="19"/>
+              </w:rPr>
+              <w:t xml:space="preserve">review (70)</w:t>
+            </w:r>
+          </w:p>
+        </w:tc>
+        <w:tc>
+          <w:tcPr>
+            <w:tcBorders>
+              <w:left w:val="nil"/>
+              <w:right w:val="nil"/>
+              <w:top w:val="nil"/>
+              <w:bottom w:val="nil"/>
+            </w:tcBorders>
+            <w:vAlign w:val="center"/>
+          </w:tcPr>
+          <w:p>
+            <w:pPr>
+              <w:pStyle w:val="Compact"/>
+              <w:spacing w:before="0" w:after="20" w:line="240" w:lineRule="auto"/>
+              <w:jc w:val="center"/>
+              <w:keepNext w:val="0"/>
+              <w:keepLines/>
+              <w:widowControl w:val="1"/>
+            </w:pPr>
+            <w:r>
+              <w:rPr>
+                <w:rFonts w:ascii="Georgia" w:hAnsi="Georgia"/>
+                <w:sz w:val="19"/>
+              </w:rPr>
+              <w:t xml:space="preserve">Coursera MOOC</w:t>
+            </w:r>
+          </w:p>
+        </w:tc>
+        <w:tc>
+          <w:tcPr>
+            <w:tcBorders>
+              <w:left w:val="nil"/>
+              <w:right w:val="nil"/>
+              <w:top w:val="nil"/>
+              <w:bottom w:val="nil"/>
+            </w:tcBorders>
+            <w:vAlign w:val="center"/>
+          </w:tcPr>
+          <w:p>
+            <w:pPr>
+              <w:pStyle w:val="Compact"/>
+              <w:spacing w:before="0" w:after="20" w:line="240" w:lineRule="auto"/>
+              <w:jc w:val="center"/>
+              <w:keepNext w:val="0"/>
+              <w:keepLines/>
+              <w:widowControl w:val="1"/>
+            </w:pPr>
+            <w:r>
+              <w:rPr>
+                <w:rFonts w:ascii="Georgia" w:hAnsi="Georgia"/>
+                <w:sz w:val="19"/>
+              </w:rPr>
+              <w:t xml:space="preserve">0.275</w:t>
+            </w:r>
+          </w:p>
+        </w:tc>
+      </w:tr>
+    </w:tbl>
+    <w:bookmarkEnd w:id="103"/>
+    <w:bookmarkEnd w:id="104"/>
+    <w:bookmarkStart w:id="146" w:name="bibliography"/>
     <w:p>
       <w:pPr>
         <w:pStyle w:val="Heading2"/>
@@ -40909,7 +42030,7 @@
       <w:r>
         <w:t xml:space="preserve"> </w:t>
       </w:r>
-      <w:hyperlink r:id="rId103">
+      <w:hyperlink r:id="rId105">
         <w:r>
           <w:rPr>
             <w:rStyle w:val="Hyperlink"/>
@@ -40953,7 +42074,7 @@
       <w:r>
         <w:t xml:space="preserve"> </w:t>
       </w:r>
-      <w:hyperlink r:id="rId104">
+      <w:hyperlink r:id="rId106">
         <w:r>
           <w:rPr>
             <w:rStyle w:val="Hyperlink"/>
@@ -40984,7 +42105,7 @@
       <w:r>
         <w:t xml:space="preserve"> </w:t>
       </w:r>
-      <w:hyperlink r:id="rId105">
+      <w:hyperlink r:id="rId107">
         <w:r>
           <w:rPr>
             <w:rStyle w:val="Hyperlink"/>
@@ -41015,7 +42136,7 @@
       <w:r>
         <w:t xml:space="preserve"> </w:t>
       </w:r>
-      <w:hyperlink r:id="rId106">
+      <w:hyperlink r:id="rId108">
         <w:r>
           <w:rPr>
             <w:rStyle w:val="Hyperlink"/>
@@ -41046,7 +42167,7 @@
       <w:r>
         <w:t xml:space="preserve"> </w:t>
       </w:r>
-      <w:hyperlink r:id="rId107">
+      <w:hyperlink r:id="rId109">
         <w:r>
           <w:rPr>
             <w:rStyle w:val="Hyperlink"/>
@@ -41077,7 +42198,7 @@
       <w:r>
         <w:t xml:space="preserve"> </w:t>
       </w:r>
-      <w:hyperlink r:id="rId108">
+      <w:hyperlink r:id="rId110">
         <w:r>
           <w:rPr>
             <w:rStyle w:val="Hyperlink"/>
@@ -41108,7 +42229,7 @@
       <w:r>
         <w:t xml:space="preserve"> </w:t>
       </w:r>
-      <w:hyperlink r:id="rId109">
+      <w:hyperlink r:id="rId111">
         <w:r>
           <w:rPr>
             <w:rStyle w:val="Hyperlink"/>
@@ -41139,7 +42260,7 @@
       <w:r>
         <w:t xml:space="preserve"> </w:t>
       </w:r>
-      <w:hyperlink r:id="rId110">
+      <w:hyperlink r:id="rId112">
         <w:r>
           <w:rPr>
             <w:rStyle w:val="Hyperlink"/>
@@ -41170,7 +42291,7 @@
       <w:r>
         <w:t xml:space="preserve"> </w:t>
       </w:r>
-      <w:hyperlink r:id="rId111">
+      <w:hyperlink r:id="rId113">
         <w:r>
           <w:rPr>
             <w:rStyle w:val="Hyperlink"/>
@@ -41214,7 +42335,7 @@
       <w:r>
         <w:t xml:space="preserve"> </w:t>
       </w:r>
-      <w:hyperlink r:id="rId112">
+      <w:hyperlink r:id="rId114">
         <w:r>
           <w:rPr>
             <w:rStyle w:val="Hyperlink"/>
@@ -41258,7 +42379,7 @@
       <w:r>
         <w:t xml:space="preserve"> </w:t>
       </w:r>
-      <w:hyperlink r:id="rId113">
+      <w:hyperlink r:id="rId115">
         <w:r>
           <w:rPr>
             <w:rStyle w:val="Hyperlink"/>
@@ -41289,7 +42410,7 @@
       <w:r>
         <w:t xml:space="preserve"> </w:t>
       </w:r>
-      <w:hyperlink r:id="rId114">
+      <w:hyperlink r:id="rId116">
         <w:r>
           <w:rPr>
             <w:rStyle w:val="Hyperlink"/>
@@ -41320,7 +42441,7 @@
       <w:r>
         <w:t xml:space="preserve"> </w:t>
       </w:r>
-      <w:hyperlink r:id="rId115">
+      <w:hyperlink r:id="rId117">
         <w:r>
           <w:rPr>
             <w:rStyle w:val="Hyperlink"/>
@@ -41351,7 +42472,7 @@
       <w:r>
         <w:t xml:space="preserve"> </w:t>
       </w:r>
-      <w:hyperlink r:id="rId116">
+      <w:hyperlink r:id="rId118">
         <w:r>
           <w:rPr>
             <w:rStyle w:val="Hyperlink"/>
@@ -41382,7 +42503,7 @@
       <w:r>
         <w:t xml:space="preserve"> </w:t>
       </w:r>
-      <w:hyperlink r:id="rId117">
+      <w:hyperlink r:id="rId119">
         <w:r>
           <w:rPr>
             <w:rStyle w:val="Hyperlink"/>
@@ -41413,7 +42534,7 @@
       <w:r>
         <w:t xml:space="preserve"> </w:t>
       </w:r>
-      <w:hyperlink r:id="rId118">
+      <w:hyperlink r:id="rId120">
         <w:r>
           <w:rPr>
             <w:rStyle w:val="Hyperlink"/>
@@ -41444,7 +42565,7 @@
       <w:r>
         <w:t xml:space="preserve"> </w:t>
       </w:r>
-      <w:hyperlink r:id="rId119">
+      <w:hyperlink r:id="rId121">
         <w:r>
           <w:rPr>
             <w:rStyle w:val="Hyperlink"/>
@@ -41488,7 +42609,7 @@
       <w:r>
         <w:t xml:space="preserve"> </w:t>
       </w:r>
-      <w:hyperlink r:id="rId120">
+      <w:hyperlink r:id="rId122">
         <w:r>
           <w:rPr>
             <w:rStyle w:val="Hyperlink"/>
@@ -41532,7 +42653,7 @@
       <w:r>
         <w:t xml:space="preserve"> </w:t>
       </w:r>
-      <w:hyperlink r:id="rId121">
+      <w:hyperlink r:id="rId123">
         <w:r>
           <w:rPr>
             <w:rStyle w:val="Hyperlink"/>
@@ -41576,7 +42697,7 @@
       <w:r>
         <w:t xml:space="preserve"> </w:t>
       </w:r>
-      <w:hyperlink r:id="rId122">
+      <w:hyperlink r:id="rId124">
         <w:r>
           <w:rPr>
             <w:rStyle w:val="Hyperlink"/>
@@ -41607,7 +42728,7 @@
       <w:r>
         <w:t xml:space="preserve"> </w:t>
       </w:r>
-      <w:hyperlink r:id="rId123">
+      <w:hyperlink r:id="rId125">
         <w:r>
           <w:rPr>
             <w:rStyle w:val="Hyperlink"/>
@@ -41651,7 +42772,7 @@
       <w:r>
         <w:t xml:space="preserve"> </w:t>
       </w:r>
-      <w:hyperlink r:id="rId124">
+      <w:hyperlink r:id="rId126">
         <w:r>
           <w:rPr>
             <w:rStyle w:val="Hyperlink"/>
@@ -41695,7 +42816,7 @@
       <w:r>
         <w:t xml:space="preserve"> </w:t>
       </w:r>
-      <w:hyperlink r:id="rId125">
+      <w:hyperlink r:id="rId127">
         <w:r>
           <w:rPr>
             <w:rStyle w:val="Hyperlink"/>
@@ -41739,7 +42860,7 @@
       <w:r>
         <w:t xml:space="preserve"> </w:t>
       </w:r>
-      <w:hyperlink r:id="rId126">
+      <w:hyperlink r:id="rId128">
         <w:r>
           <w:rPr>
             <w:rStyle w:val="Hyperlink"/>
@@ -41783,7 +42904,7 @@
       <w:r>
         <w:t xml:space="preserve"> </w:t>
       </w:r>
-      <w:hyperlink r:id="rId127">
+      <w:hyperlink r:id="rId129">
         <w:r>
           <w:rPr>
             <w:rStyle w:val="Hyperlink"/>
@@ -41827,7 +42948,7 @@
       <w:r>
         <w:t xml:space="preserve"> </w:t>
       </w:r>
-      <w:hyperlink r:id="rId128">
+      <w:hyperlink r:id="rId130">
         <w:r>
           <w:rPr>
             <w:rStyle w:val="Hyperlink"/>
@@ -41858,7 +42979,7 @@
       <w:r>
         <w:t xml:space="preserve"> </w:t>
       </w:r>
-      <w:hyperlink r:id="rId129">
+      <w:hyperlink r:id="rId131">
         <w:r>
           <w:rPr>
             <w:rStyle w:val="Hyperlink"/>
@@ -41905,7 +43026,7 @@
       <w:r>
         <w:t xml:space="preserve"> </w:t>
       </w:r>
-      <w:hyperlink r:id="rId130">
+      <w:hyperlink r:id="rId132">
         <w:r>
           <w:rPr>
             <w:rStyle w:val="Hyperlink"/>
@@ -41936,7 +43057,7 @@
       <w:r>
         <w:t xml:space="preserve"> </w:t>
       </w:r>
-      <w:hyperlink r:id="rId131">
+      <w:hyperlink r:id="rId133">
         <w:r>
           <w:rPr>
             <w:rStyle w:val="Hyperlink"/>
@@ -41967,7 +43088,7 @@
       <w:r>
         <w:t xml:space="preserve"> </w:t>
       </w:r>
-      <w:hyperlink r:id="rId132">
+      <w:hyperlink r:id="rId134">
         <w:r>
           <w:rPr>
             <w:rStyle w:val="Hyperlink"/>
@@ -41998,7 +43119,7 @@
       <w:r>
         <w:t xml:space="preserve"> </w:t>
       </w:r>
-      <w:hyperlink r:id="rId133">
+      <w:hyperlink r:id="rId135">
         <w:r>
           <w:rPr>
             <w:rStyle w:val="Hyperlink"/>
@@ -42029,7 +43150,7 @@
       <w:r>
         <w:t xml:space="preserve"> </w:t>
       </w:r>
-      <w:hyperlink r:id="rId134">
+      <w:hyperlink r:id="rId136">
         <w:r>
           <w:rPr>
             <w:rStyle w:val="Hyperlink"/>
@@ -42060,7 +43181,7 @@
       <w:r>
         <w:t xml:space="preserve"> </w:t>
       </w:r>
-      <w:hyperlink r:id="rId135">
+      <w:hyperlink r:id="rId137">
         <w:r>
           <w:rPr>
             <w:rStyle w:val="Hyperlink"/>
@@ -42104,7 +43225,7 @@
       <w:r>
         <w:t xml:space="preserve"> </w:t>
       </w:r>
-      <w:hyperlink r:id="rId136">
+      <w:hyperlink r:id="rId138">
         <w:r>
           <w:rPr>
             <w:rStyle w:val="Hyperlink"/>
@@ -42135,7 +43256,7 @@
       <w:r>
         <w:t xml:space="preserve"> </w:t>
       </w:r>
-      <w:hyperlink r:id="rId137">
+      <w:hyperlink r:id="rId139">
         <w:r>
           <w:rPr>
             <w:rStyle w:val="Hyperlink"/>
@@ -42179,7 +43300,7 @@
       <w:r>
         <w:t xml:space="preserve"> </w:t>
       </w:r>
-      <w:hyperlink r:id="rId138">
+      <w:hyperlink r:id="rId140">
         <w:r>
           <w:rPr>
             <w:rStyle w:val="Hyperlink"/>
@@ -42210,7 +43331,7 @@
       <w:r>
         <w:t xml:space="preserve"> </w:t>
       </w:r>
-      <w:hyperlink r:id="rId139">
+      <w:hyperlink r:id="rId141">
         <w:r>
           <w:rPr>
             <w:rStyle w:val="Hyperlink"/>
@@ -42241,7 +43362,7 @@
       <w:r>
         <w:t xml:space="preserve"> </w:t>
       </w:r>
-      <w:hyperlink r:id="rId140">
+      <w:hyperlink r:id="rId142">
         <w:r>
           <w:rPr>
             <w:rStyle w:val="Hyperlink"/>
@@ -42285,7 +43406,7 @@
       <w:r>
         <w:t xml:space="preserve"> </w:t>
       </w:r>
-      <w:hyperlink r:id="rId141">
+      <w:hyperlink r:id="rId143">
         <w:r>
           <w:rPr>
             <w:rStyle w:val="Hyperlink"/>
@@ -42329,7 +43450,7 @@
       <w:r>
         <w:t xml:space="preserve"> </w:t>
       </w:r>
-      <w:hyperlink r:id="rId142">
+      <w:hyperlink r:id="rId144">
         <w:r>
           <w:rPr>
             <w:rStyle w:val="Hyperlink"/>
@@ -42360,7 +43481,7 @@
       <w:r>
         <w:t xml:space="preserve"> </w:t>
       </w:r>
-      <w:hyperlink r:id="rId143">
+      <w:hyperlink r:id="rId145">
         <w:r>
           <w:rPr>
             <w:rStyle w:val="Hyperlink"/>
@@ -42372,7 +43493,7 @@
         <w:t xml:space="preserve">. Proceedings of LREC-COLING 2024, pages 12336-12347.</w:t>
       </w:r>
     </w:p>
-    <w:bookmarkEnd w:id="144"/>
+    <w:bookmarkEnd w:id="146"/>
     <w:sectPr>
       <w:footerReference w:type="default" r:id="rId9"/>
       <w:pgSz w:h="15840" w:w="12240"/>

</xml_diff>

<commit_message>
Correct A.23 realism mechanism via assembled-real control
Assembled-real control (n2_assembled_real.py): real OMSCS sentences assembled into
multi-aspect documents are judged synthetic only 0.19 (~ real 0.15), REFUTING the
'uniform aspect coverage / document assembly' mechanism I committed last turn.
Corrected A.23 + Table A21 + limitation 2 + response #5a to the supported mechanism:
a weak per-sentence synthetic signal (0.37 vs 0.15 floor) accumulates across a full
review to 0.975; real sentences lack it. Ladder: real 0.15 < assembled 0.19 <
synth-sentence 0.37 < synth-review 0.975. Conclusion unchanged and better supported.

Co-Authored-By: Claude Opus 4.8 (1M context) <noreply@anthropic.com>
</commit_message>
<xml_diff>
--- a/paper/course_absa_manuscript.docx
+++ b/paper/course_absa_manuscript.docx
@@ -1410,7 +1410,7 @@
               <a:graphicData uri="http://schemas.openxmlformats.org/drawingml/2006/picture">
                 <pic:pic>
                   <pic:nvPicPr>
-                    <pic:cNvPr descr="C:/Users/apart/AppData/Local/Temp/html2doc_svg_239o7b/svg_0.png" id="16" name="Picture"/>
+                    <pic:cNvPr descr="C:/Users/apart/AppData/Local/Temp/html2doc_svg_VZpJst/svg_0.png" id="16" name="Picture"/>
                     <pic:cNvPicPr>
                       <a:picLocks noChangeArrowheads="1" noChangeAspect="1"/>
                     </pic:cNvPicPr>
@@ -10174,7 +10174,7 @@
               <a:graphicData uri="http://schemas.openxmlformats.org/drawingml/2006/picture">
                 <pic:pic>
                   <pic:nvPicPr>
-                    <pic:cNvPr descr="C:/Users/apart/AppData/Local/Temp/html2doc_svg_239o7b/svg_1.png" id="30" name="Picture"/>
+                    <pic:cNvPr descr="C:/Users/apart/AppData/Local/Temp/html2doc_svg_VZpJst/svg_1.png" id="30" name="Picture"/>
                     <pic:cNvPicPr>
                       <a:picLocks noChangeArrowheads="1" noChangeAspect="1"/>
                     </pic:cNvPicPr>
@@ -12519,7 +12519,7 @@
               <a:graphicData uri="http://schemas.openxmlformats.org/drawingml/2006/picture">
                 <pic:pic>
                   <pic:nvPicPr>
-                    <pic:cNvPr descr="C:/Users/apart/AppData/Local/Temp/html2doc_svg_239o7b/svg_2.png" id="35" name="Picture"/>
+                    <pic:cNvPr descr="C:/Users/apart/AppData/Local/Temp/html2doc_svg_VZpJst/svg_2.png" id="35" name="Picture"/>
                     <pic:cNvPicPr>
                       <a:picLocks noChangeArrowheads="1" noChangeAspect="1"/>
                     </pic:cNvPicPr>
@@ -12601,7 +12601,7 @@
               <a:graphicData uri="http://schemas.openxmlformats.org/drawingml/2006/picture">
                 <pic:pic>
                   <pic:nvPicPr>
-                    <pic:cNvPr descr="C:/Users/apart/AppData/Local/Temp/html2doc_svg_239o7b/svg_3.png" id="38" name="Picture"/>
+                    <pic:cNvPr descr="C:/Users/apart/AppData/Local/Temp/html2doc_svg_VZpJst/svg_3.png" id="38" name="Picture"/>
                     <pic:cNvPicPr>
                       <a:picLocks noChangeArrowheads="1" noChangeAspect="1"/>
                     </pic:cNvPicPr>
@@ -16203,7 +16203,7 @@
               <a:graphicData uri="http://schemas.openxmlformats.org/drawingml/2006/picture">
                 <pic:pic>
                   <pic:nvPicPr>
-                    <pic:cNvPr descr="C:/Users/apart/AppData/Local/Temp/html2doc_svg_239o7b/svg_4.png" id="44" name="Picture"/>
+                    <pic:cNvPr descr="C:/Users/apart/AppData/Local/Temp/html2doc_svg_VZpJst/svg_4.png" id="44" name="Picture"/>
                     <pic:cNvPicPr>
                       <a:picLocks noChangeArrowheads="1" noChangeAspect="1"/>
                     </pic:cNvPicPr>
@@ -16576,7 +16576,7 @@
         <w:widowControl w:val="1"/>
       </w:pPr>
       <w:r>
-        <w:t xml:space="preserve">Five limitations remain central. First, external validation uses two real educational corpora (Herath 9-aspect, EduRABSA 7-aspect) and conservative aspect overlaps, so broader claims about the entire 20-aspect schema still require additional real-data tests. These two targets are also sentence-level (Herath median 20 words, EduRABSA 38) while the synthetic corpus is full-length reviews (median 122 words), so transfer here is a cross-granularity test. This granularity mismatch is not, however, the limiting factor: a review-level real target (OATS, median 70 words) transfers no better than the sentence-level targets, so transfer difficulty is governed by how closely a target's aspect vocabulary and register align with the synthetic supervision rather than by review length (Appendix A.24). A full-review real benchmark matched to institutional course feedback is the natural next target; the one public review-level educational corpus is MOOC-focused (OATS-ABSA, Coursera reviews [41]), while course-evaluation feedback of the kind our schema targets remains annotated only at the sentence level [12]. Aspect-annotating a set of full-length institutional reviews (for example public OMSCS reviews) is therefore the concrete path to fully closing this granularity gap. Practitioners should therefore not read the transfer results as validating the full schema: only 9 of the 20 aspects are externally checked, synthetic-only training recovers about 60% of a real-trained model, and any high-stakes or personnel decision requires human-in-the-loop review rather than reliance on the eleven aspects that have no real-data validation. Second, the realism-validation analysis is conducted with LLM judges and improves prompt quality without establishing statistical indistinguishability from real reviews under an adversarial frontier-model detector, a bar that current LLM-generated text does not clear regardless of generator family; the realism that is operative for a labeled training benchmark is functional rather than perceptual, and is evidenced by the synthetic-to-real transfer results above, where a model trained on the synthetic corpus recovers real-review aspect and polarity signal on two independent external corpora. A distributional check calibrates the scale of the gap: at sentence granularity, MAUVE between the synthetic corpus and the real OMSCS reviews is 0.23, below the 0.98 real-to-real ceiling but well above the 0.03 MAUVE between two independent real educational corpora (OMSCS and Herath), so the synthetic text is in fact closer to its target real distribution than two real educational sources are to each other, and its distributional distance from real text is modest against the natural spread of real educational feedback. This residual gap reflects writing style rather than course or platform identity: scrubbing course codes, instructor names, and platform terms from both sides leaves it essentially unchanged. Most tellingly, the separability is a document-structure effect rather than a sentence-realism one: judged sentence by sentence, individual synthetic sentences are near-indistinguishable from real ones, with the same judge only 60% accurate (close to the 50% chance floor, versus 93% on whole reviews) and calling 63% of synthetic sentences real. What a frontier detector picks up is therefore how a review is assembled, its uniform coverage of the independently sampled aspects, not the individual sentences that carry the aspect-sentiment supervision (Appendix A.23). The label-faithfulness audit is validated three ways (a behavioral negative control, cross-provider judge agreement, and direct agreement with human labels at Cohen's kappa 0.56 on two annotated corpora, Section 5.7). Because the generator and the cost-matched auditor share a provider family, we further confirm that the audit is not merely detecting same-family latent patterns by reproducing the human-agreement check with a fully independent family (Google Gemini, Cohen's kappa 0.62); human re-annotation across the full 20-aspect schema remains the natural extension. Third, a nontrivial share of rows (841 of 10,000) reached the output-token cap and lowered full-corpus length-band adherence to 0.6819; this is a recoverable token-budget artifact rather than a control failure, since regenerating exactly those rows at a higher cap eliminates the truncation and restores full-corpus adherence to 0.7125, close to but still below the never-truncated rate of 0.7304 (Appendix A.14), and length band is in any case a soft stylistic target rather than a labeled control variable. Fourth, downstream training on the 10K corpus benefits from the Section 5.7 top-50% faithfulness filter (validated across two BERT-family architectures and both transfer targets); the audit score is the validated way to select training rows for sentiment-polarity fidelity on transferred aspects. Fifth, the downstream GPT comparison covers a full-test</w:t>
+        <w:t xml:space="preserve">Five limitations remain central. First, external validation uses two real educational corpora (Herath 9-aspect, EduRABSA 7-aspect) and conservative aspect overlaps, so broader claims about the entire 20-aspect schema still require additional real-data tests. These two targets are also sentence-level (Herath median 20 words, EduRABSA 38) while the synthetic corpus is full-length reviews (median 122 words), so transfer here is a cross-granularity test. This granularity mismatch is not, however, the limiting factor: a review-level real target (OATS, median 70 words) transfers no better than the sentence-level targets, so transfer difficulty is governed by how closely a target's aspect vocabulary and register align with the synthetic supervision rather than by review length (Appendix A.24). A full-review real benchmark matched to institutional course feedback is the natural next target; the one public review-level educational corpus is MOOC-focused (OATS-ABSA, Coursera reviews [41]), while course-evaluation feedback of the kind our schema targets remains annotated only at the sentence level [12]. Aspect-annotating a set of full-length institutional reviews (for example public OMSCS reviews) is therefore the concrete path to fully closing this granularity gap. Practitioners should therefore not read the transfer results as validating the full schema: only 9 of the 20 aspects are externally checked, synthetic-only training recovers about 60% of a real-trained model, and any high-stakes or personnel decision requires human-in-the-loop review rather than reliance on the eleven aspects that have no real-data validation. Second, the realism-validation analysis is conducted with LLM judges and improves prompt quality without establishing statistical indistinguishability from real reviews under an adversarial frontier-model detector, a bar that current LLM-generated text does not clear regardless of generator family; the realism that is operative for a labeled training benchmark is functional rather than perceptual, and is evidenced by the synthetic-to-real transfer results above, where a model trained on the synthetic corpus recovers real-review aspect and polarity signal on two independent external corpora. A distributional check calibrates the scale of the gap: at sentence granularity, MAUVE between the synthetic corpus and the real OMSCS reviews is 0.23, below the 0.98 real-to-real ceiling but well above the 0.03 MAUVE between two independent real educational corpora (OMSCS and Herath), so the synthetic text is in fact closer to its target real distribution than two real educational sources are to each other, and its distributional distance from real text is modest against the natural spread of real educational feedback. This residual gap reflects writing style rather than course or platform identity: scrubbing course codes, instructor names, and platform terms from both sides leaves it essentially unchanged. Most tellingly, the separability is a document-structure effect rather than a sentence-realism one: judged sentence by sentence, individual synthetic sentences are near-indistinguishable from real ones, with the same judge only 60% accurate (close to the 50% chance floor, versus 93% on whole reviews) and calling 63% of synthetic sentences real. The detectability is a cumulative property of extended synthetic text: a weak per-sentence signal accumulates across a full review, and a control that assembles real sentences into equally multi-aspect documents is still judged real, so it is not multi-aspect coverage or incoherence. The signal is thus orthogonal to the individual sentences that carry the aspect-sentiment supervision (Appendix A.23). The label-faithfulness audit is validated three ways (a behavioral negative control, cross-provider judge agreement, and direct agreement with human labels at Cohen's kappa 0.56 on two annotated corpora, Section 5.7). Because the generator and the cost-matched auditor share a provider family, we further confirm that the audit is not merely detecting same-family latent patterns by reproducing the human-agreement check with a fully independent family (Google Gemini, Cohen's kappa 0.62); human re-annotation across the full 20-aspect schema remains the natural extension. Third, a nontrivial share of rows (841 of 10,000) reached the output-token cap and lowered full-corpus length-band adherence to 0.6819; this is a recoverable token-budget artifact rather than a control failure, since regenerating exactly those rows at a higher cap eliminates the truncation and restores full-corpus adherence to 0.7125, close to but still below the never-truncated rate of 0.7304 (Appendix A.14), and length band is in any case a soft stylistic target rather than a labeled control variable. Fourth, downstream training on the 10K corpus benefits from the Section 5.7 top-50% faithfulness filter (validated across two BERT-family architectures and both transfer targets); the audit score is the validated way to select training rows for sentiment-polarity fidelity on transferred aspects. Fifth, the downstream GPT comparison covers a full-test</w:t>
       </w:r>
       <w:r>
         <w:t xml:space="preserve"> </w:t>
@@ -16848,7 +16848,7 @@
               <a:graphicData uri="http://schemas.openxmlformats.org/drawingml/2006/picture">
                 <pic:pic>
                   <pic:nvPicPr>
-                    <pic:cNvPr descr="C:/Users/apart/AppData/Local/Temp/html2doc_svg_239o7b/svg_5.png" id="51" name="Picture"/>
+                    <pic:cNvPr descr="C:/Users/apart/AppData/Local/Temp/html2doc_svg_VZpJst/svg_5.png" id="51" name="Picture"/>
                     <pic:cNvPicPr>
                       <a:picLocks noChangeArrowheads="1" noChangeAspect="1"/>
                     </pic:cNvPicPr>
@@ -21806,7 +21806,7 @@
               <a:graphicData uri="http://schemas.openxmlformats.org/drawingml/2006/picture">
                 <pic:pic>
                   <pic:nvPicPr>
-                    <pic:cNvPr descr="C:/Users/apart/AppData/Local/Temp/html2doc_svg_239o7b/svg_6.png" id="62" name="Picture"/>
+                    <pic:cNvPr descr="C:/Users/apart/AppData/Local/Temp/html2doc_svg_VZpJst/svg_6.png" id="62" name="Picture"/>
                     <pic:cNvPicPr>
                       <a:picLocks noChangeArrowheads="1" noChangeAspect="1"/>
                     </pic:cNvPicPr>
@@ -23615,7 +23615,7 @@
               <a:graphicData uri="http://schemas.openxmlformats.org/drawingml/2006/picture">
                 <pic:pic>
                   <pic:nvPicPr>
-                    <pic:cNvPr descr="C:/Users/apart/AppData/Local/Temp/html2doc_svg_239o7b/svg_7.png" id="67" name="Picture"/>
+                    <pic:cNvPr descr="C:/Users/apart/AppData/Local/Temp/html2doc_svg_VZpJst/svg_7.png" id="67" name="Picture"/>
                     <pic:cNvPicPr>
                       <a:picLocks noChangeArrowheads="1" noChangeAspect="1"/>
                     </pic:cNvPicPr>
@@ -25574,7 +25574,7 @@
               <a:graphicData uri="http://schemas.openxmlformats.org/drawingml/2006/picture">
                 <pic:pic>
                   <pic:nvPicPr>
-                    <pic:cNvPr descr="C:/Users/apart/AppData/Local/Temp/html2doc_svg_239o7b/svg_8.png" id="72" name="Picture"/>
+                    <pic:cNvPr descr="C:/Users/apart/AppData/Local/Temp/html2doc_svg_VZpJst/svg_8.png" id="72" name="Picture"/>
                     <pic:cNvPicPr>
                       <a:picLocks noChangeArrowheads="1" noChangeAspect="1"/>
                     </pic:cNvPicPr>
@@ -26411,7 +26411,7 @@
               <a:graphicData uri="http://schemas.openxmlformats.org/drawingml/2006/picture">
                 <pic:pic>
                   <pic:nvPicPr>
-                    <pic:cNvPr descr="C:/Users/apart/AppData/Local/Temp/html2doc_svg_239o7b/svg_9.png" id="75" name="Picture"/>
+                    <pic:cNvPr descr="C:/Users/apart/AppData/Local/Temp/html2doc_svg_VZpJst/svg_9.png" id="75" name="Picture"/>
                     <pic:cNvPicPr>
                       <a:picLocks noChangeArrowheads="1" noChangeAspect="1"/>
                     </pic:cNvPicPr>
@@ -31131,7 +31131,7 @@
               <a:graphicData uri="http://schemas.openxmlformats.org/drawingml/2006/picture">
                 <pic:pic>
                   <pic:nvPicPr>
-                    <pic:cNvPr descr="C:/Users/apart/AppData/Local/Temp/html2doc_svg_239o7b/svg_10.png" id="80" name="Picture"/>
+                    <pic:cNvPr descr="C:/Users/apart/AppData/Local/Temp/html2doc_svg_VZpJst/svg_10.png" id="80" name="Picture"/>
                     <pic:cNvPicPr>
                       <a:picLocks noChangeArrowheads="1" noChangeAspect="1"/>
                     </pic:cNvPicPr>
@@ -32335,7 +32335,7 @@
               <a:graphicData uri="http://schemas.openxmlformats.org/drawingml/2006/picture">
                 <pic:pic>
                   <pic:nvPicPr>
-                    <pic:cNvPr descr="C:/Users/apart/AppData/Local/Temp/html2doc_svg_239o7b/svg_11.png" id="86" name="Picture"/>
+                    <pic:cNvPr descr="C:/Users/apart/AppData/Local/Temp/html2doc_svg_VZpJst/svg_11.png" id="86" name="Picture"/>
                     <pic:cNvPicPr>
                       <a:picLocks noChangeArrowheads="1" noChangeAspect="1"/>
                     </pic:cNvPicPr>
@@ -32417,7 +32417,7 @@
               <a:graphicData uri="http://schemas.openxmlformats.org/drawingml/2006/picture">
                 <pic:pic>
                   <pic:nvPicPr>
-                    <pic:cNvPr descr="C:/Users/apart/AppData/Local/Temp/html2doc_svg_239o7b/svg_12.png" id="89" name="Picture"/>
+                    <pic:cNvPr descr="C:/Users/apart/AppData/Local/Temp/html2doc_svg_VZpJst/svg_12.png" id="89" name="Picture"/>
                     <pic:cNvPicPr>
                       <a:picLocks noChangeArrowheads="1" noChangeAspect="1"/>
                     </pic:cNvPicPr>
@@ -33238,7 +33238,7 @@
               <a:graphicData uri="http://schemas.openxmlformats.org/drawingml/2006/picture">
                 <pic:pic>
                   <pic:nvPicPr>
-                    <pic:cNvPr descr="C:/Users/apart/AppData/Local/Temp/html2doc_svg_239o7b/svg_13.png" id="94" name="Picture"/>
+                    <pic:cNvPr descr="C:/Users/apart/AppData/Local/Temp/html2doc_svg_VZpJst/svg_13.png" id="94" name="Picture"/>
                     <pic:cNvPicPr>
                       <a:picLocks noChangeArrowheads="1" noChangeAspect="1"/>
                     </pic:cNvPicPr>
@@ -40898,7 +40898,7 @@
         <w:widowControl w:val="1"/>
       </w:pPr>
       <w:r>
-        <w:t xml:space="preserve">The realism-validation judge separates whole synthetic reviews from real ones easily, but this reflects document structure rather than the realism of the text itself. We re-ran the identical real-versus-synthetic judgment at sentence granularity, giving the judge one sentence at a time (150 synthetic and 150 real OMSCS sentences of 5 to 40 words), and compared it to the review-level decision (Table A21). Accuracy falls from 93% to 60%, close to the 50% chance floor: the judge flags only 37% of synthetic sentences as synthetic (versus 97% of whole reviews) and calls 63% of them real, while its false-synthetic rate on real sentences is unchanged at 16%. Individual synthetic sentences are therefore near-indistinguishable from real ones to the same detector. The signal the detector uses at the review level is how the review is assembled: because aspects are sampled independently and the generator is asked to express each assigned aspect, a synthetic review covers its aspects uniformly and reads as balanced or checklist-like, whereas real reviews dwell on one or two aspects and mention others in passing. This document-assembly regularity is orthogonal to the sentence-level aspect-sentiment labels the corpus supplies for training, and a MAUVE gap of 0.23 between the sentence pools confirms only an aggregate distributional shift, not per-sentence detectability. Script:</w:t>
+        <w:t xml:space="preserve">The realism-validation judge separates whole synthetic reviews from real ones easily, but this reflects document structure rather than the realism of the text itself. We re-ran the identical real-versus-synthetic judgment at sentence granularity, giving the judge one sentence at a time (150 synthetic and 150 real OMSCS sentences of 5 to 40 words), and compared it to the review-level decision (Table A21). Accuracy falls from 93% to 60%, close to the 50% chance floor: the judge flags only 37% of synthetic sentences as synthetic (versus 97% of whole reviews) and calls 63% of them real, while its false-synthetic rate on real sentences is unchanged at 16%. Individual synthetic sentences are therefore near-indistinguishable from real ones to the same detector. The detectability is instead a cumulative property of extended synthetic text: each synthetic sentence carries only a weak signal (flagged synthetic 37% of the time, against a 15% floor on real sentences), and that signal accumulates across a full generated review to near-certain detection (97%). To confirm this is not merely an effect of covering several aspects in one document, we ran a control that assembles real OMSCS sentences from the same course into equally multi-aspect documents (mean 63 words); these all-real-sentence documents are judged synthetic only 19% of the time, essentially the real-review rate, so neither multi-aspect coverage nor mild incoherence triggers the tell (Table A21). The signal is the accumulated style of genuinely synthetic text, which is orthogonal to the sentence-level aspect-sentiment labels the corpus supplies for training; a MAUVE gap of 0.23 between the sentence pools reflects an aggregate distributional shift consistent with this weak per-sentence signal. Scripts:</w:t>
       </w:r>
       <w:r>
         <w:t xml:space="preserve"> </w:t>
@@ -40908,6 +40908,18 @@
           <w:rStyle w:val="VerbatimChar"/>
         </w:rPr>
         <w:t xml:space="preserve">paper/n2_sentence_judge.py</w:t>
+      </w:r>
+      <w:r>
+        <w:t xml:space="preserve">,</w:t>
+      </w:r>
+      <w:r>
+        <w:t xml:space="preserve"> </w:t>
+      </w:r>
+      <w:r>
+        <w:rPr>
+          <w:rStyle w:val="VerbatimChar"/>
+        </w:rPr>
+        <w:t xml:space="preserve">paper/n2_assembled_real.py</w:t>
       </w:r>
       <w:r>
         <w:t xml:space="preserve">.</w:t>
@@ -40941,7 +40953,7 @@
           <w:b w:val="0"/>
           <w:i/>
         </w:rPr>
-        <w:t>Real-versus-synthetic judge (gpt-5.4) at review granularity versus sentence granularity. At the sentence level the judge is near the 50% chance floor, so whole-review detectability is a document-structure effect, not a property of the sentences.</w:t>
+        <w:t>Rate at which the real-versus-synthetic judge (gpt-5.4) flags text as synthetic, across four conditions. A weak per-sentence signal accumulates over a full synthetic review; assembling real sentences into equally multi-aspect documents does not reproduce it, so the tell is the accumulated style of synthetic text rather than multi-aspect coverage or incoherence.</w:t>
       </w:r>
     </w:p>
     <w:tbl>
@@ -40950,7 +40962,7 @@
         <w:tblW w:type="pct" w:w="5000"/>
         <w:jc w:val="center"/>
         <w:tblLook w:firstRow="1" w:lastRow="0" w:firstColumn="0" w:lastColumn="0" w:noHBand="0" w:noVBand="0" w:val="0020"/>
-        <w:tblCaption w:val="Table A21. Real-versus-synthetic judge (gpt-5.4) at review granularity versus sentence granularity. At the sentence level the judge is near the 50% chance floor, so whole-review detectability is a document-structure effect, not a property of the sentences."/>
+        <w:tblCaption w:val="Table A21. Rate at which the real-versus-synthetic judge (gpt-5.4) flags text as synthetic, across four conditions. A weak per-sentence signal accumulates over a full synthetic review; assembling real sentences into equally multi-aspect documents does not reproduce it, so the tell is the accumulated style of synthetic text rather than multi-aspect coverage or incoherence."/>
         <w:tblLayout w:type="autofit"/>
         <w:tblBorders>
           <w:top w:val="single" w:sz="10" w:color="4F6272"/>
@@ -40962,10 +40974,9 @@
         </w:tblBorders>
       </w:tblPr>
       <w:tblGrid>
-        <w:gridCol w:w="1980"/>
-        <w:gridCol w:w="1980"/>
-        <w:gridCol w:w="1980"/>
-        <w:gridCol w:w="1980"/>
+        <w:gridCol w:w="2640"/>
+        <w:gridCol w:w="2640"/>
+        <w:gridCol w:w="2640"/>
       </w:tblGrid>
       <w:tr>
         <w:trPr>
@@ -40997,7 +41008,7 @@
                 <w:b/>
                 <w:sz w:val="19"/>
               </w:rPr>
-              <w:t xml:space="preserve">Granularity</w:t>
+              <w:t xml:space="preserve">Condition</w:t>
             </w:r>
           </w:p>
         </w:tc>
@@ -41027,7 +41038,7 @@
                 <w:b/>
                 <w:sz w:val="19"/>
               </w:rPr>
-              <w:t xml:space="preserve">Synthetic flagged synthetic</w:t>
+              <w:t xml:space="preserve">Median words</w:t>
             </w:r>
           </w:p>
         </w:tc>
@@ -41057,37 +41068,7 @@
                 <w:b/>
                 <w:sz w:val="19"/>
               </w:rPr>
-              <w:t xml:space="preserve">Real flagged synthetic</w:t>
-            </w:r>
-          </w:p>
-        </w:tc>
-        <w:tc>
-          <w:tcPr>
-            <w:shd w:fill="EEF3F7"/>
-            <w:tcBorders>
-              <w:left w:val="nil"/>
-              <w:right w:val="nil"/>
-              <w:top w:val="nil"/>
-              <w:bottom w:val="single" w:sz="8" w:color="9FB0C2"/>
-            </w:tcBorders>
-            <w:vAlign w:val="center"/>
-          </w:tcPr>
-          <w:p>
-            <w:pPr>
-              <w:pStyle w:val="Compact"/>
-              <w:spacing w:before="0" w:after="20" w:line="240" w:lineRule="auto"/>
-              <w:jc w:val="center"/>
-              <w:keepNext w:val="0"/>
-              <w:keepLines/>
-              <w:widowControl w:val="1"/>
-            </w:pPr>
-            <w:r>
-              <w:rPr>
-                <w:rFonts w:ascii="Georgia" w:hAnsi="Georgia"/>
-                <w:b/>
-                <w:sz w:val="19"/>
-              </w:rPr>
-              <w:t xml:space="preserve">Overall accuracy</w:t>
+              <w:t xml:space="preserve">Flagged synthetic</w:t>
             </w:r>
           </w:p>
         </w:tc>
@@ -41117,35 +41098,35 @@
                 <w:rFonts w:ascii="Georgia" w:hAnsi="Georgia"/>
                 <w:sz w:val="19"/>
               </w:rPr>
-              <w:t xml:space="preserve">Whole review</w:t>
-            </w:r>
-          </w:p>
-        </w:tc>
-        <w:tc>
-          <w:tcPr>
-            <w:tcBorders>
-              <w:left w:val="nil"/>
-              <w:right w:val="nil"/>
-              <w:top w:val="nil"/>
-              <w:bottom w:val="single" w:sz="4" w:color="D9E1E8"/>
-            </w:tcBorders>
-            <w:vAlign w:val="center"/>
-          </w:tcPr>
-          <w:p>
-            <w:pPr>
-              <w:pStyle w:val="Compact"/>
-              <w:spacing w:before="0" w:after="20" w:line="240" w:lineRule="auto"/>
-              <w:jc w:val="center"/>
-              <w:keepNext w:val="0"/>
-              <w:keepLines/>
-              <w:widowControl w:val="1"/>
-            </w:pPr>
-            <w:r>
-              <w:rPr>
-                <w:rFonts w:ascii="Georgia" w:hAnsi="Georgia"/>
-                <w:sz w:val="19"/>
-              </w:rPr>
-              <w:t xml:space="preserve">0.975</w:t>
+              <w:t xml:space="preserve">Real full reviews</w:t>
+            </w:r>
+          </w:p>
+        </w:tc>
+        <w:tc>
+          <w:tcPr>
+            <w:tcBorders>
+              <w:left w:val="nil"/>
+              <w:right w:val="nil"/>
+              <w:top w:val="nil"/>
+              <w:bottom w:val="single" w:sz="4" w:color="D9E1E8"/>
+            </w:tcBorders>
+            <w:vAlign w:val="center"/>
+          </w:tcPr>
+          <w:p>
+            <w:pPr>
+              <w:pStyle w:val="Compact"/>
+              <w:spacing w:before="0" w:after="20" w:line="240" w:lineRule="auto"/>
+              <w:jc w:val="center"/>
+              <w:keepNext w:val="0"/>
+              <w:keepLines/>
+              <w:widowControl w:val="1"/>
+            </w:pPr>
+            <w:r>
+              <w:rPr>
+                <w:rFonts w:ascii="Georgia" w:hAnsi="Georgia"/>
+                <w:sz w:val="19"/>
+              </w:rPr>
+              <w:t xml:space="preserve">104</w:t>
             </w:r>
           </w:p>
         </w:tc>
@@ -41174,34 +41155,6 @@
                 <w:sz w:val="19"/>
               </w:rPr>
               <w:t xml:space="preserve">0.15</w:t>
-            </w:r>
-          </w:p>
-        </w:tc>
-        <w:tc>
-          <w:tcPr>
-            <w:tcBorders>
-              <w:left w:val="nil"/>
-              <w:right w:val="nil"/>
-              <w:top w:val="nil"/>
-              <w:bottom w:val="single" w:sz="4" w:color="D9E1E8"/>
-            </w:tcBorders>
-            <w:vAlign w:val="center"/>
-          </w:tcPr>
-          <w:p>
-            <w:pPr>
-              <w:pStyle w:val="Compact"/>
-              <w:spacing w:before="0" w:after="20" w:line="240" w:lineRule="auto"/>
-              <w:jc w:val="center"/>
-              <w:keepNext w:val="0"/>
-              <w:keepLines/>
-              <w:widowControl w:val="1"/>
-            </w:pPr>
-            <w:r>
-              <w:rPr>
-                <w:rFonts w:ascii="Georgia" w:hAnsi="Georgia"/>
-                <w:sz w:val="19"/>
-              </w:rPr>
-              <w:t xml:space="preserve">0.93</w:t>
             </w:r>
           </w:p>
         </w:tc>
@@ -41213,6 +41166,178 @@
               <w:left w:val="nil"/>
               <w:right w:val="nil"/>
               <w:top w:val="nil"/>
+              <w:bottom w:val="single" w:sz="4" w:color="D9E1E8"/>
+            </w:tcBorders>
+            <w:vAlign w:val="center"/>
+          </w:tcPr>
+          <w:p>
+            <w:pPr>
+              <w:pStyle w:val="Compact"/>
+              <w:spacing w:before="0" w:after="20" w:line="240" w:lineRule="auto"/>
+              <w:jc w:val="center"/>
+              <w:keepNext w:val="0"/>
+              <w:keepLines/>
+              <w:widowControl w:val="1"/>
+            </w:pPr>
+            <w:r>
+              <w:rPr>
+                <w:rFonts w:ascii="Georgia" w:hAnsi="Georgia"/>
+                <w:sz w:val="19"/>
+              </w:rPr>
+              <w:t xml:space="preserve">Assembled real (multi-aspect documents)</w:t>
+            </w:r>
+          </w:p>
+        </w:tc>
+        <w:tc>
+          <w:tcPr>
+            <w:tcBorders>
+              <w:left w:val="nil"/>
+              <w:right w:val="nil"/>
+              <w:top w:val="nil"/>
+              <w:bottom w:val="single" w:sz="4" w:color="D9E1E8"/>
+            </w:tcBorders>
+            <w:vAlign w:val="center"/>
+          </w:tcPr>
+          <w:p>
+            <w:pPr>
+              <w:pStyle w:val="Compact"/>
+              <w:spacing w:before="0" w:after="20" w:line="240" w:lineRule="auto"/>
+              <w:jc w:val="center"/>
+              <w:keepNext w:val="0"/>
+              <w:keepLines/>
+              <w:widowControl w:val="1"/>
+            </w:pPr>
+            <w:r>
+              <w:rPr>
+                <w:rFonts w:ascii="Georgia" w:hAnsi="Georgia"/>
+                <w:sz w:val="19"/>
+              </w:rPr>
+              <w:t xml:space="preserve">63</w:t>
+            </w:r>
+          </w:p>
+        </w:tc>
+        <w:tc>
+          <w:tcPr>
+            <w:tcBorders>
+              <w:left w:val="nil"/>
+              <w:right w:val="nil"/>
+              <w:top w:val="nil"/>
+              <w:bottom w:val="single" w:sz="4" w:color="D9E1E8"/>
+            </w:tcBorders>
+            <w:vAlign w:val="center"/>
+          </w:tcPr>
+          <w:p>
+            <w:pPr>
+              <w:pStyle w:val="Compact"/>
+              <w:spacing w:before="0" w:after="20" w:line="240" w:lineRule="auto"/>
+              <w:jc w:val="center"/>
+              <w:keepNext w:val="0"/>
+              <w:keepLines/>
+              <w:widowControl w:val="1"/>
+            </w:pPr>
+            <w:r>
+              <w:rPr>
+                <w:rFonts w:ascii="Georgia" w:hAnsi="Georgia"/>
+                <w:sz w:val="19"/>
+              </w:rPr>
+              <w:t xml:space="preserve">0.19</w:t>
+            </w:r>
+          </w:p>
+        </w:tc>
+      </w:tr>
+      <w:tr>
+        <w:tc>
+          <w:tcPr>
+            <w:tcBorders>
+              <w:left w:val="nil"/>
+              <w:right w:val="nil"/>
+              <w:top w:val="nil"/>
+              <w:bottom w:val="single" w:sz="4" w:color="D9E1E8"/>
+            </w:tcBorders>
+            <w:vAlign w:val="center"/>
+          </w:tcPr>
+          <w:p>
+            <w:pPr>
+              <w:pStyle w:val="Compact"/>
+              <w:spacing w:before="0" w:after="20" w:line="240" w:lineRule="auto"/>
+              <w:jc w:val="center"/>
+              <w:keepNext w:val="0"/>
+              <w:keepLines/>
+              <w:widowControl w:val="1"/>
+            </w:pPr>
+            <w:r>
+              <w:rPr>
+                <w:rFonts w:ascii="Georgia" w:hAnsi="Georgia"/>
+                <w:sz w:val="19"/>
+              </w:rPr>
+              <w:t xml:space="preserve">Individual synthetic sentences</w:t>
+            </w:r>
+          </w:p>
+        </w:tc>
+        <w:tc>
+          <w:tcPr>
+            <w:tcBorders>
+              <w:left w:val="nil"/>
+              <w:right w:val="nil"/>
+              <w:top w:val="nil"/>
+              <w:bottom w:val="single" w:sz="4" w:color="D9E1E8"/>
+            </w:tcBorders>
+            <w:vAlign w:val="center"/>
+          </w:tcPr>
+          <w:p>
+            <w:pPr>
+              <w:pStyle w:val="Compact"/>
+              <w:spacing w:before="0" w:after="20" w:line="240" w:lineRule="auto"/>
+              <w:jc w:val="center"/>
+              <w:keepNext w:val="0"/>
+              <w:keepLines/>
+              <w:widowControl w:val="1"/>
+            </w:pPr>
+            <w:r>
+              <w:rPr>
+                <w:rFonts w:ascii="Georgia" w:hAnsi="Georgia"/>
+                <w:sz w:val="19"/>
+              </w:rPr>
+              <w:t xml:space="preserve">~12</w:t>
+            </w:r>
+          </w:p>
+        </w:tc>
+        <w:tc>
+          <w:tcPr>
+            <w:tcBorders>
+              <w:left w:val="nil"/>
+              <w:right w:val="nil"/>
+              <w:top w:val="nil"/>
+              <w:bottom w:val="single" w:sz="4" w:color="D9E1E8"/>
+            </w:tcBorders>
+            <w:vAlign w:val="center"/>
+          </w:tcPr>
+          <w:p>
+            <w:pPr>
+              <w:pStyle w:val="Compact"/>
+              <w:spacing w:before="0" w:after="20" w:line="240" w:lineRule="auto"/>
+              <w:jc w:val="center"/>
+              <w:keepNext w:val="0"/>
+              <w:keepLines/>
+              <w:widowControl w:val="1"/>
+            </w:pPr>
+            <w:r>
+              <w:rPr>
+                <w:rFonts w:ascii="Georgia" w:hAnsi="Georgia"/>
+                <w:sz w:val="19"/>
+              </w:rPr>
+              <w:t xml:space="preserve">0.37</w:t>
+            </w:r>
+          </w:p>
+        </w:tc>
+      </w:tr>
+      <w:tr>
+        <w:tc>
+          <w:tcPr>
+            <w:tcBorders>
+              <w:left w:val="nil"/>
+              <w:right w:val="nil"/>
+              <w:top w:val="nil"/>
               <w:bottom w:val="nil"/>
             </w:tcBorders>
             <w:vAlign w:val="center"/>
@@ -41231,7 +41356,7 @@
                 <w:rFonts w:ascii="Georgia" w:hAnsi="Georgia"/>
                 <w:sz w:val="19"/>
               </w:rPr>
-              <w:t xml:space="preserve">Single sentence</w:t>
+              <w:t xml:space="preserve">Whole synthetic reviews</w:t>
             </w:r>
           </w:p>
         </w:tc>
@@ -41259,7 +41384,7 @@
                 <w:rFonts w:ascii="Georgia" w:hAnsi="Georgia"/>
                 <w:sz w:val="19"/>
               </w:rPr>
-              <w:t xml:space="preserve">0.367</w:t>
+              <w:t xml:space="preserve">122</w:t>
             </w:r>
           </w:p>
         </w:tc>
@@ -41287,35 +41412,7 @@
                 <w:rFonts w:ascii="Georgia" w:hAnsi="Georgia"/>
                 <w:sz w:val="19"/>
               </w:rPr>
-              <w:t xml:space="preserve">0.16</w:t>
-            </w:r>
-          </w:p>
-        </w:tc>
-        <w:tc>
-          <w:tcPr>
-            <w:tcBorders>
-              <w:left w:val="nil"/>
-              <w:right w:val="nil"/>
-              <w:top w:val="nil"/>
-              <w:bottom w:val="nil"/>
-            </w:tcBorders>
-            <w:vAlign w:val="center"/>
-          </w:tcPr>
-          <w:p>
-            <w:pPr>
-              <w:pStyle w:val="Compact"/>
-              <w:spacing w:before="0" w:after="20" w:line="240" w:lineRule="auto"/>
-              <w:jc w:val="center"/>
-              <w:keepNext w:val="0"/>
-              <w:keepLines/>
-              <w:widowControl w:val="1"/>
-            </w:pPr>
-            <w:r>
-              <w:rPr>
-                <w:rFonts w:ascii="Georgia" w:hAnsi="Georgia"/>
-                <w:sz w:val="19"/>
-              </w:rPr>
-              <w:t xml:space="preserve">0.603</w:t>
+              <w:t xml:space="preserve">0.975</w:t>
             </w:r>
           </w:p>
         </w:tc>

</xml_diff>

<commit_message>
CORRECTION: fix false MAUVE claim caused by corrupted Herath cache
The transfer harness writes loaded real data to a fixed herath_mapped path, so the
M-ABSA/OATS/EduRABSA runs overwrote the Herath cache. The sentence-MAUVE 'OMSCS vs
Herath 0.03' was computed on corrupted (non-Herath) content; correct value is 0.626.
The favorable claim 'synthetic closer to OMSCS than two real corpora are to each other'
was FALSE and is removed from limitation 2 + response #5a; replaced with the honest
statement (synthetic pool-level MAUVE 0.23 < 0.63 real-real < 0.98 ceiling, still
separable). Regenerated correct Herath (2829 rows), gitignored the generated cache.
Sentence-level judge (60%), assembly control (0.19), OMSCS-synth 0.23, and Herath
transfer 0.4811 are unaffected.

Co-Authored-By: Claude Opus 4.8 (1M context) <noreply@anthropic.com>
</commit_message>
<xml_diff>
--- a/paper/course_absa_manuscript.docx
+++ b/paper/course_absa_manuscript.docx
@@ -1410,7 +1410,7 @@
               <a:graphicData uri="http://schemas.openxmlformats.org/drawingml/2006/picture">
                 <pic:pic>
                   <pic:nvPicPr>
-                    <pic:cNvPr descr="C:/Users/apart/AppData/Local/Temp/html2doc_svg_VZpJst/svg_0.png" id="16" name="Picture"/>
+                    <pic:cNvPr descr="C:/Users/apart/AppData/Local/Temp/html2doc_svg_B6SfCS/svg_0.png" id="16" name="Picture"/>
                     <pic:cNvPicPr>
                       <a:picLocks noChangeArrowheads="1" noChangeAspect="1"/>
                     </pic:cNvPicPr>
@@ -10174,7 +10174,7 @@
               <a:graphicData uri="http://schemas.openxmlformats.org/drawingml/2006/picture">
                 <pic:pic>
                   <pic:nvPicPr>
-                    <pic:cNvPr descr="C:/Users/apart/AppData/Local/Temp/html2doc_svg_VZpJst/svg_1.png" id="30" name="Picture"/>
+                    <pic:cNvPr descr="C:/Users/apart/AppData/Local/Temp/html2doc_svg_B6SfCS/svg_1.png" id="30" name="Picture"/>
                     <pic:cNvPicPr>
                       <a:picLocks noChangeArrowheads="1" noChangeAspect="1"/>
                     </pic:cNvPicPr>
@@ -12519,7 +12519,7 @@
               <a:graphicData uri="http://schemas.openxmlformats.org/drawingml/2006/picture">
                 <pic:pic>
                   <pic:nvPicPr>
-                    <pic:cNvPr descr="C:/Users/apart/AppData/Local/Temp/html2doc_svg_VZpJst/svg_2.png" id="35" name="Picture"/>
+                    <pic:cNvPr descr="C:/Users/apart/AppData/Local/Temp/html2doc_svg_B6SfCS/svg_2.png" id="35" name="Picture"/>
                     <pic:cNvPicPr>
                       <a:picLocks noChangeArrowheads="1" noChangeAspect="1"/>
                     </pic:cNvPicPr>
@@ -12601,7 +12601,7 @@
               <a:graphicData uri="http://schemas.openxmlformats.org/drawingml/2006/picture">
                 <pic:pic>
                   <pic:nvPicPr>
-                    <pic:cNvPr descr="C:/Users/apart/AppData/Local/Temp/html2doc_svg_VZpJst/svg_3.png" id="38" name="Picture"/>
+                    <pic:cNvPr descr="C:/Users/apart/AppData/Local/Temp/html2doc_svg_B6SfCS/svg_3.png" id="38" name="Picture"/>
                     <pic:cNvPicPr>
                       <a:picLocks noChangeArrowheads="1" noChangeAspect="1"/>
                     </pic:cNvPicPr>
@@ -16203,7 +16203,7 @@
               <a:graphicData uri="http://schemas.openxmlformats.org/drawingml/2006/picture">
                 <pic:pic>
                   <pic:nvPicPr>
-                    <pic:cNvPr descr="C:/Users/apart/AppData/Local/Temp/html2doc_svg_VZpJst/svg_4.png" id="44" name="Picture"/>
+                    <pic:cNvPr descr="C:/Users/apart/AppData/Local/Temp/html2doc_svg_B6SfCS/svg_4.png" id="44" name="Picture"/>
                     <pic:cNvPicPr>
                       <a:picLocks noChangeArrowheads="1" noChangeAspect="1"/>
                     </pic:cNvPicPr>
@@ -16576,7 +16576,7 @@
         <w:widowControl w:val="1"/>
       </w:pPr>
       <w:r>
-        <w:t xml:space="preserve">Five limitations remain central. First, external validation uses two real educational corpora (Herath 9-aspect, EduRABSA 7-aspect) and conservative aspect overlaps, so broader claims about the entire 20-aspect schema still require additional real-data tests. These two targets are also sentence-level (Herath median 20 words, EduRABSA 38) while the synthetic corpus is full-length reviews (median 122 words), so transfer here is a cross-granularity test. This granularity mismatch is not, however, the limiting factor: a review-level real target (OATS, median 70 words) transfers no better than the sentence-level targets, so transfer difficulty is governed by how closely a target's aspect vocabulary and register align with the synthetic supervision rather than by review length (Appendix A.24). A full-review real benchmark matched to institutional course feedback is the natural next target; the one public review-level educational corpus is MOOC-focused (OATS-ABSA, Coursera reviews [41]), while course-evaluation feedback of the kind our schema targets remains annotated only at the sentence level [12]. Aspect-annotating a set of full-length institutional reviews (for example public OMSCS reviews) is therefore the concrete path to fully closing this granularity gap. Practitioners should therefore not read the transfer results as validating the full schema: only 9 of the 20 aspects are externally checked, synthetic-only training recovers about 60% of a real-trained model, and any high-stakes or personnel decision requires human-in-the-loop review rather than reliance on the eleven aspects that have no real-data validation. Second, the realism-validation analysis is conducted with LLM judges and improves prompt quality without establishing statistical indistinguishability from real reviews under an adversarial frontier-model detector, a bar that current LLM-generated text does not clear regardless of generator family; the realism that is operative for a labeled training benchmark is functional rather than perceptual, and is evidenced by the synthetic-to-real transfer results above, where a model trained on the synthetic corpus recovers real-review aspect and polarity signal on two independent external corpora. A distributional check calibrates the scale of the gap: at sentence granularity, MAUVE between the synthetic corpus and the real OMSCS reviews is 0.23, below the 0.98 real-to-real ceiling but well above the 0.03 MAUVE between two independent real educational corpora (OMSCS and Herath), so the synthetic text is in fact closer to its target real distribution than two real educational sources are to each other, and its distributional distance from real text is modest against the natural spread of real educational feedback. This residual gap reflects writing style rather than course or platform identity: scrubbing course codes, instructor names, and platform terms from both sides leaves it essentially unchanged. Most tellingly, the separability is a document-structure effect rather than a sentence-realism one: judged sentence by sentence, individual synthetic sentences are near-indistinguishable from real ones, with the same judge only 60% accurate (close to the 50% chance floor, versus 93% on whole reviews) and calling 63% of synthetic sentences real. The detectability is a cumulative property of extended synthetic text: a weak per-sentence signal accumulates across a full review, and a control that assembles real sentences into equally multi-aspect documents is still judged real, so it is not multi-aspect coverage or incoherence. The signal is thus orthogonal to the individual sentences that carry the aspect-sentiment supervision (Appendix A.23). The label-faithfulness audit is validated three ways (a behavioral negative control, cross-provider judge agreement, and direct agreement with human labels at Cohen's kappa 0.56 on two annotated corpora, Section 5.7). Because the generator and the cost-matched auditor share a provider family, we further confirm that the audit is not merely detecting same-family latent patterns by reproducing the human-agreement check with a fully independent family (Google Gemini, Cohen's kappa 0.62); human re-annotation across the full 20-aspect schema remains the natural extension. Third, a nontrivial share of rows (841 of 10,000) reached the output-token cap and lowered full-corpus length-band adherence to 0.6819; this is a recoverable token-budget artifact rather than a control failure, since regenerating exactly those rows at a higher cap eliminates the truncation and restores full-corpus adherence to 0.7125, close to but still below the never-truncated rate of 0.7304 (Appendix A.14), and length band is in any case a soft stylistic target rather than a labeled control variable. Fourth, downstream training on the 10K corpus benefits from the Section 5.7 top-50% faithfulness filter (validated across two BERT-family architectures and both transfer targets); the audit score is the validated way to select training rows for sentiment-polarity fidelity on transferred aspects. Fifth, the downstream GPT comparison covers a full-test</w:t>
+        <w:t xml:space="preserve">Five limitations remain central. First, external validation uses two real educational corpora (Herath 9-aspect, EduRABSA 7-aspect) and conservative aspect overlaps, so broader claims about the entire 20-aspect schema still require additional real-data tests. These two targets are also sentence-level (Herath median 20 words, EduRABSA 38) while the synthetic corpus is full-length reviews (median 122 words), so transfer here is a cross-granularity test. This granularity mismatch is not, however, the limiting factor: a review-level real target (OATS, median 70 words) transfers no better than the sentence-level targets, so transfer difficulty is governed by how closely a target's aspect vocabulary and register align with the synthetic supervision rather than by review length (Appendix A.24). A full-review real benchmark matched to institutional course feedback is the natural next target; the one public review-level educational corpus is MOOC-focused (OATS-ABSA, Coursera reviews [41]), while course-evaluation feedback of the kind our schema targets remains annotated only at the sentence level [12]. Aspect-annotating a set of full-length institutional reviews (for example public OMSCS reviews) is therefore the concrete path to fully closing this granularity gap. Practitioners should therefore not read the transfer results as validating the full schema: only 9 of the 20 aspects are externally checked, synthetic-only training recovers about 60% of a real-trained model, and any high-stakes or personnel decision requires human-in-the-loop review rather than reliance on the eleven aspects that have no real-data validation. Second, the realism-validation analysis is conducted with LLM judges and improves prompt quality without establishing statistical indistinguishability from real reviews under an adversarial frontier-model detector, a bar that current LLM-generated text does not clear regardless of generator family; the realism that is operative for a labeled training benchmark is functional rather than perceptual, and is evidenced by the synthetic-to-real transfer results above, where a model trained on the synthetic corpus recovers real-review aspect and polarity signal on two independent external corpora. A sentence-level distributional check places the synthetic corpus at MAUVE 0.23 from the real OMSCS reviews, below both the 0.98 real-to-real ceiling and the 0.63 between two independent real corpora (OMSCS and Herath), so at the pool level the synthetic sentence distribution is still separable from real. This gap reflects writing style rather than course or platform identity: scrubbing course codes, instructor names, and platform terms from both sides leaves it essentially unchanged. Most tellingly, the separability is a document-structure effect rather than a sentence-realism one: judged sentence by sentence, individual synthetic sentences are near-indistinguishable from real ones, with the same judge only 60% accurate (close to the 50% chance floor, versus 93% on whole reviews) and calling 63% of synthetic sentences real. The detectability is a cumulative property of extended synthetic text: a weak per-sentence signal accumulates across a full review, and a control that assembles real sentences into equally multi-aspect documents is still judged real, so it is not multi-aspect coverage or incoherence. The signal is thus orthogonal to the individual sentences that carry the aspect-sentiment supervision (Appendix A.23). The label-faithfulness audit is validated three ways (a behavioral negative control, cross-provider judge agreement, and direct agreement with human labels at Cohen's kappa 0.56 on two annotated corpora, Section 5.7). Because the generator and the cost-matched auditor share a provider family, we further confirm that the audit is not merely detecting same-family latent patterns by reproducing the human-agreement check with a fully independent family (Google Gemini, Cohen's kappa 0.62); human re-annotation across the full 20-aspect schema remains the natural extension. Third, a nontrivial share of rows (841 of 10,000) reached the output-token cap and lowered full-corpus length-band adherence to 0.6819; this is a recoverable token-budget artifact rather than a control failure, since regenerating exactly those rows at a higher cap eliminates the truncation and restores full-corpus adherence to 0.7125, close to but still below the never-truncated rate of 0.7304 (Appendix A.14), and length band is in any case a soft stylistic target rather than a labeled control variable. Fourth, downstream training on the 10K corpus benefits from the Section 5.7 top-50% faithfulness filter (validated across two BERT-family architectures and both transfer targets); the audit score is the validated way to select training rows for sentiment-polarity fidelity on transferred aspects. Fifth, the downstream GPT comparison covers a full-test</w:t>
       </w:r>
       <w:r>
         <w:t xml:space="preserve"> </w:t>
@@ -16848,7 +16848,7 @@
               <a:graphicData uri="http://schemas.openxmlformats.org/drawingml/2006/picture">
                 <pic:pic>
                   <pic:nvPicPr>
-                    <pic:cNvPr descr="C:/Users/apart/AppData/Local/Temp/html2doc_svg_VZpJst/svg_5.png" id="51" name="Picture"/>
+                    <pic:cNvPr descr="C:/Users/apart/AppData/Local/Temp/html2doc_svg_B6SfCS/svg_5.png" id="51" name="Picture"/>
                     <pic:cNvPicPr>
                       <a:picLocks noChangeArrowheads="1" noChangeAspect="1"/>
                     </pic:cNvPicPr>
@@ -21806,7 +21806,7 @@
               <a:graphicData uri="http://schemas.openxmlformats.org/drawingml/2006/picture">
                 <pic:pic>
                   <pic:nvPicPr>
-                    <pic:cNvPr descr="C:/Users/apart/AppData/Local/Temp/html2doc_svg_VZpJst/svg_6.png" id="62" name="Picture"/>
+                    <pic:cNvPr descr="C:/Users/apart/AppData/Local/Temp/html2doc_svg_B6SfCS/svg_6.png" id="62" name="Picture"/>
                     <pic:cNvPicPr>
                       <a:picLocks noChangeArrowheads="1" noChangeAspect="1"/>
                     </pic:cNvPicPr>
@@ -23615,7 +23615,7 @@
               <a:graphicData uri="http://schemas.openxmlformats.org/drawingml/2006/picture">
                 <pic:pic>
                   <pic:nvPicPr>
-                    <pic:cNvPr descr="C:/Users/apart/AppData/Local/Temp/html2doc_svg_VZpJst/svg_7.png" id="67" name="Picture"/>
+                    <pic:cNvPr descr="C:/Users/apart/AppData/Local/Temp/html2doc_svg_B6SfCS/svg_7.png" id="67" name="Picture"/>
                     <pic:cNvPicPr>
                       <a:picLocks noChangeArrowheads="1" noChangeAspect="1"/>
                     </pic:cNvPicPr>
@@ -25574,7 +25574,7 @@
               <a:graphicData uri="http://schemas.openxmlformats.org/drawingml/2006/picture">
                 <pic:pic>
                   <pic:nvPicPr>
-                    <pic:cNvPr descr="C:/Users/apart/AppData/Local/Temp/html2doc_svg_VZpJst/svg_8.png" id="72" name="Picture"/>
+                    <pic:cNvPr descr="C:/Users/apart/AppData/Local/Temp/html2doc_svg_B6SfCS/svg_8.png" id="72" name="Picture"/>
                     <pic:cNvPicPr>
                       <a:picLocks noChangeArrowheads="1" noChangeAspect="1"/>
                     </pic:cNvPicPr>
@@ -26411,7 +26411,7 @@
               <a:graphicData uri="http://schemas.openxmlformats.org/drawingml/2006/picture">
                 <pic:pic>
                   <pic:nvPicPr>
-                    <pic:cNvPr descr="C:/Users/apart/AppData/Local/Temp/html2doc_svg_VZpJst/svg_9.png" id="75" name="Picture"/>
+                    <pic:cNvPr descr="C:/Users/apart/AppData/Local/Temp/html2doc_svg_B6SfCS/svg_9.png" id="75" name="Picture"/>
                     <pic:cNvPicPr>
                       <a:picLocks noChangeArrowheads="1" noChangeAspect="1"/>
                     </pic:cNvPicPr>
@@ -31131,7 +31131,7 @@
               <a:graphicData uri="http://schemas.openxmlformats.org/drawingml/2006/picture">
                 <pic:pic>
                   <pic:nvPicPr>
-                    <pic:cNvPr descr="C:/Users/apart/AppData/Local/Temp/html2doc_svg_VZpJst/svg_10.png" id="80" name="Picture"/>
+                    <pic:cNvPr descr="C:/Users/apart/AppData/Local/Temp/html2doc_svg_B6SfCS/svg_10.png" id="80" name="Picture"/>
                     <pic:cNvPicPr>
                       <a:picLocks noChangeArrowheads="1" noChangeAspect="1"/>
                     </pic:cNvPicPr>
@@ -32335,7 +32335,7 @@
               <a:graphicData uri="http://schemas.openxmlformats.org/drawingml/2006/picture">
                 <pic:pic>
                   <pic:nvPicPr>
-                    <pic:cNvPr descr="C:/Users/apart/AppData/Local/Temp/html2doc_svg_VZpJst/svg_11.png" id="86" name="Picture"/>
+                    <pic:cNvPr descr="C:/Users/apart/AppData/Local/Temp/html2doc_svg_B6SfCS/svg_11.png" id="86" name="Picture"/>
                     <pic:cNvPicPr>
                       <a:picLocks noChangeArrowheads="1" noChangeAspect="1"/>
                     </pic:cNvPicPr>
@@ -32417,7 +32417,7 @@
               <a:graphicData uri="http://schemas.openxmlformats.org/drawingml/2006/picture">
                 <pic:pic>
                   <pic:nvPicPr>
-                    <pic:cNvPr descr="C:/Users/apart/AppData/Local/Temp/html2doc_svg_VZpJst/svg_12.png" id="89" name="Picture"/>
+                    <pic:cNvPr descr="C:/Users/apart/AppData/Local/Temp/html2doc_svg_B6SfCS/svg_12.png" id="89" name="Picture"/>
                     <pic:cNvPicPr>
                       <a:picLocks noChangeArrowheads="1" noChangeAspect="1"/>
                     </pic:cNvPicPr>
@@ -33238,7 +33238,7 @@
               <a:graphicData uri="http://schemas.openxmlformats.org/drawingml/2006/picture">
                 <pic:pic>
                   <pic:nvPicPr>
-                    <pic:cNvPr descr="C:/Users/apart/AppData/Local/Temp/html2doc_svg_VZpJst/svg_13.png" id="94" name="Picture"/>
+                    <pic:cNvPr descr="C:/Users/apart/AppData/Local/Temp/html2doc_svg_B6SfCS/svg_13.png" id="94" name="Picture"/>
                     <pic:cNvPicPr>
                       <a:picLocks noChangeArrowheads="1" noChangeAspect="1"/>
                     </pic:cNvPicPr>

</xml_diff>